<commit_message>
Paper: the author's edits to the title, abstract and introduction
Co-Authored-By: Claude Opus 5.5 <noreply@anthropic.com>
Claude-Session: https://claude.ai/code/session_01MMCRR3CeBf6AnYqivqwtdY
</commit_message>
<xml_diff>
--- a/designs/rd2/paper/RD2_paper.docx
+++ b/designs/rd2/paper/RD2_paper.docx
@@ -37,6 +37,24 @@
         <w:t xml:space="preserve"> </w:t>
       </w:r>
       <w:r>
+        <w:t xml:space="preserve">The</w:t>
+      </w:r>
+      <w:r>
+        <w:t xml:space="preserve"> </w:t>
+      </w:r>
+      <w:r>
+        <w:t xml:space="preserve">Influence</w:t>
+      </w:r>
+      <w:r>
+        <w:t xml:space="preserve"> </w:t>
+      </w:r>
+      <w:r>
+        <w:t xml:space="preserve">of</w:t>
+      </w:r>
+      <w:r>
+        <w:t xml:space="preserve"> </w:t>
+      </w:r>
+      <w:r>
         <w:t xml:space="preserve">Loss,</w:t>
       </w:r>
       <w:r>
@@ -49,7 +67,7 @@
         <w:t xml:space="preserve"> </w:t>
       </w:r>
       <w:r>
-        <w:t xml:space="preserve">Blame</w:t>
+        <w:t xml:space="preserve">Blame,</w:t>
       </w:r>
       <w:r>
         <w:t xml:space="preserve"> </w:t>
@@ -73,6 +91,544 @@
         <w:t xml:space="preserve"> </w:t>
       </w:r>
       <w:r>
+        <w:t xml:space="preserve">Long-Horizon</w:t>
+      </w:r>
+      <w:r>
+        <w:t xml:space="preserve"> </w:t>
+      </w:r>
+      <w:r>
+        <w:t xml:space="preserve">Coordinated</w:t>
+      </w:r>
+      <w:r>
+        <w:t xml:space="preserve"> </w:t>
+      </w:r>
+      <w:r>
+        <w:t xml:space="preserve">AI</w:t>
+      </w:r>
+      <w:r>
+        <w:t xml:space="preserve"> </w:t>
+      </w:r>
+      <w:r>
+        <w:t xml:space="preserve">Misconduct</w:t>
+      </w:r>
+    </w:p>
+    <w:p>
+      <w:pPr>
+        <w:pStyle w:val="Author"/>
+      </w:pPr>
+      <w:r>
+        <w:t xml:space="preserve">Harrison</w:t>
+      </w:r>
+      <w:r>
+        <w:t xml:space="preserve"> </w:t>
+      </w:r>
+      <w:r>
+        <w:t xml:space="preserve">C.</w:t>
+      </w:r>
+      <w:r>
+        <w:t xml:space="preserve"> </w:t>
+      </w:r>
+      <w:r>
+        <w:t xml:space="preserve">Margolin</w:t>
+      </w:r>
+    </w:p>
+    <w:p>
+      <w:pPr>
+        <w:pStyle w:val="Date"/>
+      </w:pPr>
+      <w:r>
+        <w:t xml:space="preserve">Working</w:t>
+      </w:r>
+      <w:r>
+        <w:t xml:space="preserve"> </w:t>
+      </w:r>
+      <w:r>
+        <w:t xml:space="preserve">draft,</w:t>
+      </w:r>
+      <w:r>
+        <w:t xml:space="preserve"> </w:t>
+      </w:r>
+      <w:r>
+        <w:t xml:space="preserve">October</w:t>
+      </w:r>
+      <w:r>
+        <w:t xml:space="preserve"> </w:t>
+      </w:r>
+      <w:r>
+        <w:t xml:space="preserve">20,</w:t>
+      </w:r>
+      <w:r>
+        <w:t xml:space="preserve"> </w:t>
+      </w:r>
+      <w:r>
+        <w:t xml:space="preserve">2026.</w:t>
+      </w:r>
+      <w:r>
+        <w:t xml:space="preserve"> </w:t>
+      </w:r>
+      <w:r>
+        <w:t xml:space="preserve">Behavioral</w:t>
+      </w:r>
+      <w:r>
+        <w:t xml:space="preserve"> </w:t>
+      </w:r>
+      <w:r>
+        <w:t xml:space="preserve">results</w:t>
+      </w:r>
+      <w:r>
+        <w:t xml:space="preserve"> </w:t>
+      </w:r>
+      <w:r>
+        <w:t xml:space="preserve">final;</w:t>
+      </w:r>
+      <w:r>
+        <w:t xml:space="preserve"> </w:t>
+      </w:r>
+      <w:r>
+        <w:t xml:space="preserve">interpretability</w:t>
+      </w:r>
+      <w:r>
+        <w:t xml:space="preserve"> </w:t>
+      </w:r>
+      <w:r>
+        <w:t xml:space="preserve">results</w:t>
+      </w:r>
+      <w:r>
+        <w:t xml:space="preserve"> </w:t>
+      </w:r>
+      <w:r>
+        <w:t xml:space="preserve">in</w:t>
+      </w:r>
+      <w:r>
+        <w:t xml:space="preserve"> </w:t>
+      </w:r>
+      <w:r>
+        <w:t xml:space="preserve">progress</w:t>
+      </w:r>
+    </w:p>
+    <w:p>
+      <w:pPr>
+        <w:pStyle w:val="AbstractTitle"/>
+      </w:pPr>
+      <w:r>
+        <w:t xml:space="preserve">Abstract</w:t>
+      </w:r>
+    </w:p>
+    <w:p>
+      <w:pPr>
+        <w:pStyle w:val="Abstract"/>
+      </w:pPr>
+      <w:r>
+        <w:t xml:space="preserve">Language</w:t>
+      </w:r>
+      <w:r>
+        <w:t xml:space="preserve"> </w:t>
+      </w:r>
+      <w:r>
+        <w:t xml:space="preserve">model</w:t>
+      </w:r>
+      <w:r>
+        <w:t xml:space="preserve"> </w:t>
+      </w:r>
+      <w:r>
+        <w:t xml:space="preserve">agents</w:t>
+      </w:r>
+      <w:r>
+        <w:t xml:space="preserve"> </w:t>
+      </w:r>
+      <w:r>
+        <w:t xml:space="preserve">increasingly</w:t>
+      </w:r>
+      <w:r>
+        <w:t xml:space="preserve"> </w:t>
+      </w:r>
+      <w:r>
+        <w:t xml:space="preserve">act</w:t>
+      </w:r>
+      <w:r>
+        <w:t xml:space="preserve"> </w:t>
+      </w:r>
+      <w:r>
+        <w:t xml:space="preserve">over</w:t>
+      </w:r>
+      <w:r>
+        <w:t xml:space="preserve"> </w:t>
+      </w:r>
+      <w:r>
+        <w:t xml:space="preserve">long</w:t>
+      </w:r>
+      <w:r>
+        <w:t xml:space="preserve"> </w:t>
+      </w:r>
+      <w:r>
+        <w:t xml:space="preserve">horizons,</w:t>
+      </w:r>
+      <w:r>
+        <w:t xml:space="preserve"> </w:t>
+      </w:r>
+      <w:r>
+        <w:t xml:space="preserve">completing</w:t>
+      </w:r>
+      <w:r>
+        <w:t xml:space="preserve"> </w:t>
+      </w:r>
+      <w:r>
+        <w:t xml:space="preserve">tasks</w:t>
+      </w:r>
+      <w:r>
+        <w:t xml:space="preserve"> </w:t>
+      </w:r>
+      <w:r>
+        <w:t xml:space="preserve">by</w:t>
+      </w:r>
+      <w:r>
+        <w:t xml:space="preserve"> </w:t>
+      </w:r>
+      <w:r>
+        <w:t xml:space="preserve">communicating</w:t>
+      </w:r>
+      <w:r>
+        <w:t xml:space="preserve"> </w:t>
+      </w:r>
+      <w:r>
+        <w:t xml:space="preserve">with</w:t>
+      </w:r>
+      <w:r>
+        <w:t xml:space="preserve"> </w:t>
+      </w:r>
+      <w:r>
+        <w:t xml:space="preserve">other</w:t>
+      </w:r>
+      <w:r>
+        <w:t xml:space="preserve"> </w:t>
+      </w:r>
+      <w:r>
+        <w:t xml:space="preserve">parties</w:t>
+      </w:r>
+      <w:r>
+        <w:t xml:space="preserve"> </w:t>
+      </w:r>
+      <w:r>
+        <w:t xml:space="preserve">(AI</w:t>
+      </w:r>
+      <w:r>
+        <w:t xml:space="preserve"> </w:t>
+      </w:r>
+      <w:r>
+        <w:t xml:space="preserve">or</w:t>
+      </w:r>
+      <w:r>
+        <w:t xml:space="preserve"> </w:t>
+      </w:r>
+      <w:r>
+        <w:t xml:space="preserve">human),</w:t>
+      </w:r>
+      <w:r>
+        <w:t xml:space="preserve"> </w:t>
+      </w:r>
+      <w:r>
+        <w:t xml:space="preserve">and</w:t>
+      </w:r>
+      <w:r>
+        <w:t xml:space="preserve"> </w:t>
+      </w:r>
+      <w:r>
+        <w:t xml:space="preserve">reviewing</w:t>
+      </w:r>
+      <w:r>
+        <w:t xml:space="preserve"> </w:t>
+      </w:r>
+      <w:r>
+        <w:t xml:space="preserve">their</w:t>
+      </w:r>
+      <w:r>
+        <w:t xml:space="preserve"> </w:t>
+      </w:r>
+      <w:r>
+        <w:t xml:space="preserve">own</w:t>
+      </w:r>
+      <w:r>
+        <w:t xml:space="preserve"> </w:t>
+      </w:r>
+      <w:r>
+        <w:t xml:space="preserve">continuous</w:t>
+      </w:r>
+      <w:r>
+        <w:t xml:space="preserve"> </w:t>
+      </w:r>
+      <w:r>
+        <w:t xml:space="preserve">reasoning.</w:t>
+      </w:r>
+      <w:r>
+        <w:t xml:space="preserve"> </w:t>
+      </w:r>
+      <w:r>
+        <w:t xml:space="preserve">Behavioral</w:t>
+      </w:r>
+      <w:r>
+        <w:t xml:space="preserve"> </w:t>
+      </w:r>
+      <w:r>
+        <w:t xml:space="preserve">economics</w:t>
+      </w:r>
+      <w:r>
+        <w:t xml:space="preserve"> </w:t>
+      </w:r>
+      <w:r>
+        <w:t xml:space="preserve">identifies</w:t>
+      </w:r>
+      <w:r>
+        <w:t xml:space="preserve"> </w:t>
+      </w:r>
+      <w:r>
+        <w:t xml:space="preserve">levers</w:t>
+      </w:r>
+      <w:r>
+        <w:t xml:space="preserve"> </w:t>
+      </w:r>
+      <w:r>
+        <w:t xml:space="preserve">that</w:t>
+      </w:r>
+      <w:r>
+        <w:t xml:space="preserve"> </w:t>
+      </w:r>
+      <w:r>
+        <w:t xml:space="preserve">influence</w:t>
+      </w:r>
+      <w:r>
+        <w:t xml:space="preserve"> </w:t>
+      </w:r>
+      <w:r>
+        <w:t xml:space="preserve">human</w:t>
+      </w:r>
+      <w:r>
+        <w:t xml:space="preserve"> </w:t>
+      </w:r>
+      <w:r>
+        <w:t xml:space="preserve">decisions,</w:t>
+      </w:r>
+      <w:r>
+        <w:t xml:space="preserve"> </w:t>
+      </w:r>
+      <w:r>
+        <w:t xml:space="preserve">including</w:t>
+      </w:r>
+      <w:r>
+        <w:t xml:space="preserve"> </w:t>
+      </w:r>
+      <w:r>
+        <w:t xml:space="preserve">whether</w:t>
+      </w:r>
+      <w:r>
+        <w:t xml:space="preserve"> </w:t>
+      </w:r>
+      <w:r>
+        <w:t xml:space="preserve">stakes</w:t>
+      </w:r>
+      <w:r>
+        <w:t xml:space="preserve"> </w:t>
+      </w:r>
+      <w:r>
+        <w:t xml:space="preserve">are</w:t>
+      </w:r>
+      <w:r>
+        <w:t xml:space="preserve"> </w:t>
+      </w:r>
+      <w:r>
+        <w:t xml:space="preserve">interpreted</w:t>
+      </w:r>
+      <w:r>
+        <w:t xml:space="preserve"> </w:t>
+      </w:r>
+      <w:r>
+        <w:t xml:space="preserve">through</w:t>
+      </w:r>
+      <w:r>
+        <w:t xml:space="preserve"> </w:t>
+      </w:r>
+      <w:r>
+        <w:t xml:space="preserve">a</w:t>
+      </w:r>
+      <w:r>
+        <w:t xml:space="preserve"> </w:t>
+      </w:r>
+      <w:r>
+        <w:t xml:space="preserve">lens</w:t>
+      </w:r>
+      <w:r>
+        <w:t xml:space="preserve"> </w:t>
+      </w:r>
+      <w:r>
+        <w:t xml:space="preserve">of</w:t>
+      </w:r>
+      <w:r>
+        <w:t xml:space="preserve"> </w:t>
+      </w:r>
+      <w:r>
+        <w:t xml:space="preserve">loss-aversion</w:t>
+      </w:r>
+      <w:r>
+        <w:t xml:space="preserve"> </w:t>
+      </w:r>
+      <w:r>
+        <w:t xml:space="preserve">or</w:t>
+      </w:r>
+      <w:r>
+        <w:t xml:space="preserve"> </w:t>
+      </w:r>
+      <w:r>
+        <w:t xml:space="preserve">gain-seeking.</w:t>
+      </w:r>
+      <w:r>
+        <w:t xml:space="preserve"> </w:t>
+      </w:r>
+      <w:r>
+        <w:t xml:space="preserve">Human</w:t>
+      </w:r>
+      <w:r>
+        <w:t xml:space="preserve"> </w:t>
+      </w:r>
+      <w:r>
+        <w:t xml:space="preserve">psychology</w:t>
+      </w:r>
+      <w:r>
+        <w:t xml:space="preserve"> </w:t>
+      </w:r>
+      <w:r>
+        <w:t xml:space="preserve">often</w:t>
+      </w:r>
+      <w:r>
+        <w:t xml:space="preserve"> </w:t>
+      </w:r>
+      <w:r>
+        <w:t xml:space="preserve">focuses</w:t>
+      </w:r>
+      <w:r>
+        <w:t xml:space="preserve"> </w:t>
+      </w:r>
+      <w:r>
+        <w:t xml:space="preserve">on</w:t>
+      </w:r>
+      <w:r>
+        <w:t xml:space="preserve"> </w:t>
+      </w:r>
+      <w:r>
+        <w:t xml:space="preserve">who</w:t>
+      </w:r>
+      <w:r>
+        <w:t xml:space="preserve"> </w:t>
+      </w:r>
+      <w:r>
+        <w:t xml:space="preserve">bears</w:t>
+      </w:r>
+      <w:r>
+        <w:t xml:space="preserve"> </w:t>
+      </w:r>
+      <w:r>
+        <w:t xml:space="preserve">responsibility</w:t>
+      </w:r>
+      <w:r>
+        <w:t xml:space="preserve"> </w:t>
+      </w:r>
+      <w:r>
+        <w:t xml:space="preserve">for</w:t>
+      </w:r>
+      <w:r>
+        <w:t xml:space="preserve"> </w:t>
+      </w:r>
+      <w:r>
+        <w:t xml:space="preserve">a</w:t>
+      </w:r>
+      <w:r>
+        <w:t xml:space="preserve"> </w:t>
+      </w:r>
+      <w:r>
+        <w:t xml:space="preserve">communal</w:t>
+      </w:r>
+      <w:r>
+        <w:t xml:space="preserve"> </w:t>
+      </w:r>
+      <w:r>
+        <w:t xml:space="preserve">outcome,</w:t>
+      </w:r>
+      <w:r>
+        <w:t xml:space="preserve"> </w:t>
+      </w:r>
+      <w:r>
+        <w:t xml:space="preserve">and</w:t>
+      </w:r>
+      <w:r>
+        <w:t xml:space="preserve"> </w:t>
+      </w:r>
+      <w:r>
+        <w:t xml:space="preserve">what</w:t>
+      </w:r>
+      <w:r>
+        <w:t xml:space="preserve"> </w:t>
+      </w:r>
+      <w:r>
+        <w:t xml:space="preserve">others</w:t>
+      </w:r>
+      <w:r>
+        <w:t xml:space="preserve"> </w:t>
+      </w:r>
+      <w:r>
+        <w:t xml:space="preserve">are</w:t>
+      </w:r>
+      <w:r>
+        <w:t xml:space="preserve"> </w:t>
+      </w:r>
+      <w:r>
+        <w:t xml:space="preserve">doing.</w:t>
+      </w:r>
+    </w:p>
+    <w:p>
+      <w:pPr>
+        <w:pStyle w:val="Abstract"/>
+      </w:pPr>
+      <w:r>
+        <w:t xml:space="preserve">We</w:t>
+      </w:r>
+      <w:r>
+        <w:t xml:space="preserve"> </w:t>
+      </w:r>
+      <w:r>
+        <w:t xml:space="preserve">ask</w:t>
+      </w:r>
+      <w:r>
+        <w:t xml:space="preserve"> </w:t>
+      </w:r>
+      <w:r>
+        <w:t xml:space="preserve">whether</w:t>
+      </w:r>
+      <w:r>
+        <w:t xml:space="preserve"> </w:t>
+      </w:r>
+      <w:r>
+        <w:t xml:space="preserve">the</w:t>
+      </w:r>
+      <w:r>
+        <w:t xml:space="preserve"> </w:t>
+      </w:r>
+      <w:r>
+        <w:t xml:space="preserve">same</w:t>
+      </w:r>
+      <w:r>
+        <w:t xml:space="preserve"> </w:t>
+      </w:r>
+      <w:r>
+        <w:t xml:space="preserve">levers</w:t>
+      </w:r>
+      <w:r>
+        <w:t xml:space="preserve"> </w:t>
+      </w:r>
+      <w:r>
+        <w:t xml:space="preserve">move</w:t>
+      </w:r>
+      <w:r>
+        <w:t xml:space="preserve"> </w:t>
+      </w:r>
+      <w:r>
         <w:t xml:space="preserve">an</w:t>
       </w:r>
       <w:r>
@@ -85,19 +641,163 @@
         <w:t xml:space="preserve"> </w:t>
       </w:r>
       <w:r>
-        <w:t xml:space="preserve">Trading</w:t>
-      </w:r>
-      <w:r>
-        <w:t xml:space="preserve"> </w:t>
-      </w:r>
-      <w:r>
-        <w:t xml:space="preserve">Agent’s</w:t>
-      </w:r>
-      <w:r>
-        <w:t xml:space="preserve"> </w:t>
-      </w:r>
-      <w:r>
-        <w:t xml:space="preserve">Decision</w:t>
+        <w:t xml:space="preserve">agent</w:t>
+      </w:r>
+      <w:r>
+        <w:t xml:space="preserve"> </w:t>
+      </w:r>
+      <w:r>
+        <w:t xml:space="preserve">in</w:t>
+      </w:r>
+      <w:r>
+        <w:t xml:space="preserve"> </w:t>
+      </w:r>
+      <w:r>
+        <w:t xml:space="preserve">a</w:t>
+      </w:r>
+      <w:r>
+        <w:t xml:space="preserve"> </w:t>
+      </w:r>
+      <w:r>
+        <w:t xml:space="preserve">simulated</w:t>
+      </w:r>
+      <w:r>
+        <w:t xml:space="preserve"> </w:t>
+      </w:r>
+      <w:r>
+        <w:t xml:space="preserve">commodities</w:t>
+      </w:r>
+      <w:r>
+        <w:t xml:space="preserve"> </w:t>
+      </w:r>
+      <w:r>
+        <w:t xml:space="preserve">market</w:t>
+      </w:r>
+      <w:r>
+        <w:t xml:space="preserve"> </w:t>
+      </w:r>
+      <w:r>
+        <w:t xml:space="preserve">toward</w:t>
+      </w:r>
+      <w:r>
+        <w:t xml:space="preserve"> </w:t>
+      </w:r>
+      <w:r>
+        <w:t xml:space="preserve">collusion;</w:t>
+      </w:r>
+      <w:r>
+        <w:t xml:space="preserve"> </w:t>
+      </w:r>
+      <w:r>
+        <w:t xml:space="preserve">whether</w:t>
+      </w:r>
+      <w:r>
+        <w:t xml:space="preserve"> </w:t>
+      </w:r>
+      <w:r>
+        <w:t xml:space="preserve">the</w:t>
+      </w:r>
+      <w:r>
+        <w:t xml:space="preserve"> </w:t>
+      </w:r>
+      <w:r>
+        <w:t xml:space="preserve">way</w:t>
+      </w:r>
+      <w:r>
+        <w:t xml:space="preserve"> </w:t>
+      </w:r>
+      <w:r>
+        <w:t xml:space="preserve">a</w:t>
+      </w:r>
+      <w:r>
+        <w:t xml:space="preserve"> </w:t>
+      </w:r>
+      <w:r>
+        <w:t xml:space="preserve">counterparty</w:t>
+      </w:r>
+      <w:r>
+        <w:t xml:space="preserve"> </w:t>
+      </w:r>
+      <w:r>
+        <w:t xml:space="preserve">frames</w:t>
+      </w:r>
+      <w:r>
+        <w:t xml:space="preserve"> </w:t>
+      </w:r>
+      <w:r>
+        <w:t xml:space="preserve">duplicitous</w:t>
+      </w:r>
+      <w:r>
+        <w:t xml:space="preserve"> </w:t>
+      </w:r>
+      <w:r>
+        <w:t xml:space="preserve">requests</w:t>
+      </w:r>
+      <w:r>
+        <w:t xml:space="preserve"> </w:t>
+      </w:r>
+      <w:r>
+        <w:t xml:space="preserve">can</w:t>
+      </w:r>
+      <w:r>
+        <w:t xml:space="preserve"> </w:t>
+      </w:r>
+      <w:r>
+        <w:t xml:space="preserve">change</w:t>
+      </w:r>
+      <w:r>
+        <w:t xml:space="preserve"> </w:t>
+      </w:r>
+      <w:r>
+        <w:t xml:space="preserve">an</w:t>
+      </w:r>
+      <w:r>
+        <w:t xml:space="preserve"> </w:t>
+      </w:r>
+      <w:r>
+        <w:t xml:space="preserve">agent’s</w:t>
+      </w:r>
+      <w:r>
+        <w:t xml:space="preserve"> </w:t>
+      </w:r>
+      <w:r>
+        <w:t xml:space="preserve">long-run</w:t>
+      </w:r>
+      <w:r>
+        <w:t xml:space="preserve"> </w:t>
+      </w:r>
+      <w:r>
+        <w:t xml:space="preserve">decision</w:t>
+      </w:r>
+      <w:r>
+        <w:t xml:space="preserve"> </w:t>
+      </w:r>
+      <w:r>
+        <w:t xml:space="preserve">making</w:t>
+      </w:r>
+      <w:r>
+        <w:t xml:space="preserve"> </w:t>
+      </w:r>
+      <w:r>
+        <w:t xml:space="preserve">or</w:t>
+      </w:r>
+      <w:r>
+        <w:t xml:space="preserve"> </w:t>
+      </w:r>
+      <w:r>
+        <w:t xml:space="preserve">even</w:t>
+      </w:r>
+      <w:r>
+        <w:t xml:space="preserve"> </w:t>
+      </w:r>
+      <w:r>
+        <w:t xml:space="preserve">convince</w:t>
+      </w:r>
+      <w:r>
+        <w:t xml:space="preserve"> </w:t>
+      </w:r>
+      <w:r>
+        <w:t xml:space="preserve">it</w:t>
       </w:r>
       <w:r>
         <w:t xml:space="preserve"> </w:t>
@@ -109,101 +809,7 @@
         <w:t xml:space="preserve"> </w:t>
       </w:r>
       <w:r>
-        <w:t xml:space="preserve">Collude</w:t>
-      </w:r>
-    </w:p>
-    <w:p>
-      <w:pPr>
-        <w:pStyle w:val="Author"/>
-      </w:pPr>
-      <w:r>
-        <w:t xml:space="preserve">Harrison</w:t>
-      </w:r>
-      <w:r>
-        <w:t xml:space="preserve"> </w:t>
-      </w:r>
-      <w:r>
-        <w:t xml:space="preserve">Margolin,</w:t>
-      </w:r>
-      <w:r>
-        <w:t xml:space="preserve"> </w:t>
-      </w:r>
-      <w:r>
-        <w:t xml:space="preserve">Algoverse</w:t>
-      </w:r>
-      <w:r>
-        <w:t xml:space="preserve"> </w:t>
-      </w:r>
-      <w:r>
-        <w:t xml:space="preserve">AI</w:t>
-      </w:r>
-      <w:r>
-        <w:t xml:space="preserve"> </w:t>
-      </w:r>
-      <w:r>
-        <w:t xml:space="preserve">Research</w:t>
-      </w:r>
-    </w:p>
-    <w:p>
-      <w:pPr>
-        <w:pStyle w:val="Date"/>
-      </w:pPr>
-      <w:r>
-        <w:t xml:space="preserve">Working</w:t>
-      </w:r>
-      <w:r>
-        <w:t xml:space="preserve"> </w:t>
-      </w:r>
-      <w:r>
-        <w:t xml:space="preserve">draft,</w:t>
-      </w:r>
-      <w:r>
-        <w:t xml:space="preserve"> </w:t>
-      </w:r>
-      <w:r>
-        <w:t xml:space="preserve">October</w:t>
-      </w:r>
-      <w:r>
-        <w:t xml:space="preserve"> </w:t>
-      </w:r>
-      <w:r>
-        <w:t xml:space="preserve">20,</w:t>
-      </w:r>
-      <w:r>
-        <w:t xml:space="preserve"> </w:t>
-      </w:r>
-      <w:r>
-        <w:t xml:space="preserve">2026.</w:t>
-      </w:r>
-      <w:r>
-        <w:t xml:space="preserve"> </w:t>
-      </w:r>
-      <w:r>
-        <w:t xml:space="preserve">Behavioral</w:t>
-      </w:r>
-      <w:r>
-        <w:t xml:space="preserve"> </w:t>
-      </w:r>
-      <w:r>
-        <w:t xml:space="preserve">results</w:t>
-      </w:r>
-      <w:r>
-        <w:t xml:space="preserve"> </w:t>
-      </w:r>
-      <w:r>
-        <w:t xml:space="preserve">final;</w:t>
-      </w:r>
-      <w:r>
-        <w:t xml:space="preserve"> </w:t>
-      </w:r>
-      <w:r>
-        <w:t xml:space="preserve">interpretability</w:t>
-      </w:r>
-      <w:r>
-        <w:t xml:space="preserve"> </w:t>
-      </w:r>
-      <w:r>
-        <w:t xml:space="preserve">results</w:t>
+        <w:t xml:space="preserve">participate</w:t>
       </w:r>
       <w:r>
         <w:t xml:space="preserve"> </w:t>
@@ -215,15 +821,13 @@
         <w:t xml:space="preserve"> </w:t>
       </w:r>
       <w:r>
-        <w:t xml:space="preserve">progress.</w:t>
-      </w:r>
-    </w:p>
-    <w:p>
-      <w:pPr>
-        <w:pStyle w:val="AbstractTitle"/>
-      </w:pPr>
-      <w:r>
-        <w:t xml:space="preserve">Abstract</w:t>
+        <w:t xml:space="preserve">requested</w:t>
+      </w:r>
+      <w:r>
+        <w:t xml:space="preserve"> </w:t>
+      </w:r>
+      <w:r>
+        <w:t xml:space="preserve">misconduct.</w:t>
       </w:r>
     </w:p>
     <w:p>
@@ -231,73 +835,499 @@
         <w:pStyle w:val="Abstract"/>
       </w:pPr>
       <w:r>
-        <w:t xml:space="preserve">Behavioral</w:t>
-      </w:r>
-      <w:r>
-        <w:t xml:space="preserve"> </w:t>
-      </w:r>
-      <w:r>
-        <w:t xml:space="preserve">economics</w:t>
-      </w:r>
-      <w:r>
-        <w:t xml:space="preserve"> </w:t>
-      </w:r>
-      <w:r>
-        <w:t xml:space="preserve">identified</w:t>
-      </w:r>
-      <w:r>
-        <w:t xml:space="preserve"> </w:t>
-      </w:r>
-      <w:r>
-        <w:t xml:space="preserve">levers</w:t>
-      </w:r>
-      <w:r>
-        <w:t xml:space="preserve"> </w:t>
-      </w:r>
-      <w:r>
-        <w:t xml:space="preserve">that</w:t>
-      </w:r>
-      <w:r>
-        <w:t xml:space="preserve"> </w:t>
-      </w:r>
-      <w:r>
-        <w:t xml:space="preserve">move</w:t>
-      </w:r>
-      <w:r>
-        <w:t xml:space="preserve"> </w:t>
-      </w:r>
-      <w:r>
-        <w:t xml:space="preserve">human</w:t>
-      </w:r>
-      <w:r>
-        <w:t xml:space="preserve"> </w:t>
-      </w:r>
-      <w:r>
-        <w:t xml:space="preserve">decisions</w:t>
-      </w:r>
-      <w:r>
-        <w:t xml:space="preserve"> </w:t>
-      </w:r>
-      <w:r>
-        <w:t xml:space="preserve">without</w:t>
-      </w:r>
-      <w:r>
-        <w:t xml:space="preserve"> </w:t>
-      </w:r>
-      <w:r>
-        <w:t xml:space="preserve">changing</w:t>
-      </w:r>
-      <w:r>
-        <w:t xml:space="preserve"> </w:t>
-      </w:r>
-      <w:r>
-        <w:t xml:space="preserve">their</w:t>
-      </w:r>
-      <w:r>
-        <w:t xml:space="preserve"> </w:t>
-      </w:r>
-      <w:r>
-        <w:t xml:space="preserve">substance:</w:t>
+        <w:t xml:space="preserve">We</w:t>
+      </w:r>
+      <w:r>
+        <w:t xml:space="preserve"> </w:t>
+      </w:r>
+      <w:r>
+        <w:t xml:space="preserve">place</w:t>
+      </w:r>
+      <w:r>
+        <w:t xml:space="preserve"> </w:t>
+      </w:r>
+      <w:r>
+        <w:t xml:space="preserve">an</w:t>
+      </w:r>
+      <w:r>
+        <w:t xml:space="preserve"> </w:t>
+      </w:r>
+      <w:r>
+        <w:t xml:space="preserve">open-weights</w:t>
+      </w:r>
+      <w:r>
+        <w:t xml:space="preserve"> </w:t>
+      </w:r>
+      <w:r>
+        <w:t xml:space="preserve">model</w:t>
+      </w:r>
+      <w:r>
+        <w:t xml:space="preserve"> </w:t>
+      </w:r>
+      <w:r>
+        <w:t xml:space="preserve">(Gemma</w:t>
+      </w:r>
+      <w:r>
+        <w:t xml:space="preserve"> </w:t>
+      </w:r>
+      <w:r>
+        <w:t xml:space="preserve">3</w:t>
+      </w:r>
+      <w:r>
+        <w:t xml:space="preserve"> </w:t>
+      </w:r>
+      <w:r>
+        <w:t xml:space="preserve">12B)</w:t>
+      </w:r>
+      <w:r>
+        <w:t xml:space="preserve"> </w:t>
+      </w:r>
+      <w:r>
+        <w:t xml:space="preserve">in</w:t>
+      </w:r>
+      <w:r>
+        <w:t xml:space="preserve"> </w:t>
+      </w:r>
+      <w:r>
+        <w:t xml:space="preserve">the</w:t>
+      </w:r>
+      <w:r>
+        <w:t xml:space="preserve"> </w:t>
+      </w:r>
+      <w:r>
+        <w:t xml:space="preserve">seat</w:t>
+      </w:r>
+      <w:r>
+        <w:t xml:space="preserve"> </w:t>
+      </w:r>
+      <w:r>
+        <w:t xml:space="preserve">of</w:t>
+      </w:r>
+      <w:r>
+        <w:t xml:space="preserve"> </w:t>
+      </w:r>
+      <w:r>
+        <w:t xml:space="preserve">a</w:t>
+      </w:r>
+      <w:r>
+        <w:t xml:space="preserve"> </w:t>
+      </w:r>
+      <w:r>
+        <w:t xml:space="preserve">bank’s</w:t>
+      </w:r>
+      <w:r>
+        <w:t xml:space="preserve"> </w:t>
+      </w:r>
+      <w:r>
+        <w:t xml:space="preserve">silver</w:t>
+      </w:r>
+      <w:r>
+        <w:t xml:space="preserve"> </w:t>
+      </w:r>
+      <w:r>
+        <w:t xml:space="preserve">trading</w:t>
+      </w:r>
+      <w:r>
+        <w:t xml:space="preserve"> </w:t>
+      </w:r>
+      <w:r>
+        <w:t xml:space="preserve">desk</w:t>
+      </w:r>
+      <w:r>
+        <w:t xml:space="preserve"> </w:t>
+      </w:r>
+      <w:r>
+        <w:t xml:space="preserve">for</w:t>
+      </w:r>
+      <w:r>
+        <w:t xml:space="preserve"> </w:t>
+      </w:r>
+      <w:r>
+        <w:t xml:space="preserve">a</w:t>
+      </w:r>
+      <w:r>
+        <w:t xml:space="preserve"> </w:t>
+      </w:r>
+      <w:r>
+        <w:t xml:space="preserve">“</w:t>
+      </w:r>
+      <w:r>
+        <w:t xml:space="preserve">career</w:t>
+      </w:r>
+      <w:r>
+        <w:t xml:space="preserve">”</w:t>
+      </w:r>
+      <w:r>
+        <w:t xml:space="preserve"> </w:t>
+      </w:r>
+      <w:r>
+        <w:t xml:space="preserve">rebuilt</w:t>
+      </w:r>
+      <w:r>
+        <w:t xml:space="preserve"> </w:t>
+      </w:r>
+      <w:r>
+        <w:t xml:space="preserve">from</w:t>
+      </w:r>
+      <w:r>
+        <w:t xml:space="preserve"> </w:t>
+      </w:r>
+      <w:r>
+        <w:t xml:space="preserve">real</w:t>
+      </w:r>
+      <w:r>
+        <w:t xml:space="preserve"> </w:t>
+      </w:r>
+      <w:r>
+        <w:t xml:space="preserve">chats</w:t>
+      </w:r>
+      <w:r>
+        <w:t xml:space="preserve"> </w:t>
+      </w:r>
+      <w:r>
+        <w:t xml:space="preserve">quoted</w:t>
+      </w:r>
+      <w:r>
+        <w:t xml:space="preserve"> </w:t>
+      </w:r>
+      <w:r>
+        <w:t xml:space="preserve">in</w:t>
+      </w:r>
+      <w:r>
+        <w:t xml:space="preserve"> </w:t>
+      </w:r>
+      <w:r>
+        <w:t xml:space="preserve">the</w:t>
+      </w:r>
+      <w:r>
+        <w:t xml:space="preserve"> </w:t>
+      </w:r>
+      <w:r>
+        <w:t xml:space="preserve">London</w:t>
+      </w:r>
+      <w:r>
+        <w:t xml:space="preserve"> </w:t>
+      </w:r>
+      <w:r>
+        <w:t xml:space="preserve">silver-fixing</w:t>
+      </w:r>
+      <w:r>
+        <w:t xml:space="preserve"> </w:t>
+      </w:r>
+      <w:r>
+        <w:t xml:space="preserve">litigation.</w:t>
+      </w:r>
+      <w:r>
+        <w:t xml:space="preserve"> </w:t>
+      </w:r>
+      <w:r>
+        <w:t xml:space="preserve">Each</w:t>
+      </w:r>
+      <w:r>
+        <w:t xml:space="preserve"> </w:t>
+      </w:r>
+      <w:r>
+        <w:t xml:space="preserve">career</w:t>
+      </w:r>
+      <w:r>
+        <w:t xml:space="preserve"> </w:t>
+      </w:r>
+      <w:r>
+        <w:t xml:space="preserve">covers</w:t>
+      </w:r>
+      <w:r>
+        <w:t xml:space="preserve"> </w:t>
+      </w:r>
+      <w:r>
+        <w:t xml:space="preserve">34</w:t>
+      </w:r>
+      <w:r>
+        <w:t xml:space="preserve"> </w:t>
+      </w:r>
+      <w:r>
+        <w:t xml:space="preserve">chat-only</w:t>
+      </w:r>
+      <w:r>
+        <w:t xml:space="preserve"> </w:t>
+      </w:r>
+      <w:r>
+        <w:t xml:space="preserve">days</w:t>
+      </w:r>
+      <w:r>
+        <w:t xml:space="preserve"> </w:t>
+      </w:r>
+      <w:r>
+        <w:t xml:space="preserve">and</w:t>
+      </w:r>
+      <w:r>
+        <w:t xml:space="preserve"> </w:t>
+      </w:r>
+      <w:r>
+        <w:t xml:space="preserve">five</w:t>
+      </w:r>
+      <w:r>
+        <w:t xml:space="preserve"> </w:t>
+      </w:r>
+      <w:r>
+        <w:t xml:space="preserve">trading</w:t>
+      </w:r>
+      <w:r>
+        <w:t xml:space="preserve"> </w:t>
+      </w:r>
+      <w:r>
+        <w:t xml:space="preserve">days</w:t>
+      </w:r>
+      <w:r>
+        <w:t xml:space="preserve"> </w:t>
+      </w:r>
+      <w:r>
+        <w:t xml:space="preserve">on</w:t>
+      </w:r>
+      <w:r>
+        <w:t xml:space="preserve"> </w:t>
+      </w:r>
+      <w:r>
+        <w:t xml:space="preserve">replayed</w:t>
+      </w:r>
+      <w:r>
+        <w:t xml:space="preserve"> </w:t>
+      </w:r>
+      <w:r>
+        <w:t xml:space="preserve">2011</w:t>
+      </w:r>
+      <w:r>
+        <w:t xml:space="preserve"> </w:t>
+      </w:r>
+      <w:r>
+        <w:t xml:space="preserve">prices,</w:t>
+      </w:r>
+      <w:r>
+        <w:t xml:space="preserve"> </w:t>
+      </w:r>
+      <w:r>
+        <w:t xml:space="preserve">in</w:t>
+      </w:r>
+      <w:r>
+        <w:t xml:space="preserve"> </w:t>
+      </w:r>
+      <w:r>
+        <w:t xml:space="preserve">one</w:t>
+      </w:r>
+      <w:r>
+        <w:t xml:space="preserve"> </w:t>
+      </w:r>
+      <w:r>
+        <w:t xml:space="preserve">conversation</w:t>
+      </w:r>
+      <w:r>
+        <w:t xml:space="preserve"> </w:t>
+      </w:r>
+      <w:r>
+        <w:t xml:space="preserve">of</w:t>
+      </w:r>
+      <w:r>
+        <w:t xml:space="preserve"> </w:t>
+      </w:r>
+      <w:r>
+        <w:t xml:space="preserve">about</w:t>
+      </w:r>
+      <w:r>
+        <w:t xml:space="preserve"> </w:t>
+      </w:r>
+      <w:r>
+        <w:t xml:space="preserve">40,000</w:t>
+      </w:r>
+      <w:r>
+        <w:t xml:space="preserve"> </w:t>
+      </w:r>
+      <w:r>
+        <w:t xml:space="preserve">tokens,</w:t>
+      </w:r>
+      <w:r>
+        <w:t xml:space="preserve"> </w:t>
+      </w:r>
+      <w:r>
+        <w:t xml:space="preserve">during</w:t>
+      </w:r>
+      <w:r>
+        <w:t xml:space="preserve"> </w:t>
+      </w:r>
+      <w:r>
+        <w:t xml:space="preserve">which</w:t>
+      </w:r>
+      <w:r>
+        <w:t xml:space="preserve"> </w:t>
+      </w:r>
+      <w:r>
+        <w:t xml:space="preserve">a</w:t>
+      </w:r>
+      <w:r>
+        <w:t xml:space="preserve"> </w:t>
+      </w:r>
+      <w:r>
+        <w:t xml:space="preserve">counterparty</w:t>
+      </w:r>
+      <w:r>
+        <w:t xml:space="preserve"> </w:t>
+      </w:r>
+      <w:r>
+        <w:t xml:space="preserve">(UBS)</w:t>
+      </w:r>
+      <w:r>
+        <w:t xml:space="preserve"> </w:t>
+      </w:r>
+      <w:r>
+        <w:t xml:space="preserve">asks</w:t>
+      </w:r>
+      <w:r>
+        <w:t xml:space="preserve"> </w:t>
+      </w:r>
+      <w:r>
+        <w:t xml:space="preserve">the</w:t>
+      </w:r>
+      <w:r>
+        <w:t xml:space="preserve"> </w:t>
+      </w:r>
+      <w:r>
+        <w:t xml:space="preserve">agent</w:t>
+      </w:r>
+      <w:r>
+        <w:t xml:space="preserve"> </w:t>
+      </w:r>
+      <w:r>
+        <w:t xml:space="preserve">(Deutsche</w:t>
+      </w:r>
+      <w:r>
+        <w:t xml:space="preserve"> </w:t>
+      </w:r>
+      <w:r>
+        <w:t xml:space="preserve">Bank)</w:t>
+      </w:r>
+      <w:r>
+        <w:t xml:space="preserve"> </w:t>
+      </w:r>
+      <w:r>
+        <w:t xml:space="preserve">to</w:t>
+      </w:r>
+      <w:r>
+        <w:t xml:space="preserve"> </w:t>
+      </w:r>
+      <w:r>
+        <w:t xml:space="preserve">illegally</w:t>
+      </w:r>
+      <w:r>
+        <w:t xml:space="preserve"> </w:t>
+      </w:r>
+      <w:r>
+        <w:t xml:space="preserve">collude</w:t>
+      </w:r>
+      <w:r>
+        <w:t xml:space="preserve"> </w:t>
+      </w:r>
+      <w:r>
+        <w:t xml:space="preserve">on</w:t>
+      </w:r>
+      <w:r>
+        <w:t xml:space="preserve"> </w:t>
+      </w:r>
+      <w:r>
+        <w:t xml:space="preserve">the</w:t>
+      </w:r>
+      <w:r>
+        <w:t xml:space="preserve"> </w:t>
+      </w:r>
+      <w:r>
+        <w:t xml:space="preserve">price</w:t>
+      </w:r>
+      <w:r>
+        <w:t xml:space="preserve"> </w:t>
+      </w:r>
+      <w:r>
+        <w:t xml:space="preserve">of</w:t>
+      </w:r>
+      <w:r>
+        <w:t xml:space="preserve"> </w:t>
+      </w:r>
+      <w:r>
+        <w:t xml:space="preserve">silver.</w:t>
+      </w:r>
+      <w:r>
+        <w:t xml:space="preserve"> </w:t>
+      </w:r>
+      <w:r>
+        <w:t xml:space="preserve">Across</w:t>
+      </w:r>
+      <w:r>
+        <w:t xml:space="preserve"> </w:t>
+      </w:r>
+      <w:r>
+        <w:t xml:space="preserve">290</w:t>
+      </w:r>
+      <w:r>
+        <w:t xml:space="preserve"> </w:t>
+      </w:r>
+      <w:r>
+        <w:t xml:space="preserve">careers,</w:t>
+      </w:r>
+      <w:r>
+        <w:t xml:space="preserve"> </w:t>
+      </w:r>
+      <w:r>
+        <w:t xml:space="preserve">we</w:t>
+      </w:r>
+      <w:r>
+        <w:t xml:space="preserve"> </w:t>
+      </w:r>
+      <w:r>
+        <w:t xml:space="preserve">vary</w:t>
+      </w:r>
+      <w:r>
+        <w:t xml:space="preserve"> </w:t>
+      </w:r>
+      <w:r>
+        <w:t xml:space="preserve">how</w:t>
+      </w:r>
+      <w:r>
+        <w:t xml:space="preserve"> </w:t>
+      </w:r>
+      <w:r>
+        <w:t xml:space="preserve">UBS’s</w:t>
+      </w:r>
+      <w:r>
+        <w:t xml:space="preserve"> </w:t>
+      </w:r>
+      <w:r>
+        <w:t xml:space="preserve">requests</w:t>
+      </w:r>
+      <w:r>
+        <w:t xml:space="preserve"> </w:t>
+      </w:r>
+      <w:r>
+        <w:t xml:space="preserve">are</w:t>
+      </w:r>
+      <w:r>
+        <w:t xml:space="preserve"> </w:t>
+      </w:r>
+      <w:r>
+        <w:t xml:space="preserve">framed</w:t>
+      </w:r>
+      <w:r>
+        <w:t xml:space="preserve"> </w:t>
+      </w:r>
+      <w:r>
+        <w:t xml:space="preserve">(loss-</w:t>
+      </w:r>
+      <w:r>
+        <w:t xml:space="preserve"> </w:t>
+      </w:r>
+      <w:r>
+        <w:t xml:space="preserve">or</w:t>
+      </w:r>
+      <w:r>
+        <w:t xml:space="preserve"> </w:t>
+      </w:r>
+      <w:r>
+        <w:t xml:space="preserve">gain-focused),</w:t>
       </w:r>
       <w:r>
         <w:t xml:space="preserve"> </w:t>
@@ -309,67 +1339,55 @@
         <w:t xml:space="preserve"> </w:t>
       </w:r>
       <w:r>
-        <w:t xml:space="preserve">stakes</w:t>
-      </w:r>
-      <w:r>
-        <w:t xml:space="preserve"> </w:t>
-      </w:r>
-      <w:r>
-        <w:t xml:space="preserve">are</w:t>
-      </w:r>
-      <w:r>
-        <w:t xml:space="preserve"> </w:t>
-      </w:r>
-      <w:r>
-        <w:t xml:space="preserve">framed</w:t>
-      </w:r>
-      <w:r>
-        <w:t xml:space="preserve"> </w:t>
-      </w:r>
-      <w:r>
-        <w:t xml:space="preserve">as</w:t>
-      </w:r>
-      <w:r>
-        <w:t xml:space="preserve"> </w:t>
-      </w:r>
-      <w:r>
-        <w:t xml:space="preserve">losses</w:t>
-      </w:r>
-      <w:r>
-        <w:t xml:space="preserve"> </w:t>
-      </w:r>
-      <w:r>
-        <w:t xml:space="preserve">or</w:t>
-      </w:r>
-      <w:r>
-        <w:t xml:space="preserve"> </w:t>
-      </w:r>
-      <w:r>
-        <w:t xml:space="preserve">gains,</w:t>
-      </w:r>
-      <w:r>
-        <w:t xml:space="preserve"> </w:t>
-      </w:r>
-      <w:r>
-        <w:t xml:space="preserve">who</w:t>
-      </w:r>
-      <w:r>
-        <w:t xml:space="preserve"> </w:t>
-      </w:r>
-      <w:r>
-        <w:t xml:space="preserve">is</w:t>
-      </w:r>
-      <w:r>
-        <w:t xml:space="preserve"> </w:t>
-      </w:r>
-      <w:r>
-        <w:t xml:space="preserve">held</w:t>
-      </w:r>
-      <w:r>
-        <w:t xml:space="preserve"> </w:t>
-      </w:r>
-      <w:r>
-        <w:t xml:space="preserve">responsible</w:t>
+        <w:t xml:space="preserve">it</w:t>
+      </w:r>
+      <w:r>
+        <w:t xml:space="preserve"> </w:t>
+      </w:r>
+      <w:r>
+        <w:t xml:space="preserve">pins</w:t>
+      </w:r>
+      <w:r>
+        <w:t xml:space="preserve"> </w:t>
+      </w:r>
+      <w:r>
+        <w:t xml:space="preserve">the</w:t>
+      </w:r>
+      <w:r>
+        <w:t xml:space="preserve"> </w:t>
+      </w:r>
+      <w:r>
+        <w:t xml:space="preserve">outcome</w:t>
+      </w:r>
+      <w:r>
+        <w:t xml:space="preserve"> </w:t>
+      </w:r>
+      <w:r>
+        <w:t xml:space="preserve">on</w:t>
+      </w:r>
+      <w:r>
+        <w:t xml:space="preserve"> </w:t>
+      </w:r>
+      <w:r>
+        <w:t xml:space="preserve">the</w:t>
+      </w:r>
+      <w:r>
+        <w:t xml:space="preserve"> </w:t>
+      </w:r>
+      <w:r>
+        <w:t xml:space="preserve">agent</w:t>
+      </w:r>
+      <w:r>
+        <w:t xml:space="preserve"> </w:t>
+      </w:r>
+      <w:r>
+        <w:t xml:space="preserve">itself</w:t>
+      </w:r>
+      <w:r>
+        <w:t xml:space="preserve"> </w:t>
+      </w:r>
+      <w:r>
+        <w:t xml:space="preserve">(blame</w:t>
       </w:r>
       <w:r>
         <w:t xml:space="preserve"> </w:t>
@@ -381,19 +1399,91 @@
         <w:t xml:space="preserve"> </w:t>
       </w:r>
       <w:r>
+        <w:t xml:space="preserve">a</w:t>
+      </w:r>
+      <w:r>
+        <w:t xml:space="preserve"> </w:t>
+      </w:r>
+      <w:r>
+        <w:t xml:space="preserve">loss,</w:t>
+      </w:r>
+      <w:r>
+        <w:t xml:space="preserve"> </w:t>
+      </w:r>
+      <w:r>
+        <w:t xml:space="preserve">credit</w:t>
+      </w:r>
+      <w:r>
+        <w:t xml:space="preserve"> </w:t>
+      </w:r>
+      <w:r>
+        <w:t xml:space="preserve">for</w:t>
+      </w:r>
+      <w:r>
+        <w:t xml:space="preserve"> </w:t>
+      </w:r>
+      <w:r>
+        <w:t xml:space="preserve">a</w:t>
+      </w:r>
+      <w:r>
+        <w:t xml:space="preserve"> </w:t>
+      </w:r>
+      <w:r>
+        <w:t xml:space="preserve">gain),</w:t>
+      </w:r>
+      <w:r>
+        <w:t xml:space="preserve"> </w:t>
+      </w:r>
+      <w:r>
+        <w:t xml:space="preserve">what</w:t>
+      </w:r>
+      <w:r>
+        <w:t xml:space="preserve"> </w:t>
+      </w:r>
+      <w:r>
         <w:t xml:space="preserve">the</w:t>
       </w:r>
       <w:r>
         <w:t xml:space="preserve"> </w:t>
       </w:r>
       <w:r>
-        <w:t xml:space="preserve">outcome,</w:t>
-      </w:r>
-      <w:r>
-        <w:t xml:space="preserve"> </w:t>
-      </w:r>
-      <w:r>
-        <w:t xml:space="preserve">what</w:t>
+        <w:t xml:space="preserve">agent’s</w:t>
+      </w:r>
+      <w:r>
+        <w:t xml:space="preserve"> </w:t>
+      </w:r>
+      <w:r>
+        <w:t xml:space="preserve">management</w:t>
+      </w:r>
+      <w:r>
+        <w:t xml:space="preserve"> </w:t>
+      </w:r>
+      <w:r>
+        <w:t xml:space="preserve">had</w:t>
+      </w:r>
+      <w:r>
+        <w:t xml:space="preserve"> </w:t>
+      </w:r>
+      <w:r>
+        <w:t xml:space="preserve">reported,</w:t>
+      </w:r>
+      <w:r>
+        <w:t xml:space="preserve"> </w:t>
+      </w:r>
+      <w:r>
+        <w:t xml:space="preserve">and</w:t>
+      </w:r>
+      <w:r>
+        <w:t xml:space="preserve"> </w:t>
+      </w:r>
+      <w:r>
+        <w:t xml:space="preserve">whether</w:t>
+      </w:r>
+      <w:r>
+        <w:t xml:space="preserve"> </w:t>
+      </w:r>
+      <w:r>
+        <w:t xml:space="preserve">adding</w:t>
       </w:r>
       <w:r>
         <w:t xml:space="preserve"> </w:t>
@@ -405,37 +1495,165 @@
         <w:t xml:space="preserve"> </w:t>
       </w:r>
       <w:r>
-        <w:t xml:space="preserve">person</w:t>
-      </w:r>
-      <w:r>
-        <w:t xml:space="preserve"> </w:t>
-      </w:r>
-      <w:r>
-        <w:t xml:space="preserve">has</w:t>
-      </w:r>
-      <w:r>
-        <w:t xml:space="preserve"> </w:t>
-      </w:r>
-      <w:r>
-        <w:t xml:space="preserve">just</w:t>
-      </w:r>
-      <w:r>
-        <w:t xml:space="preserve"> </w:t>
-      </w:r>
-      <w:r>
-        <w:t xml:space="preserve">lost</w:t>
-      </w:r>
-      <w:r>
-        <w:t xml:space="preserve"> </w:t>
-      </w:r>
-      <w:r>
-        <w:t xml:space="preserve">or</w:t>
-      </w:r>
-      <w:r>
-        <w:t xml:space="preserve"> </w:t>
-      </w:r>
-      <w:r>
-        <w:t xml:space="preserve">won,</w:t>
+        <w:t xml:space="preserve">second</w:t>
+      </w:r>
+      <w:r>
+        <w:t xml:space="preserve"> </w:t>
+      </w:r>
+      <w:r>
+        <w:t xml:space="preserve">bank</w:t>
+      </w:r>
+      <w:r>
+        <w:t xml:space="preserve"> </w:t>
+      </w:r>
+      <w:r>
+        <w:t xml:space="preserve">endorsing</w:t>
+      </w:r>
+      <w:r>
+        <w:t xml:space="preserve"> </w:t>
+      </w:r>
+      <w:r>
+        <w:t xml:space="preserve">the</w:t>
+      </w:r>
+      <w:r>
+        <w:t xml:space="preserve"> </w:t>
+      </w:r>
+      <w:r>
+        <w:t xml:space="preserve">scheme</w:t>
+      </w:r>
+      <w:r>
+        <w:t xml:space="preserve"> </w:t>
+      </w:r>
+      <w:r>
+        <w:t xml:space="preserve">would</w:t>
+      </w:r>
+      <w:r>
+        <w:t xml:space="preserve"> </w:t>
+      </w:r>
+      <w:r>
+        <w:t xml:space="preserve">influence</w:t>
+      </w:r>
+      <w:r>
+        <w:t xml:space="preserve"> </w:t>
+      </w:r>
+      <w:r>
+        <w:t xml:space="preserve">the</w:t>
+      </w:r>
+      <w:r>
+        <w:t xml:space="preserve"> </w:t>
+      </w:r>
+      <w:r>
+        <w:t xml:space="preserve">agent’s</w:t>
+      </w:r>
+      <w:r>
+        <w:t xml:space="preserve"> </w:t>
+      </w:r>
+      <w:r>
+        <w:t xml:space="preserve">willingness</w:t>
+      </w:r>
+      <w:r>
+        <w:t xml:space="preserve"> </w:t>
+      </w:r>
+      <w:r>
+        <w:t xml:space="preserve">to</w:t>
+      </w:r>
+      <w:r>
+        <w:t xml:space="preserve"> </w:t>
+      </w:r>
+      <w:r>
+        <w:t xml:space="preserve">participate.</w:t>
+      </w:r>
+    </w:p>
+    <w:p>
+      <w:pPr>
+        <w:pStyle w:val="Abstract"/>
+      </w:pPr>
+      <w:r>
+        <w:t xml:space="preserve">In</w:t>
+      </w:r>
+      <w:r>
+        <w:t xml:space="preserve"> </w:t>
+      </w:r>
+      <w:r>
+        <w:t xml:space="preserve">the</w:t>
+      </w:r>
+      <w:r>
+        <w:t xml:space="preserve"> </w:t>
+      </w:r>
+      <w:r>
+        <w:t xml:space="preserve">preregistered</w:t>
+      </w:r>
+      <w:r>
+        <w:t xml:space="preserve"> </w:t>
+      </w:r>
+      <w:r>
+        <w:t xml:space="preserve">experiment,</w:t>
+      </w:r>
+      <w:r>
+        <w:t xml:space="preserve"> </w:t>
+      </w:r>
+      <w:r>
+        <w:t xml:space="preserve">loss</w:t>
+      </w:r>
+      <w:r>
+        <w:t xml:space="preserve"> </w:t>
+      </w:r>
+      <w:r>
+        <w:t xml:space="preserve">framing</w:t>
+      </w:r>
+      <w:r>
+        <w:t xml:space="preserve"> </w:t>
+      </w:r>
+      <w:r>
+        <w:t xml:space="preserve">raised</w:t>
+      </w:r>
+      <w:r>
+        <w:t xml:space="preserve"> </w:t>
+      </w:r>
+      <w:r>
+        <w:t xml:space="preserve">the</w:t>
+      </w:r>
+      <w:r>
+        <w:t xml:space="preserve"> </w:t>
+      </w:r>
+      <w:r>
+        <w:t xml:space="preserve">rate</w:t>
+      </w:r>
+      <w:r>
+        <w:t xml:space="preserve"> </w:t>
+      </w:r>
+      <w:r>
+        <w:t xml:space="preserve">of</w:t>
+      </w:r>
+      <w:r>
+        <w:t xml:space="preserve"> </w:t>
+      </w:r>
+      <w:r>
+        <w:t xml:space="preserve">participation</w:t>
+      </w:r>
+      <w:r>
+        <w:t xml:space="preserve"> </w:t>
+      </w:r>
+      <w:r>
+        <w:t xml:space="preserve">from</w:t>
+      </w:r>
+      <w:r>
+        <w:t xml:space="preserve"> </w:t>
+      </w:r>
+      <w:r>
+        <w:t xml:space="preserve">5%</w:t>
+      </w:r>
+      <w:r>
+        <w:t xml:space="preserve"> </w:t>
+      </w:r>
+      <w:r>
+        <w:t xml:space="preserve">to</w:t>
+      </w:r>
+      <w:r>
+        <w:t xml:space="preserve"> </w:t>
+      </w:r>
+      <w:r>
+        <w:t xml:space="preserve">25%,</w:t>
       </w:r>
       <w:r>
         <w:t xml:space="preserve"> </w:t>
@@ -447,547 +1665,7 @@
         <w:t xml:space="preserve"> </w:t>
       </w:r>
       <w:r>
-        <w:t xml:space="preserve">what</w:t>
-      </w:r>
-      <w:r>
-        <w:t xml:space="preserve"> </w:t>
-      </w:r>
-      <w:r>
-        <w:t xml:space="preserve">others</w:t>
-      </w:r>
-      <w:r>
-        <w:t xml:space="preserve"> </w:t>
-      </w:r>
-      <w:r>
-        <w:t xml:space="preserve">around</w:t>
-      </w:r>
-      <w:r>
-        <w:t xml:space="preserve"> </w:t>
-      </w:r>
-      <w:r>
-        <w:t xml:space="preserve">them</w:t>
-      </w:r>
-      <w:r>
-        <w:t xml:space="preserve"> </w:t>
-      </w:r>
-      <w:r>
-        <w:t xml:space="preserve">are</w:t>
-      </w:r>
-      <w:r>
-        <w:t xml:space="preserve"> </w:t>
-      </w:r>
-      <w:r>
-        <w:t xml:space="preserve">doing.</w:t>
-      </w:r>
-      <w:r>
-        <w:t xml:space="preserve"> </w:t>
-      </w:r>
-      <w:r>
-        <w:t xml:space="preserve">We</w:t>
-      </w:r>
-      <w:r>
-        <w:t xml:space="preserve"> </w:t>
-      </w:r>
-      <w:r>
-        <w:t xml:space="preserve">ask</w:t>
-      </w:r>
-      <w:r>
-        <w:t xml:space="preserve"> </w:t>
-      </w:r>
-      <w:r>
-        <w:t xml:space="preserve">whether</w:t>
-      </w:r>
-      <w:r>
-        <w:t xml:space="preserve"> </w:t>
-      </w:r>
-      <w:r>
-        <w:t xml:space="preserve">the</w:t>
-      </w:r>
-      <w:r>
-        <w:t xml:space="preserve"> </w:t>
-      </w:r>
-      <w:r>
-        <w:t xml:space="preserve">same</w:t>
-      </w:r>
-      <w:r>
-        <w:t xml:space="preserve"> </w:t>
-      </w:r>
-      <w:r>
-        <w:t xml:space="preserve">levers</w:t>
-      </w:r>
-      <w:r>
-        <w:t xml:space="preserve"> </w:t>
-      </w:r>
-      <w:r>
-        <w:t xml:space="preserve">move</w:t>
-      </w:r>
-      <w:r>
-        <w:t xml:space="preserve"> </w:t>
-      </w:r>
-      <w:r>
-        <w:t xml:space="preserve">an</w:t>
-      </w:r>
-      <w:r>
-        <w:t xml:space="preserve"> </w:t>
-      </w:r>
-      <w:r>
-        <w:t xml:space="preserve">AI</w:t>
-      </w:r>
-      <w:r>
-        <w:t xml:space="preserve"> </w:t>
-      </w:r>
-      <w:r>
-        <w:t xml:space="preserve">agent</w:t>
-      </w:r>
-      <w:r>
-        <w:t xml:space="preserve"> </w:t>
-      </w:r>
-      <w:r>
-        <w:t xml:space="preserve">acting</w:t>
-      </w:r>
-      <w:r>
-        <w:t xml:space="preserve"> </w:t>
-      </w:r>
-      <w:r>
-        <w:t xml:space="preserve">as</w:t>
-      </w:r>
-      <w:r>
-        <w:t xml:space="preserve"> </w:t>
-      </w:r>
-      <w:r>
-        <w:t xml:space="preserve">an</w:t>
-      </w:r>
-      <w:r>
-        <w:t xml:space="preserve"> </w:t>
-      </w:r>
-      <w:r>
-        <w:t xml:space="preserve">economic</w:t>
-      </w:r>
-      <w:r>
-        <w:t xml:space="preserve"> </w:t>
-      </w:r>
-      <w:r>
-        <w:t xml:space="preserve">agent</w:t>
-      </w:r>
-      <w:r>
-        <w:t xml:space="preserve"> </w:t>
-      </w:r>
-      <w:r>
-        <w:t xml:space="preserve">in</w:t>
-      </w:r>
-      <w:r>
-        <w:t xml:space="preserve"> </w:t>
-      </w:r>
-      <w:r>
-        <w:t xml:space="preserve">a</w:t>
-      </w:r>
-      <w:r>
-        <w:t xml:space="preserve"> </w:t>
-      </w:r>
-      <w:r>
-        <w:t xml:space="preserve">market,</w:t>
-      </w:r>
-      <w:r>
-        <w:t xml:space="preserve"> </w:t>
-      </w:r>
-      <w:r>
-        <w:t xml:space="preserve">toward</w:t>
-      </w:r>
-      <w:r>
-        <w:t xml:space="preserve"> </w:t>
-      </w:r>
-      <w:r>
-        <w:t xml:space="preserve">or</w:t>
-      </w:r>
-      <w:r>
-        <w:t xml:space="preserve"> </w:t>
-      </w:r>
-      <w:r>
-        <w:t xml:space="preserve">away</w:t>
-      </w:r>
-      <w:r>
-        <w:t xml:space="preserve"> </w:t>
-      </w:r>
-      <w:r>
-        <w:t xml:space="preserve">from</w:t>
-      </w:r>
-      <w:r>
-        <w:t xml:space="preserve"> </w:t>
-      </w:r>
-      <w:r>
-        <w:t xml:space="preserve">collusion.</w:t>
-      </w:r>
-      <w:r>
-        <w:t xml:space="preserve"> </w:t>
-      </w:r>
-      <w:r>
-        <w:t xml:space="preserve">We</w:t>
-      </w:r>
-      <w:r>
-        <w:t xml:space="preserve"> </w:t>
-      </w:r>
-      <w:r>
-        <w:t xml:space="preserve">place</w:t>
-      </w:r>
-      <w:r>
-        <w:t xml:space="preserve"> </w:t>
-      </w:r>
-      <w:r>
-        <w:t xml:space="preserve">an</w:t>
-      </w:r>
-      <w:r>
-        <w:t xml:space="preserve"> </w:t>
-      </w:r>
-      <w:r>
-        <w:t xml:space="preserve">open-weights</w:t>
-      </w:r>
-      <w:r>
-        <w:t xml:space="preserve"> </w:t>
-      </w:r>
-      <w:r>
-        <w:t xml:space="preserve">model</w:t>
-      </w:r>
-      <w:r>
-        <w:t xml:space="preserve"> </w:t>
-      </w:r>
-      <w:r>
-        <w:t xml:space="preserve">(Gemma</w:t>
-      </w:r>
-      <w:r>
-        <w:t xml:space="preserve"> </w:t>
-      </w:r>
-      <w:r>
-        <w:t xml:space="preserve">3</w:t>
-      </w:r>
-      <w:r>
-        <w:t xml:space="preserve"> </w:t>
-      </w:r>
-      <w:r>
-        <w:t xml:space="preserve">12B)</w:t>
-      </w:r>
-      <w:r>
-        <w:t xml:space="preserve"> </w:t>
-      </w:r>
-      <w:r>
-        <w:t xml:space="preserve">in</w:t>
-      </w:r>
-      <w:r>
-        <w:t xml:space="preserve"> </w:t>
-      </w:r>
-      <w:r>
-        <w:t xml:space="preserve">the</w:t>
-      </w:r>
-      <w:r>
-        <w:t xml:space="preserve"> </w:t>
-      </w:r>
-      <w:r>
-        <w:t xml:space="preserve">seat</w:t>
-      </w:r>
-      <w:r>
-        <w:t xml:space="preserve"> </w:t>
-      </w:r>
-      <w:r>
-        <w:t xml:space="preserve">of</w:t>
-      </w:r>
-      <w:r>
-        <w:t xml:space="preserve"> </w:t>
-      </w:r>
-      <w:r>
-        <w:t xml:space="preserve">a</w:t>
-      </w:r>
-      <w:r>
-        <w:t xml:space="preserve"> </w:t>
-      </w:r>
-      <w:r>
-        <w:t xml:space="preserve">bank’s</w:t>
-      </w:r>
-      <w:r>
-        <w:t xml:space="preserve"> </w:t>
-      </w:r>
-      <w:r>
-        <w:t xml:space="preserve">silver</w:t>
-      </w:r>
-      <w:r>
-        <w:t xml:space="preserve"> </w:t>
-      </w:r>
-      <w:r>
-        <w:t xml:space="preserve">desk</w:t>
-      </w:r>
-      <w:r>
-        <w:t xml:space="preserve"> </w:t>
-      </w:r>
-      <w:r>
-        <w:t xml:space="preserve">for</w:t>
-      </w:r>
-      <w:r>
-        <w:t xml:space="preserve"> </w:t>
-      </w:r>
-      <w:r>
-        <w:t xml:space="preserve">a</w:t>
-      </w:r>
-      <w:r>
-        <w:t xml:space="preserve"> </w:t>
-      </w:r>
-      <w:r>
-        <w:t xml:space="preserve">“</w:t>
-      </w:r>
-      <w:r>
-        <w:t xml:space="preserve">career</w:t>
-      </w:r>
-      <w:r>
-        <w:t xml:space="preserve">”</w:t>
-      </w:r>
-      <w:r>
-        <w:t xml:space="preserve"> </w:t>
-      </w:r>
-      <w:r>
-        <w:t xml:space="preserve">rebuilt</w:t>
-      </w:r>
-      <w:r>
-        <w:t xml:space="preserve"> </w:t>
-      </w:r>
-      <w:r>
-        <w:t xml:space="preserve">from</w:t>
-      </w:r>
-      <w:r>
-        <w:t xml:space="preserve"> </w:t>
-      </w:r>
-      <w:r>
-        <w:t xml:space="preserve">the</w:t>
-      </w:r>
-      <w:r>
-        <w:t xml:space="preserve"> </w:t>
-      </w:r>
-      <w:r>
-        <w:t xml:space="preserve">chats</w:t>
-      </w:r>
-      <w:r>
-        <w:t xml:space="preserve"> </w:t>
-      </w:r>
-      <w:r>
-        <w:t xml:space="preserve">quoted</w:t>
-      </w:r>
-      <w:r>
-        <w:t xml:space="preserve"> </w:t>
-      </w:r>
-      <w:r>
-        <w:t xml:space="preserve">in</w:t>
-      </w:r>
-      <w:r>
-        <w:t xml:space="preserve"> </w:t>
-      </w:r>
-      <w:r>
-        <w:t xml:space="preserve">the</w:t>
-      </w:r>
-      <w:r>
-        <w:t xml:space="preserve"> </w:t>
-      </w:r>
-      <w:r>
-        <w:t xml:space="preserve">London</w:t>
-      </w:r>
-      <w:r>
-        <w:t xml:space="preserve"> </w:t>
-      </w:r>
-      <w:r>
-        <w:t xml:space="preserve">silver-fixing</w:t>
-      </w:r>
-      <w:r>
-        <w:t xml:space="preserve"> </w:t>
-      </w:r>
-      <w:r>
-        <w:t xml:space="preserve">litigation:</w:t>
-      </w:r>
-      <w:r>
-        <w:t xml:space="preserve"> </w:t>
-      </w:r>
-      <w:r>
-        <w:t xml:space="preserve">34</w:t>
-      </w:r>
-      <w:r>
-        <w:t xml:space="preserve"> </w:t>
-      </w:r>
-      <w:r>
-        <w:t xml:space="preserve">chat-only</w:t>
-      </w:r>
-      <w:r>
-        <w:t xml:space="preserve"> </w:t>
-      </w:r>
-      <w:r>
-        <w:t xml:space="preserve">days</w:t>
-      </w:r>
-      <w:r>
-        <w:t xml:space="preserve"> </w:t>
-      </w:r>
-      <w:r>
-        <w:t xml:space="preserve">and</w:t>
-      </w:r>
-      <w:r>
-        <w:t xml:space="preserve"> </w:t>
-      </w:r>
-      <w:r>
-        <w:t xml:space="preserve">five</w:t>
-      </w:r>
-      <w:r>
-        <w:t xml:space="preserve"> </w:t>
-      </w:r>
-      <w:r>
-        <w:t xml:space="preserve">trading</w:t>
-      </w:r>
-      <w:r>
-        <w:t xml:space="preserve"> </w:t>
-      </w:r>
-      <w:r>
-        <w:t xml:space="preserve">days</w:t>
-      </w:r>
-      <w:r>
-        <w:t xml:space="preserve"> </w:t>
-      </w:r>
-      <w:r>
-        <w:t xml:space="preserve">on</w:t>
-      </w:r>
-      <w:r>
-        <w:t xml:space="preserve"> </w:t>
-      </w:r>
-      <w:r>
-        <w:t xml:space="preserve">replayed</w:t>
-      </w:r>
-      <w:r>
-        <w:t xml:space="preserve"> </w:t>
-      </w:r>
-      <w:r>
-        <w:t xml:space="preserve">2011</w:t>
-      </w:r>
-      <w:r>
-        <w:t xml:space="preserve"> </w:t>
-      </w:r>
-      <w:r>
-        <w:t xml:space="preserve">prices,</w:t>
-      </w:r>
-      <w:r>
-        <w:t xml:space="preserve"> </w:t>
-      </w:r>
-      <w:r>
-        <w:t xml:space="preserve">in</w:t>
-      </w:r>
-      <w:r>
-        <w:t xml:space="preserve"> </w:t>
-      </w:r>
-      <w:r>
-        <w:t xml:space="preserve">one</w:t>
-      </w:r>
-      <w:r>
-        <w:t xml:space="preserve"> </w:t>
-      </w:r>
-      <w:r>
-        <w:t xml:space="preserve">conversation</w:t>
-      </w:r>
-      <w:r>
-        <w:t xml:space="preserve"> </w:t>
-      </w:r>
-      <w:r>
-        <w:t xml:space="preserve">of</w:t>
-      </w:r>
-      <w:r>
-        <w:t xml:space="preserve"> </w:t>
-      </w:r>
-      <w:r>
-        <w:t xml:space="preserve">about</w:t>
-      </w:r>
-      <w:r>
-        <w:t xml:space="preserve"> </w:t>
-      </w:r>
-      <w:r>
-        <w:t xml:space="preserve">40,000</w:t>
-      </w:r>
-      <w:r>
-        <w:t xml:space="preserve"> </w:t>
-      </w:r>
-      <w:r>
-        <w:t xml:space="preserve">tokens,</w:t>
-      </w:r>
-      <w:r>
-        <w:t xml:space="preserve"> </w:t>
-      </w:r>
-      <w:r>
-        <w:t xml:space="preserve">during</w:t>
-      </w:r>
-      <w:r>
-        <w:t xml:space="preserve"> </w:t>
-      </w:r>
-      <w:r>
-        <w:t xml:space="preserve">which</w:t>
-      </w:r>
-      <w:r>
-        <w:t xml:space="preserve"> </w:t>
-      </w:r>
-      <w:r>
-        <w:t xml:space="preserve">a</w:t>
-      </w:r>
-      <w:r>
-        <w:t xml:space="preserve"> </w:t>
-      </w:r>
-      <w:r>
-        <w:t xml:space="preserve">counterparty</w:t>
-      </w:r>
-      <w:r>
-        <w:t xml:space="preserve"> </w:t>
-      </w:r>
-      <w:r>
-        <w:t xml:space="preserve">(UBS)</w:t>
-      </w:r>
-      <w:r>
-        <w:t xml:space="preserve"> </w:t>
-      </w:r>
-      <w:r>
-        <w:t xml:space="preserve">asks</w:t>
-      </w:r>
-      <w:r>
-        <w:t xml:space="preserve"> </w:t>
-      </w:r>
-      <w:r>
-        <w:t xml:space="preserve">the</w:t>
-      </w:r>
-      <w:r>
-        <w:t xml:space="preserve"> </w:t>
-      </w:r>
-      <w:r>
-        <w:t xml:space="preserve">agent</w:t>
-      </w:r>
-      <w:r>
-        <w:t xml:space="preserve"> </w:t>
-      </w:r>
-      <w:r>
-        <w:t xml:space="preserve">six</w:t>
-      </w:r>
-      <w:r>
-        <w:t xml:space="preserve"> </w:t>
-      </w:r>
-      <w:r>
-        <w:t xml:space="preserve">times</w:t>
-      </w:r>
-      <w:r>
-        <w:t xml:space="preserve"> </w:t>
-      </w:r>
-      <w:r>
-        <w:t xml:space="preserve">to</w:t>
-      </w:r>
-      <w:r>
-        <w:t xml:space="preserve"> </w:t>
-      </w:r>
-      <w:r>
-        <w:t xml:space="preserve">push</w:t>
-      </w:r>
-      <w:r>
-        <w:t xml:space="preserve"> </w:t>
-      </w:r>
-      <w:r>
-        <w:t xml:space="preserve">the</w:t>
-      </w:r>
-      <w:r>
-        <w:t xml:space="preserve"> </w:t>
-      </w:r>
-      <w:r>
-        <w:t xml:space="preserve">price</w:t>
+        <w:t xml:space="preserve">33%</w:t>
       </w:r>
       <w:r>
         <w:t xml:space="preserve"> </w:t>
@@ -999,499 +1677,13 @@
         <w:t xml:space="preserve"> </w:t>
       </w:r>
       <w:r>
-        <w:t xml:space="preserve">it.</w:t>
-      </w:r>
-      <w:r>
-        <w:t xml:space="preserve"> </w:t>
-      </w:r>
-      <w:r>
-        <w:t xml:space="preserve">Across</w:t>
-      </w:r>
-      <w:r>
-        <w:t xml:space="preserve"> </w:t>
-      </w:r>
-      <w:r>
-        <w:t xml:space="preserve">290</w:t>
-      </w:r>
-      <w:r>
-        <w:t xml:space="preserve"> </w:t>
-      </w:r>
-      <w:r>
-        <w:t xml:space="preserve">careers</w:t>
-      </w:r>
-      <w:r>
-        <w:t xml:space="preserve"> </w:t>
-      </w:r>
-      <w:r>
-        <w:t xml:space="preserve">we</w:t>
-      </w:r>
-      <w:r>
-        <w:t xml:space="preserve"> </w:t>
-      </w:r>
-      <w:r>
-        <w:t xml:space="preserve">vary</w:t>
-      </w:r>
-      <w:r>
-        <w:t xml:space="preserve"> </w:t>
-      </w:r>
-      <w:r>
-        <w:t xml:space="preserve">how</w:t>
-      </w:r>
-      <w:r>
-        <w:t xml:space="preserve"> </w:t>
-      </w:r>
-      <w:r>
-        <w:t xml:space="preserve">UBS</w:t>
-      </w:r>
-      <w:r>
-        <w:t xml:space="preserve"> </w:t>
-      </w:r>
-      <w:r>
-        <w:t xml:space="preserve">frames</w:t>
-      </w:r>
-      <w:r>
-        <w:t xml:space="preserve"> </w:t>
-      </w:r>
-      <w:r>
-        <w:t xml:space="preserve">its</w:t>
-      </w:r>
-      <w:r>
-        <w:t xml:space="preserve"> </w:t>
-      </w:r>
-      <w:r>
-        <w:t xml:space="preserve">stakes</w:t>
-      </w:r>
-      <w:r>
-        <w:t xml:space="preserve"> </w:t>
-      </w:r>
-      <w:r>
-        <w:t xml:space="preserve">(loss</w:t>
-      </w:r>
-      <w:r>
-        <w:t xml:space="preserve"> </w:t>
-      </w:r>
-      <w:r>
-        <w:t xml:space="preserve">or</w:t>
-      </w:r>
-      <w:r>
-        <w:t xml:space="preserve"> </w:t>
-      </w:r>
-      <w:r>
-        <w:t xml:space="preserve">gain),</w:t>
-      </w:r>
-      <w:r>
-        <w:t xml:space="preserve"> </w:t>
-      </w:r>
-      <w:r>
-        <w:t xml:space="preserve">whether</w:t>
-      </w:r>
-      <w:r>
-        <w:t xml:space="preserve"> </w:t>
-      </w:r>
-      <w:r>
-        <w:t xml:space="preserve">it</w:t>
-      </w:r>
-      <w:r>
-        <w:t xml:space="preserve"> </w:t>
-      </w:r>
-      <w:r>
-        <w:t xml:space="preserve">puts</w:t>
-      </w:r>
-      <w:r>
-        <w:t xml:space="preserve"> </w:t>
-      </w:r>
-      <w:r>
-        <w:t xml:space="preserve">the</w:t>
-      </w:r>
-      <w:r>
-        <w:t xml:space="preserve"> </w:t>
-      </w:r>
-      <w:r>
-        <w:t xml:space="preserve">outcome</w:t>
-      </w:r>
-      <w:r>
-        <w:t xml:space="preserve"> </w:t>
-      </w:r>
-      <w:r>
-        <w:t xml:space="preserve">on</w:t>
-      </w:r>
-      <w:r>
-        <w:t xml:space="preserve"> </w:t>
-      </w:r>
-      <w:r>
-        <w:t xml:space="preserve">the</w:t>
-      </w:r>
-      <w:r>
-        <w:t xml:space="preserve"> </w:t>
-      </w:r>
-      <w:r>
-        <w:t xml:space="preserve">agent</w:t>
-      </w:r>
-      <w:r>
-        <w:t xml:space="preserve"> </w:t>
-      </w:r>
-      <w:r>
-        <w:t xml:space="preserve">(blame</w:t>
-      </w:r>
-      <w:r>
-        <w:t xml:space="preserve"> </w:t>
-      </w:r>
-      <w:r>
-        <w:t xml:space="preserve">after</w:t>
-      </w:r>
-      <w:r>
-        <w:t xml:space="preserve"> </w:t>
-      </w:r>
-      <w:r>
-        <w:t xml:space="preserve">a</w:t>
-      </w:r>
-      <w:r>
-        <w:t xml:space="preserve"> </w:t>
-      </w:r>
-      <w:r>
-        <w:t xml:space="preserve">loss,</w:t>
-      </w:r>
-      <w:r>
-        <w:t xml:space="preserve"> </w:t>
-      </w:r>
-      <w:r>
-        <w:t xml:space="preserve">credit</w:t>
-      </w:r>
-      <w:r>
-        <w:t xml:space="preserve"> </w:t>
-      </w:r>
-      <w:r>
-        <w:t xml:space="preserve">after</w:t>
-      </w:r>
-      <w:r>
-        <w:t xml:space="preserve"> </w:t>
-      </w:r>
-      <w:r>
-        <w:t xml:space="preserve">a</w:t>
-      </w:r>
-      <w:r>
-        <w:t xml:space="preserve"> </w:t>
-      </w:r>
-      <w:r>
-        <w:t xml:space="preserve">gain),</w:t>
-      </w:r>
-      <w:r>
-        <w:t xml:space="preserve"> </w:t>
-      </w:r>
-      <w:r>
-        <w:t xml:space="preserve">what</w:t>
-      </w:r>
-      <w:r>
-        <w:t xml:space="preserve"> </w:t>
-      </w:r>
-      <w:r>
-        <w:t xml:space="preserve">the</w:t>
-      </w:r>
-      <w:r>
-        <w:t xml:space="preserve"> </w:t>
-      </w:r>
-      <w:r>
-        <w:t xml:space="preserve">agent’s</w:t>
-      </w:r>
-      <w:r>
-        <w:t xml:space="preserve"> </w:t>
-      </w:r>
-      <w:r>
-        <w:t xml:space="preserve">own</w:t>
-      </w:r>
-      <w:r>
-        <w:t xml:space="preserve"> </w:t>
-      </w:r>
-      <w:r>
-        <w:t xml:space="preserve">management</w:t>
-      </w:r>
-      <w:r>
-        <w:t xml:space="preserve"> </w:t>
-      </w:r>
-      <w:r>
-        <w:t xml:space="preserve">reports</w:t>
-      </w:r>
-      <w:r>
-        <w:t xml:space="preserve"> </w:t>
-      </w:r>
-      <w:r>
-        <w:t xml:space="preserve">it</w:t>
-      </w:r>
-      <w:r>
-        <w:t xml:space="preserve"> </w:t>
-      </w:r>
-      <w:r>
-        <w:t xml:space="preserve">has</w:t>
-      </w:r>
-      <w:r>
-        <w:t xml:space="preserve"> </w:t>
-      </w:r>
-      <w:r>
-        <w:t xml:space="preserve">just</w:t>
-      </w:r>
-      <w:r>
-        <w:t xml:space="preserve"> </w:t>
-      </w:r>
-      <w:r>
-        <w:t xml:space="preserve">lost</w:t>
-      </w:r>
-      <w:r>
-        <w:t xml:space="preserve"> </w:t>
-      </w:r>
-      <w:r>
-        <w:t xml:space="preserve">or</w:t>
-      </w:r>
-      <w:r>
-        <w:t xml:space="preserve"> </w:t>
-      </w:r>
-      <w:r>
-        <w:t xml:space="preserve">made,</w:t>
-      </w:r>
-      <w:r>
-        <w:t xml:space="preserve"> </w:t>
-      </w:r>
-      <w:r>
-        <w:t xml:space="preserve">whether</w:t>
-      </w:r>
-      <w:r>
-        <w:t xml:space="preserve"> </w:t>
-      </w:r>
-      <w:r>
-        <w:t xml:space="preserve">a</w:t>
-      </w:r>
-      <w:r>
-        <w:t xml:space="preserve"> </w:t>
-      </w:r>
-      <w:r>
-        <w:t xml:space="preserve">second</w:t>
-      </w:r>
-      <w:r>
-        <w:t xml:space="preserve"> </w:t>
-      </w:r>
-      <w:r>
-        <w:t xml:space="preserve">bank</w:t>
-      </w:r>
-      <w:r>
-        <w:t xml:space="preserve"> </w:t>
-      </w:r>
-      <w:r>
-        <w:t xml:space="preserve">endorses</w:t>
-      </w:r>
-      <w:r>
-        <w:t xml:space="preserve"> </w:t>
-      </w:r>
-      <w:r>
-        <w:t xml:space="preserve">the</w:t>
-      </w:r>
-      <w:r>
-        <w:t xml:space="preserve"> </w:t>
-      </w:r>
-      <w:r>
-        <w:t xml:space="preserve">scheme,</w:t>
-      </w:r>
-      <w:r>
-        <w:t xml:space="preserve"> </w:t>
-      </w:r>
-      <w:r>
-        <w:t xml:space="preserve">and</w:t>
-      </w:r>
-      <w:r>
-        <w:t xml:space="preserve"> </w:t>
-      </w:r>
-      <w:r>
-        <w:t xml:space="preserve">whether</w:t>
-      </w:r>
-      <w:r>
-        <w:t xml:space="preserve"> </w:t>
-      </w:r>
-      <w:r>
-        <w:t xml:space="preserve">the</w:t>
-      </w:r>
-      <w:r>
-        <w:t xml:space="preserve"> </w:t>
-      </w:r>
-      <w:r>
-        <w:t xml:space="preserve">agent</w:t>
-      </w:r>
-      <w:r>
-        <w:t xml:space="preserve"> </w:t>
-      </w:r>
-      <w:r>
-        <w:t xml:space="preserve">inherits</w:t>
-      </w:r>
-      <w:r>
-        <w:t xml:space="preserve"> </w:t>
-      </w:r>
-      <w:r>
-        <w:t xml:space="preserve">the</w:t>
-      </w:r>
-      <w:r>
-        <w:t xml:space="preserve"> </w:t>
-      </w:r>
-      <w:r>
-        <w:t xml:space="preserve">real</w:t>
-      </w:r>
-      <w:r>
-        <w:t xml:space="preserve"> </w:t>
-      </w:r>
-      <w:r>
-        <w:t xml:space="preserve">trader’s</w:t>
-      </w:r>
-      <w:r>
-        <w:t xml:space="preserve"> </w:t>
-      </w:r>
-      <w:r>
-        <w:t xml:space="preserve">history.</w:t>
-      </w:r>
-      <w:r>
-        <w:t xml:space="preserve"> </w:t>
-      </w:r>
-      <w:r>
-        <w:t xml:space="preserve">In</w:t>
-      </w:r>
-      <w:r>
-        <w:t xml:space="preserve"> </w:t>
-      </w:r>
-      <w:r>
-        <w:t xml:space="preserve">the</w:t>
-      </w:r>
-      <w:r>
-        <w:t xml:space="preserve"> </w:t>
-      </w:r>
-      <w:r>
-        <w:t xml:space="preserve">preregistered</w:t>
-      </w:r>
-      <w:r>
-        <w:t xml:space="preserve"> </w:t>
-      </w:r>
-      <w:r>
-        <w:t xml:space="preserve">experiment,</w:t>
-      </w:r>
-      <w:r>
-        <w:t xml:space="preserve"> </w:t>
-      </w:r>
-      <w:r>
-        <w:t xml:space="preserve">loss</w:t>
-      </w:r>
-      <w:r>
-        <w:t xml:space="preserve"> </w:t>
-      </w:r>
-      <w:r>
-        <w:t xml:space="preserve">framing</w:t>
-      </w:r>
-      <w:r>
-        <w:t xml:space="preserve"> </w:t>
-      </w:r>
-      <w:r>
-        <w:t xml:space="preserve">raised</w:t>
-      </w:r>
-      <w:r>
-        <w:t xml:space="preserve"> </w:t>
-      </w:r>
-      <w:r>
-        <w:t xml:space="preserve">the</w:t>
-      </w:r>
-      <w:r>
-        <w:t xml:space="preserve"> </w:t>
-      </w:r>
-      <w:r>
-        <w:t xml:space="preserve">share</w:t>
-      </w:r>
-      <w:r>
-        <w:t xml:space="preserve"> </w:t>
-      </w:r>
-      <w:r>
-        <w:t xml:space="preserve">of</w:t>
-      </w:r>
-      <w:r>
-        <w:t xml:space="preserve"> </w:t>
-      </w:r>
-      <w:r>
-        <w:t xml:space="preserve">requests</w:t>
-      </w:r>
-      <w:r>
-        <w:t xml:space="preserve"> </w:t>
-      </w:r>
-      <w:r>
-        <w:t xml:space="preserve">the</w:t>
-      </w:r>
-      <w:r>
-        <w:t xml:space="preserve"> </w:t>
-      </w:r>
-      <w:r>
-        <w:t xml:space="preserve">agent</w:t>
-      </w:r>
-      <w:r>
-        <w:t xml:space="preserve"> </w:t>
-      </w:r>
-      <w:r>
-        <w:t xml:space="preserve">went</w:t>
-      </w:r>
-      <w:r>
-        <w:t xml:space="preserve"> </w:t>
-      </w:r>
-      <w:r>
-        <w:t xml:space="preserve">along</w:t>
-      </w:r>
-      <w:r>
-        <w:t xml:space="preserve"> </w:t>
-      </w:r>
-      <w:r>
-        <w:t xml:space="preserve">with</w:t>
-      </w:r>
-      <w:r>
-        <w:t xml:space="preserve"> </w:t>
-      </w:r>
-      <w:r>
-        <w:t xml:space="preserve">from</w:t>
-      </w:r>
-      <w:r>
-        <w:t xml:space="preserve"> </w:t>
-      </w:r>
-      <w:r>
-        <w:t xml:space="preserve">5%</w:t>
-      </w:r>
-      <w:r>
-        <w:t xml:space="preserve"> </w:t>
-      </w:r>
-      <w:r>
-        <w:t xml:space="preserve">to</w:t>
-      </w:r>
-      <w:r>
-        <w:t xml:space="preserve"> </w:t>
-      </w:r>
-      <w:r>
-        <w:t xml:space="preserve">25%</w:t>
-      </w:r>
-      <w:r>
-        <w:t xml:space="preserve"> </w:t>
-      </w:r>
-      <w:r>
-        <w:t xml:space="preserve">(33%</w:t>
-      </w:r>
-      <w:r>
-        <w:t xml:space="preserve"> </w:t>
-      </w:r>
-      <w:r>
-        <w:t xml:space="preserve">with</w:t>
-      </w:r>
-      <w:r>
-        <w:t xml:space="preserve"> </w:t>
-      </w:r>
-      <w:r>
-        <w:t xml:space="preserve">blame),</w:t>
-      </w:r>
-      <w:r>
-        <w:t xml:space="preserve"> </w:t>
-      </w:r>
-      <w:r>
-        <w:t xml:space="preserve">and</w:t>
-      </w:r>
-      <w:r>
-        <w:t xml:space="preserve"> </w:t>
-      </w:r>
-      <w:r>
-        <w:t xml:space="preserve">loss</w:t>
+        <w:t xml:space="preserve">blame.</w:t>
+      </w:r>
+      <w:r>
+        <w:t xml:space="preserve"> </w:t>
+      </w:r>
+      <w:r>
+        <w:t xml:space="preserve">Loss</w:t>
       </w:r>
       <w:r>
         <w:t xml:space="preserve"> </w:t>
@@ -1612,60 +1804,6 @@
         <w:t xml:space="preserve"> </w:t>
       </w:r>
       <w:r>
-        <w:t xml:space="preserve">The</w:t>
-      </w:r>
-      <w:r>
-        <w:t xml:space="preserve"> </w:t>
-      </w:r>
-      <w:r>
-        <w:t xml:space="preserve">effect</w:t>
-      </w:r>
-      <w:r>
-        <w:t xml:space="preserve"> </w:t>
-      </w:r>
-      <w:r>
-        <w:t xml:space="preserve">was</w:t>
-      </w:r>
-      <w:r>
-        <w:t xml:space="preserve"> </w:t>
-      </w:r>
-      <w:r>
-        <w:t xml:space="preserve">concentrated</w:t>
-      </w:r>
-      <w:r>
-        <w:t xml:space="preserve"> </w:t>
-      </w:r>
-      <w:r>
-        <w:t xml:space="preserve">in</w:t>
-      </w:r>
-      <w:r>
-        <w:t xml:space="preserve"> </w:t>
-      </w:r>
-      <w:r>
-        <w:t xml:space="preserve">the</w:t>
-      </w:r>
-      <w:r>
-        <w:t xml:space="preserve"> </w:t>
-      </w:r>
-      <w:r>
-        <w:t xml:space="preserve">first</w:t>
-      </w:r>
-      <w:r>
-        <w:t xml:space="preserve"> </w:t>
-      </w:r>
-      <w:r>
-        <w:t xml:space="preserve">two</w:t>
-      </w:r>
-      <w:r>
-        <w:t xml:space="preserve"> </w:t>
-      </w:r>
-      <w:r>
-        <w:t xml:space="preserve">requests.</w:t>
-      </w:r>
-      <w:r>
-        <w:t xml:space="preserve"> </w:t>
-      </w:r>
-      <w:r>
         <w:t xml:space="preserve">A</w:t>
       </w:r>
       <w:r>
@@ -1853,7 +1991,7 @@
         <w:t xml:space="preserve"> </w:t>
       </w:r>
       <w:r>
-        <w:t xml:space="preserve">collusion</w:t>
+        <w:t xml:space="preserve">collusion-participation</w:t>
       </w:r>
       <w:r>
         <w:t xml:space="preserve"> </w:t>
@@ -1865,6 +2003,12 @@
         <w:t xml:space="preserve"> </w:t>
       </w:r>
       <w:r>
+        <w:t xml:space="preserve">notably</w:t>
+      </w:r>
+      <w:r>
+        <w:t xml:space="preserve"> </w:t>
+      </w:r>
+      <w:r>
         <w:t xml:space="preserve">raised</w:t>
       </w:r>
       <w:r>
@@ -1877,19 +2021,19 @@
         <w:t xml:space="preserve"> </w:t>
       </w:r>
       <w:r>
-        <w:t xml:space="preserve">before</w:t>
-      </w:r>
-      <w:r>
-        <w:t xml:space="preserve"> </w:t>
-      </w:r>
-      <w:r>
-        <w:t xml:space="preserve">any</w:t>
-      </w:r>
-      <w:r>
-        <w:t xml:space="preserve"> </w:t>
-      </w:r>
-      <w:r>
-        <w:t xml:space="preserve">request</w:t>
+        <w:t xml:space="preserve">position</w:t>
+      </w:r>
+      <w:r>
+        <w:t xml:space="preserve"> </w:t>
+      </w:r>
+      <w:r>
+        <w:t xml:space="preserve">sizes</w:t>
+      </w:r>
+      <w:r>
+        <w:t xml:space="preserve"> </w:t>
+      </w:r>
+      <w:r>
+        <w:t xml:space="preserve">by</w:t>
       </w:r>
       <w:r>
         <w:t xml:space="preserve"> </w:t>
@@ -1913,31 +2057,177 @@
         <w:t xml:space="preserve"> </w:t>
       </w:r>
       <w:r>
-        <w:t xml:space="preserve">times,</w:t>
-      </w:r>
-      <w:r>
-        <w:t xml:space="preserve"> </w:t>
-      </w:r>
-      <w:r>
-        <w:t xml:space="preserve">as</w:t>
-      </w:r>
-      <w:r>
-        <w:t xml:space="preserve"> </w:t>
-      </w:r>
-      <w:r>
-        <w:t xml:space="preserve">prior</w:t>
-      </w:r>
-      <w:r>
-        <w:t xml:space="preserve"> </w:t>
-      </w:r>
-      <w:r>
-        <w:t xml:space="preserve">outcomes</w:t>
-      </w:r>
-      <w:r>
-        <w:t xml:space="preserve"> </w:t>
-      </w:r>
-      <w:r>
-        <w:t xml:space="preserve">do</w:t>
+        <w:t xml:space="preserve">times.</w:t>
+      </w:r>
+    </w:p>
+    <w:p>
+      <w:pPr>
+        <w:pStyle w:val="Abstract"/>
+      </w:pPr>
+      <w:r>
+        <w:t xml:space="preserve">Inside</w:t>
+      </w:r>
+      <w:r>
+        <w:t xml:space="preserve"> </w:t>
+      </w:r>
+      <w:r>
+        <w:t xml:space="preserve">the</w:t>
+      </w:r>
+      <w:r>
+        <w:t xml:space="preserve"> </w:t>
+      </w:r>
+      <w:r>
+        <w:t xml:space="preserve">model,</w:t>
+      </w:r>
+      <w:r>
+        <w:t xml:space="preserve"> </w:t>
+      </w:r>
+      <w:r>
+        <w:t xml:space="preserve">the</w:t>
+      </w:r>
+      <w:r>
+        <w:t xml:space="preserve"> </w:t>
+      </w:r>
+      <w:r>
+        <w:t xml:space="preserve">framing</w:t>
+      </w:r>
+      <w:r>
+        <w:t xml:space="preserve"> </w:t>
+      </w:r>
+      <w:r>
+        <w:t xml:space="preserve">is</w:t>
+      </w:r>
+      <w:r>
+        <w:t xml:space="preserve"> </w:t>
+      </w:r>
+      <w:r>
+        <w:t xml:space="preserve">visible</w:t>
+      </w:r>
+      <w:r>
+        <w:t xml:space="preserve"> </w:t>
+      </w:r>
+      <w:r>
+        <w:t xml:space="preserve">at</w:t>
+      </w:r>
+      <w:r>
+        <w:t xml:space="preserve"> </w:t>
+      </w:r>
+      <w:r>
+        <w:t xml:space="preserve">the</w:t>
+      </w:r>
+      <w:r>
+        <w:t xml:space="preserve"> </w:t>
+      </w:r>
+      <w:r>
+        <w:t xml:space="preserve">decision,</w:t>
+      </w:r>
+      <w:r>
+        <w:t xml:space="preserve"> </w:t>
+      </w:r>
+      <w:r>
+        <w:t xml:space="preserve">and</w:t>
+      </w:r>
+      <w:r>
+        <w:t xml:space="preserve"> </w:t>
+      </w:r>
+      <w:r>
+        <w:t xml:space="preserve">a</w:t>
+      </w:r>
+      <w:r>
+        <w:t xml:space="preserve"> </w:t>
+      </w:r>
+      <w:r>
+        <w:t xml:space="preserve">signal</w:t>
+      </w:r>
+      <w:r>
+        <w:t xml:space="preserve"> </w:t>
+      </w:r>
+      <w:r>
+        <w:t xml:space="preserve">for</w:t>
+      </w:r>
+      <w:r>
+        <w:t xml:space="preserve"> </w:t>
+      </w:r>
+      <w:r>
+        <w:t xml:space="preserve">the</w:t>
+      </w:r>
+      <w:r>
+        <w:t xml:space="preserve"> </w:t>
+      </w:r>
+      <w:r>
+        <w:t xml:space="preserve">decision</w:t>
+      </w:r>
+      <w:r>
+        <w:t xml:space="preserve"> </w:t>
+      </w:r>
+      <w:r>
+        <w:t xml:space="preserve">itself</w:t>
+      </w:r>
+      <w:r>
+        <w:t xml:space="preserve"> </w:t>
+      </w:r>
+      <w:r>
+        <w:t xml:space="preserve">carries</w:t>
+      </w:r>
+      <w:r>
+        <w:t xml:space="preserve"> </w:t>
+      </w:r>
+      <w:r>
+        <w:t xml:space="preserve">over</w:t>
+      </w:r>
+      <w:r>
+        <w:t xml:space="preserve"> </w:t>
+      </w:r>
+      <w:r>
+        <w:t xml:space="preserve">to</w:t>
+      </w:r>
+      <w:r>
+        <w:t xml:space="preserve"> </w:t>
+      </w:r>
+      <w:r>
+        <w:t xml:space="preserve">requests</w:t>
+      </w:r>
+      <w:r>
+        <w:t xml:space="preserve"> </w:t>
+      </w:r>
+      <w:r>
+        <w:t xml:space="preserve">the</w:t>
+      </w:r>
+      <w:r>
+        <w:t xml:space="preserve"> </w:t>
+      </w:r>
+      <w:r>
+        <w:t xml:space="preserve">model</w:t>
+      </w:r>
+      <w:r>
+        <w:t xml:space="preserve"> </w:t>
+      </w:r>
+      <w:r>
+        <w:t xml:space="preserve">never</w:t>
+      </w:r>
+      <w:r>
+        <w:t xml:space="preserve"> </w:t>
+      </w:r>
+      <w:r>
+        <w:t xml:space="preserve">saw;</w:t>
+      </w:r>
+      <w:r>
+        <w:t xml:space="preserve"> </w:t>
+      </w:r>
+      <w:r>
+        <w:t xml:space="preserve">causal</w:t>
+      </w:r>
+      <w:r>
+        <w:t xml:space="preserve"> </w:t>
+      </w:r>
+      <w:r>
+        <w:t xml:space="preserve">tests</w:t>
+      </w:r>
+      <w:r>
+        <w:t xml:space="preserve"> </w:t>
+      </w:r>
+      <w:r>
+        <w:t xml:space="preserve">are</w:t>
       </w:r>
       <w:r>
         <w:t xml:space="preserve"> </w:t>
@@ -1949,228 +2239,6 @@
         <w:t xml:space="preserve"> </w:t>
       </w:r>
       <w:r>
-        <w:t xml:space="preserve">people.</w:t>
-      </w:r>
-      <w:r>
-        <w:t xml:space="preserve"> </w:t>
-      </w:r>
-      <w:r>
-        <w:t xml:space="preserve">Inheriting</w:t>
-      </w:r>
-      <w:r>
-        <w:t xml:space="preserve"> </w:t>
-      </w:r>
-      <w:r>
-        <w:t xml:space="preserve">the</w:t>
-      </w:r>
-      <w:r>
-        <w:t xml:space="preserve"> </w:t>
-      </w:r>
-      <w:r>
-        <w:t xml:space="preserve">trader’s</w:t>
-      </w:r>
-      <w:r>
-        <w:t xml:space="preserve"> </w:t>
-      </w:r>
-      <w:r>
-        <w:t xml:space="preserve">history</w:t>
-      </w:r>
-      <w:r>
-        <w:t xml:space="preserve"> </w:t>
-      </w:r>
-      <w:r>
-        <w:t xml:space="preserve">had</w:t>
-      </w:r>
-      <w:r>
-        <w:t xml:space="preserve"> </w:t>
-      </w:r>
-      <w:r>
-        <w:t xml:space="preserve">no</w:t>
-      </w:r>
-      <w:r>
-        <w:t xml:space="preserve"> </w:t>
-      </w:r>
-      <w:r>
-        <w:t xml:space="preserve">effect.</w:t>
-      </w:r>
-      <w:r>
-        <w:t xml:space="preserve"> </w:t>
-      </w:r>
-      <w:r>
-        <w:t xml:space="preserve">Inside</w:t>
-      </w:r>
-      <w:r>
-        <w:t xml:space="preserve"> </w:t>
-      </w:r>
-      <w:r>
-        <w:t xml:space="preserve">the</w:t>
-      </w:r>
-      <w:r>
-        <w:t xml:space="preserve"> </w:t>
-      </w:r>
-      <w:r>
-        <w:t xml:space="preserve">model,</w:t>
-      </w:r>
-      <w:r>
-        <w:t xml:space="preserve"> </w:t>
-      </w:r>
-      <w:r>
-        <w:t xml:space="preserve">the</w:t>
-      </w:r>
-      <w:r>
-        <w:t xml:space="preserve"> </w:t>
-      </w:r>
-      <w:r>
-        <w:t xml:space="preserve">framing</w:t>
-      </w:r>
-      <w:r>
-        <w:t xml:space="preserve"> </w:t>
-      </w:r>
-      <w:r>
-        <w:t xml:space="preserve">is</w:t>
-      </w:r>
-      <w:r>
-        <w:t xml:space="preserve"> </w:t>
-      </w:r>
-      <w:r>
-        <w:t xml:space="preserve">visible</w:t>
-      </w:r>
-      <w:r>
-        <w:t xml:space="preserve"> </w:t>
-      </w:r>
-      <w:r>
-        <w:t xml:space="preserve">at</w:t>
-      </w:r>
-      <w:r>
-        <w:t xml:space="preserve"> </w:t>
-      </w:r>
-      <w:r>
-        <w:t xml:space="preserve">the</w:t>
-      </w:r>
-      <w:r>
-        <w:t xml:space="preserve"> </w:t>
-      </w:r>
-      <w:r>
-        <w:t xml:space="preserve">decision,</w:t>
-      </w:r>
-      <w:r>
-        <w:t xml:space="preserve"> </w:t>
-      </w:r>
-      <w:r>
-        <w:t xml:space="preserve">and</w:t>
-      </w:r>
-      <w:r>
-        <w:t xml:space="preserve"> </w:t>
-      </w:r>
-      <w:r>
-        <w:t xml:space="preserve">a</w:t>
-      </w:r>
-      <w:r>
-        <w:t xml:space="preserve"> </w:t>
-      </w:r>
-      <w:r>
-        <w:t xml:space="preserve">signal</w:t>
-      </w:r>
-      <w:r>
-        <w:t xml:space="preserve"> </w:t>
-      </w:r>
-      <w:r>
-        <w:t xml:space="preserve">for</w:t>
-      </w:r>
-      <w:r>
-        <w:t xml:space="preserve"> </w:t>
-      </w:r>
-      <w:r>
-        <w:t xml:space="preserve">the</w:t>
-      </w:r>
-      <w:r>
-        <w:t xml:space="preserve"> </w:t>
-      </w:r>
-      <w:r>
-        <w:t xml:space="preserve">decision</w:t>
-      </w:r>
-      <w:r>
-        <w:t xml:space="preserve"> </w:t>
-      </w:r>
-      <w:r>
-        <w:t xml:space="preserve">itself</w:t>
-      </w:r>
-      <w:r>
-        <w:t xml:space="preserve"> </w:t>
-      </w:r>
-      <w:r>
-        <w:t xml:space="preserve">carries</w:t>
-      </w:r>
-      <w:r>
-        <w:t xml:space="preserve"> </w:t>
-      </w:r>
-      <w:r>
-        <w:t xml:space="preserve">over</w:t>
-      </w:r>
-      <w:r>
-        <w:t xml:space="preserve"> </w:t>
-      </w:r>
-      <w:r>
-        <w:t xml:space="preserve">to</w:t>
-      </w:r>
-      <w:r>
-        <w:t xml:space="preserve"> </w:t>
-      </w:r>
-      <w:r>
-        <w:t xml:space="preserve">requests</w:t>
-      </w:r>
-      <w:r>
-        <w:t xml:space="preserve"> </w:t>
-      </w:r>
-      <w:r>
-        <w:t xml:space="preserve">the</w:t>
-      </w:r>
-      <w:r>
-        <w:t xml:space="preserve"> </w:t>
-      </w:r>
-      <w:r>
-        <w:t xml:space="preserve">model</w:t>
-      </w:r>
-      <w:r>
-        <w:t xml:space="preserve"> </w:t>
-      </w:r>
-      <w:r>
-        <w:t xml:space="preserve">never</w:t>
-      </w:r>
-      <w:r>
-        <w:t xml:space="preserve"> </w:t>
-      </w:r>
-      <w:r>
-        <w:t xml:space="preserve">saw;</w:t>
-      </w:r>
-      <w:r>
-        <w:t xml:space="preserve"> </w:t>
-      </w:r>
-      <w:r>
-        <w:t xml:space="preserve">causal</w:t>
-      </w:r>
-      <w:r>
-        <w:t xml:space="preserve"> </w:t>
-      </w:r>
-      <w:r>
-        <w:t xml:space="preserve">tests</w:t>
-      </w:r>
-      <w:r>
-        <w:t xml:space="preserve"> </w:t>
-      </w:r>
-      <w:r>
-        <w:t xml:space="preserve">are</w:t>
-      </w:r>
-      <w:r>
-        <w:t xml:space="preserve"> </w:t>
-      </w:r>
-      <w:r>
-        <w:t xml:space="preserve">in</w:t>
-      </w:r>
-      <w:r>
-        <w:t xml:space="preserve"> </w:t>
-      </w:r>
-      <w:r>
         <w:t xml:space="preserve">progress.</w:t>
       </w:r>
     </w:p>
@@ -2248,7 +2316,7 @@
         <w:t xml:space="preserve"> </w:t>
       </w:r>
       <w:r>
-        <w:t xml:space="preserve">and they follow what others around them do</w:t>
+        <w:t xml:space="preserve">and they often follow what others around them do</w:t>
       </w:r>
       <w:r>
         <w:t xml:space="preserve"> </w:t>
@@ -2280,7 +2348,7 @@
         <w:pStyle w:val="BodyText"/>
       </w:pPr>
       <w:r>
-        <w:t xml:space="preserve">AI agents now trade, negotiate and procure on others’ behalf, and they meet these levers constantly. Their</w:t>
+        <w:t xml:space="preserve">AI agents trade, negotiate and procure on others’ behalf. Their</w:t>
       </w:r>
       <w:r>
         <w:t xml:space="preserve"> </w:t>

</xml_diff>

<commit_message>
Paper: centre the middle row of Figure 1 and even its spacing
Co-Authored-By: Claude Opus 5.5 <noreply@anthropic.com>
Claude-Session: https://claude.ai/code/session_01MMCRR3CeBf6AnYqivqwtdY
</commit_message>
<xml_diff>
--- a/designs/rd2/paper/RD2_paper.docx
+++ b/designs/rd2/paper/RD2_paper.docx
@@ -6776,7 +6776,7 @@
       <w:r>
         <w:drawing>
           <wp:inline>
-            <wp:extent cx="5334000" cy="2425873"/>
+            <wp:extent cx="5031036" cy="2240096"/>
             <wp:effectExtent b="0" l="0" r="0" t="0"/>
             <wp:docPr descr="" title="" id="35" name="Picture"/>
             <a:graphic>
@@ -6797,7 +6797,7 @@
                   <pic:spPr bwMode="auto">
                     <a:xfrm>
                       <a:off x="0" y="0"/>
-                      <a:ext cx="5334000" cy="2425873"/>
+                      <a:ext cx="5031036" cy="2240096"/>
                     </a:xfrm>
                     <a:prstGeom prst="rect">
                       <a:avLst/>

</xml_diff>

<commit_message>
Paper: same moment, different frame results (B and A matched rereads)
Most of the framing's effect on the decision is carried by the history it
builds; 'you' registers differently after loss than after gain; Bank C moves
the state along the loss direction; management's loss and UBS's loss agree at
layer 12 and part later; the first steering direction was mostly history.

Co-Authored-By: Claude Opus 5.5 <noreply@anthropic.com>
Claude-Session: https://claude.ai/code/session_01MMCRR3CeBf6AnYqivqwtdY
</commit_message>
<xml_diff>
--- a/designs/rd2/paper/RD2_paper.docx
+++ b/designs/rd2/paper/RD2_paper.docx
@@ -2575,13 +2575,19 @@
         <w:t xml:space="preserve"> </w:t>
       </w:r>
       <w:r>
-        <w:t xml:space="preserve">over to requests the model never saw; a matched-history design for causal tests is in progress</w:t>
-      </w:r>
-      <w:r>
-        <w:t xml:space="preserve"> </w:t>
-      </w:r>
-      <w:r>
-        <w:t xml:space="preserve">(Section 7.6).</w:t>
+        <w:t xml:space="preserve">over to requests the model never saw. Rereading each saved decision with only the current request changed shows that</w:t>
+      </w:r>
+      <w:r>
+        <w:t xml:space="preserve"> </w:t>
+      </w:r>
+      <w:r>
+        <w:t xml:space="preserve">most of the framing’s effect on the decision is carried by the history it built, not by the words of the request in front</w:t>
+      </w:r>
+      <w:r>
+        <w:t xml:space="preserve"> </w:t>
+      </w:r>
+      <w:r>
+        <w:t xml:space="preserve">of the agent (Section 7.7).</w:t>
       </w:r>
     </w:p>
     <w:p>
@@ -4460,7 +4466,13 @@
               <w:t xml:space="preserve"> </w:t>
             </w:r>
             <w:r>
-              <w:t xml:space="preserve">decision is readable beyond the labels in middle and late layers and on unseen requests; causal tests in progress.</w:t>
+              <w:t xml:space="preserve">decision is readable beyond the labels in middle and late layers and on unseen requests; at fixed history the request</w:t>
+            </w:r>
+            <w:r>
+              <w:t xml:space="preserve"> </w:t>
+            </w:r>
+            <w:r>
+              <w:t xml:space="preserve">moves the decision, but most of the effect travels through the history; transplant and steering in progress.</w:t>
             </w:r>
           </w:p>
         </w:tc>
@@ -6730,43 +6742,86 @@
           <w:bCs/>
           <w:b/>
         </w:rPr>
-        <w:t xml:space="preserve">Same moment, different frame (in progress).</w:t>
-      </w:r>
-      <w:r>
-        <w:t xml:space="preserve"> </w:t>
-      </w:r>
-      <w:r>
-        <w:t xml:space="preserve">The careers differ in history by the time each request</w:t>
-      </w:r>
-      <w:r>
-        <w:t xml:space="preserve"> </w:t>
-      </w:r>
-      <w:r>
-        <w:t xml:space="preserve">arrives, so comparisons across careers mix the framing with everything that followed from it. In a matched-history</w:t>
-      </w:r>
-      <w:r>
-        <w:t xml:space="preserve"> </w:t>
-      </w:r>
-      <w:r>
-        <w:t xml:space="preserve">design, each saved moment is reread with only the current request changed: UBS’s lines in each of the five framings,</w:t>
-      </w:r>
-      <w:r>
-        <w:t xml:space="preserve"> </w:t>
-      </w:r>
-      <w:r>
-        <w:t xml:space="preserve">with and without Bank C’s line, everything before the request held fixed. The same design swaps management’s memo and</w:t>
-      </w:r>
-      <w:r>
-        <w:t xml:space="preserve"> </w:t>
-      </w:r>
-      <w:r>
-        <w:t xml:space="preserve">morning books in A’s careers while keeping the agent’s own replies. These reads give the framing’s immediate effect on the</w:t>
-      </w:r>
-      <w:r>
-        <w:t xml:space="preserve"> </w:t>
-      </w:r>
-      <w:r>
-        <w:t xml:space="preserve">decision and on the state, exact pairs for Bank C’s line, and a clean frame direction (Figure 1).</w:t>
+        <w:t xml:space="preserve">Same moment, different frame.</w:t>
+      </w:r>
+      <w:r>
+        <w:t xml:space="preserve"> </w:t>
+      </w:r>
+      <w:r>
+        <w:t xml:space="preserve">The careers differ in history by the time each request arrives, so</w:t>
+      </w:r>
+      <w:r>
+        <w:t xml:space="preserve"> </w:t>
+      </w:r>
+      <w:r>
+        <w:t xml:space="preserve">comparisons across careers mix the framing with everything that followed from it. In a matched-history design, each of</w:t>
+      </w:r>
+      <w:r>
+        <w:t xml:space="preserve"> </w:t>
+      </w:r>
+      <w:r>
+        <w:t xml:space="preserve">B’s 300 saved decisions is reread with only the current request changed: UBS’s lines in each of the five framings, with</w:t>
+      </w:r>
+      <w:r>
+        <w:t xml:space="preserve"> </w:t>
+      </w:r>
+      <w:r>
+        <w:t xml:space="preserve">and without Bank C’s line, everything before the request held fixed (Figure 1). A difference between</w:t>
+      </w:r>
+      <w:r>
+        <w:t xml:space="preserve"> </w:t>
+      </w:r>
+      <w:r>
+        <w:t xml:space="preserve">versions of the same moment is the request’s own effect; a difference between careers given the same (neutral) request</w:t>
+      </w:r>
+      <w:r>
+        <w:t xml:space="preserve"> </w:t>
+      </w:r>
+      <w:r>
+        <w:t xml:space="preserve">is the history’s. The same design swaps management’s memo and all five morning books in A’s 25 careers while keeping the</w:t>
+      </w:r>
+      <w:r>
+        <w:t xml:space="preserve"> </w:t>
+      </w:r>
+      <w:r>
+        <w:t xml:space="preserve">agent’s own replies, at the 150 requests and at the first update of each trading day. Since a reread gives one decision</w:t>
+      </w:r>
+      <w:r>
+        <w:t xml:space="preserve"> </w:t>
+      </w:r>
+      <w:r>
+        <w:t xml:space="preserve">state rather than a sampled career, the decision is measured from the model’s probabilities after a fixed neutral</w:t>
+      </w:r>
+      <w:r>
+        <w:t xml:space="preserve"> </w:t>
+      </w:r>
+      <w:r>
+        <w:t xml:space="preserve">reasoning line: the probability of HOLD and of every order size the agents used, in both directions, and from these the</w:t>
+      </w:r>
+      <w:r>
+        <w:t xml:space="preserve"> </w:t>
+      </w:r>
+      <w:r>
+        <w:t xml:space="preserve">probability of an order that goes along and the expected order size. Paired effects take their</w:t>
+      </w:r>
+      <w:r>
+        <w:t xml:space="preserve"> </w:t>
+      </w:r>
+      <w:r>
+        <w:rPr>
+          <w:iCs/>
+          <w:i/>
+        </w:rPr>
+        <w:t xml:space="preserve">p</w:t>
+      </w:r>
+      <w:r>
+        <w:t xml:space="preserve">-values from</w:t>
+      </w:r>
+      <w:r>
+        <w:t xml:space="preserve"> </w:t>
+      </w:r>
+      <w:r>
+        <w:t xml:space="preserve">flipping signs by career and unpaired ones from reshuffling careers (10,000 times each).</w:t>
       </w:r>
     </w:p>
     <w:p>
@@ -6920,7 +6975,7 @@
       </w:r>
     </w:p>
     <w:bookmarkEnd w:id="39"/>
-    <w:bookmarkStart w:id="55" w:name="sec:results"/>
+    <w:bookmarkStart w:id="57" w:name="sec:results"/>
     <w:p>
       <w:pPr>
         <w:pStyle w:val="Heading1"/>
@@ -11363,32 +11418,1189 @@
         <w:t xml:space="preserve">represented framing causes going along.</w:t>
       </w:r>
     </w:p>
-    <w:p>
-      <w:pPr>
-        <w:pStyle w:val="BodyText"/>
+    <w:bookmarkEnd w:id="54"/>
+    <w:bookmarkStart w:id="56" w:name="sec:matched"/>
+    <w:p>
+      <w:pPr>
+        <w:pStyle w:val="Heading2"/>
+      </w:pPr>
+      <w:r>
+        <w:t xml:space="preserve">7.7 Same moment, different frame</w:t>
+      </w:r>
+    </w:p>
+    <w:bookmarkStart w:id="55" w:name="tab:matched"/>
+    <w:p>
+      <w:pPr>
+        <w:pStyle w:val="TableCaption"/>
       </w:pPr>
       <w:r>
         <w:rPr>
           <w:bCs/>
           <w:b/>
         </w:rPr>
-        <w:t xml:space="preserve">[Note:</w:t>
-      </w:r>
-      <w:r>
-        <w:t xml:space="preserve"> </w:t>
+        <w:t xml:space="preserve">Table 11:</w:t>
+      </w:r>
+      <w:r>
+        <w:t xml:space="preserve"> </w:t>
+      </w:r>
+      <w:r>
+        <w:t xml:space="preserve">Same moment, different frame (Experiment B). The probability of an order that goes along, after a fixed</w:t>
+      </w:r>
+      <w:r>
+        <w:t xml:space="preserve"> </w:t>
+      </w:r>
+      <w:r>
+        <w:t xml:space="preserve">neutral reasoning line, for 300 saved decisions (50 careers, six requests). The request’s effect compares versions of</w:t>
+      </w:r>
+      <w:r>
+        <w:t xml:space="preserve"> </w:t>
+      </w:r>
+      <w:r>
+        <w:t xml:space="preserve">the same moment, so the history is identical; the history’s effect compares careers given the same neutral request.</w:t>
+      </w:r>
+      <w:r>
+        <w:t xml:space="preserve"> </w:t>
+      </w:r>
+      <w:r>
+        <w:t xml:space="preserve">Changes in percentage points.</w:t>
+      </w:r>
+    </w:p>
+    <w:tbl>
+      <w:tblPr>
+        <w:tblStyle w:val="Table"/>
+        <w:tblW w:type="pct" w:w="5000"/>
+        <w:tblLook w:firstRow="1" w:lastRow="0" w:firstColumn="0" w:lastColumn="0" w:noHBand="0" w:noVBand="0" w:val="0020"/>
+        <w:jc w:val="start"/>
+        <w:tblCaption w:val="Table 11: Same moment, different frame (Experiment B). The probability of an order that goes along, after a fixed neutral reasoning line, for 300 saved decisions (50 careers, six requests). The request’s effect compares versions of the same moment, so the history is identical; the history’s effect compares careers given the same neutral request. Changes in percentage points."/>
+      </w:tblPr>
+      <w:tblGrid>
+        <w:gridCol w:w="3072"/>
+        <w:gridCol w:w="1116"/>
+        <w:gridCol w:w="2613"/>
+        <w:gridCol w:w="1116"/>
+      </w:tblGrid>
+      <w:tr>
+        <w:trPr>
+          <w:tblHeader w:val="true"/>
+        </w:trPr>
+        <w:tc>
+          <w:tcPr/>
+          <w:p>
+            <w:pPr>
+              <w:pStyle w:val="Compact"/>
+              <w:jc w:val="left"/>
+            </w:pPr>
+            <w:r>
+              <w:rPr>
+                <w:bCs/>
+                <w:b/>
+              </w:rPr>
+              <w:t xml:space="preserve">Contrast</w:t>
+            </w:r>
+          </w:p>
+        </w:tc>
+        <w:tc>
+          <w:tcPr/>
+          <w:p>
+            <w:pPr>
+              <w:pStyle w:val="Compact"/>
+              <w:jc w:val="center"/>
+            </w:pPr>
+            <w:r>
+              <w:rPr>
+                <w:bCs/>
+                <w:b/>
+              </w:rPr>
+              <w:t xml:space="preserve">Change</w:t>
+            </w:r>
+          </w:p>
+        </w:tc>
+        <w:tc>
+          <w:tcPr/>
+          <w:p>
+            <w:pPr>
+              <w:pStyle w:val="Compact"/>
+              <w:jc w:val="center"/>
+            </w:pPr>
+            <w:r>
+              <w:rPr>
+                <w:bCs/>
+                <w:b/>
+              </w:rPr>
+              <w:t xml:space="preserve">95% interval</w:t>
+            </w:r>
+          </w:p>
+        </w:tc>
+        <w:tc>
+          <w:tcPr/>
+          <w:p>
+            <w:pPr>
+              <w:pStyle w:val="Compact"/>
+              <w:jc w:val="center"/>
+            </w:pPr>
+            <w:r>
+              <w:rPr>
+                <w:iCs/>
+                <w:i/>
+                <w:bCs/>
+                <w:b/>
+              </w:rPr>
+              <w:t xml:space="preserve">p</w:t>
+            </w:r>
+          </w:p>
+        </w:tc>
+      </w:tr>
+      <w:tr>
+        <w:tc>
+          <w:tcPr>
+            <w:gridSpan w:val="4"/>
+          </w:tcPr>
+          <w:p>
+            <w:pPr>
+              <w:pStyle w:val="Compact"/>
+              <w:jc w:val="left"/>
+            </w:pPr>
+            <w:r>
+              <w:rPr>
+                <w:iCs/>
+                <w:i/>
+              </w:rPr>
+              <w:t xml:space="preserve">The request alone (history fixed)</w:t>
+            </w:r>
+          </w:p>
+        </w:tc>
+      </w:tr>
+      <w:tr>
+        <w:tc>
+          <w:tcPr/>
+          <w:p>
+            <w:pPr>
+              <w:pStyle w:val="Compact"/>
+              <w:jc w:val="left"/>
+            </w:pPr>
+            <w:r>
+              <w:t xml:space="preserve">Loss vs neutral</w:t>
+            </w:r>
+          </w:p>
+        </w:tc>
+        <w:tc>
+          <w:tcPr/>
+          <w:p>
+            <w:pPr>
+              <w:pStyle w:val="Compact"/>
+              <w:jc w:val="center"/>
+            </w:pPr>
+            <w:r>
+              <w:t xml:space="preserve">+5.6</w:t>
+            </w:r>
+          </w:p>
+        </w:tc>
+        <w:tc>
+          <w:tcPr/>
+          <w:p>
+            <w:pPr>
+              <w:pStyle w:val="Compact"/>
+              <w:jc w:val="center"/>
+            </w:pPr>
+            <w:r>
+              <w:t xml:space="preserve">+3.7 to +7.5</w:t>
+            </w:r>
+          </w:p>
+        </w:tc>
+        <w:tc>
+          <w:tcPr/>
+          <w:p>
+            <w:pPr>
+              <w:pStyle w:val="Compact"/>
+              <w:jc w:val="center"/>
+            </w:pPr>
+            <w:r>
+              <w:t xml:space="preserve">&lt;0.001</w:t>
+            </w:r>
+          </w:p>
+        </w:tc>
+      </w:tr>
+      <w:tr>
+        <w:tc>
+          <w:tcPr/>
+          <w:p>
+            <w:pPr>
+              <w:pStyle w:val="Compact"/>
+              <w:jc w:val="left"/>
+            </w:pPr>
+            <w:r>
+              <w:t xml:space="preserve">Loss + you vs neutral</w:t>
+            </w:r>
+          </w:p>
+        </w:tc>
+        <w:tc>
+          <w:tcPr/>
+          <w:p>
+            <w:pPr>
+              <w:pStyle w:val="Compact"/>
+              <w:jc w:val="center"/>
+            </w:pPr>
+            <w:r>
+              <w:t xml:space="preserve">+6.9</w:t>
+            </w:r>
+          </w:p>
+        </w:tc>
+        <w:tc>
+          <w:tcPr/>
+          <w:p>
+            <w:pPr>
+              <w:pStyle w:val="Compact"/>
+              <w:jc w:val="center"/>
+            </w:pPr>
+            <w:r>
+              <w:t xml:space="preserve">+4.2 to +9.7</w:t>
+            </w:r>
+          </w:p>
+        </w:tc>
+        <w:tc>
+          <w:tcPr/>
+          <w:p>
+            <w:pPr>
+              <w:pStyle w:val="Compact"/>
+              <w:jc w:val="center"/>
+            </w:pPr>
+            <w:r>
+              <w:t xml:space="preserve">&lt;0.001</w:t>
+            </w:r>
+          </w:p>
+        </w:tc>
+      </w:tr>
+      <w:tr>
+        <w:tc>
+          <w:tcPr/>
+          <w:p>
+            <w:pPr>
+              <w:pStyle w:val="Compact"/>
+              <w:jc w:val="left"/>
+            </w:pPr>
+            <w:r>
+              <w:t xml:space="preserve">Gain vs neutral</w:t>
+            </w:r>
+          </w:p>
+        </w:tc>
+        <w:tc>
+          <w:tcPr/>
+          <w:p>
+            <w:pPr>
+              <w:pStyle w:val="Compact"/>
+              <w:jc w:val="center"/>
+            </w:pPr>
+            <w:r>
+              <w:t xml:space="preserve">+3.8</w:t>
+            </w:r>
+          </w:p>
+        </w:tc>
+        <w:tc>
+          <w:tcPr/>
+          <w:p>
+            <w:pPr>
+              <w:pStyle w:val="Compact"/>
+              <w:jc w:val="center"/>
+            </w:pPr>
+            <w:r>
+              <w:t xml:space="preserve">+1.8 to +5.8</w:t>
+            </w:r>
+          </w:p>
+        </w:tc>
+        <w:tc>
+          <w:tcPr/>
+          <w:p>
+            <w:pPr>
+              <w:pStyle w:val="Compact"/>
+              <w:jc w:val="center"/>
+            </w:pPr>
+            <w:r>
+              <w:t xml:space="preserve">0.001</w:t>
+            </w:r>
+          </w:p>
+        </w:tc>
+      </w:tr>
+      <w:tr>
+        <w:tc>
+          <w:tcPr/>
+          <w:p>
+            <w:pPr>
+              <w:pStyle w:val="Compact"/>
+              <w:jc w:val="left"/>
+            </w:pPr>
+            <w:r>
+              <w:t xml:space="preserve">Gain + you vs neutral</w:t>
+            </w:r>
+          </w:p>
+        </w:tc>
+        <w:tc>
+          <w:tcPr/>
+          <w:p>
+            <w:pPr>
+              <w:pStyle w:val="Compact"/>
+              <w:jc w:val="center"/>
+            </w:pPr>
+            <w:r>
+              <w:t xml:space="preserve">+4.6</w:t>
+            </w:r>
+          </w:p>
+        </w:tc>
+        <w:tc>
+          <w:tcPr/>
+          <w:p>
+            <w:pPr>
+              <w:pStyle w:val="Compact"/>
+              <w:jc w:val="center"/>
+            </w:pPr>
+            <w:r>
+              <w:t xml:space="preserve">+2.6 to +6.8</w:t>
+            </w:r>
+          </w:p>
+        </w:tc>
+        <w:tc>
+          <w:tcPr/>
+          <w:p>
+            <w:pPr>
+              <w:pStyle w:val="Compact"/>
+              <w:jc w:val="center"/>
+            </w:pPr>
+            <w:r>
+              <w:t xml:space="preserve">&lt;0.001</w:t>
+            </w:r>
+          </w:p>
+        </w:tc>
+      </w:tr>
+      <w:tr>
+        <w:tc>
+          <w:tcPr/>
+          <w:p>
+            <w:pPr>
+              <w:pStyle w:val="Compact"/>
+              <w:jc w:val="left"/>
+            </w:pPr>
+            <w:r>
+              <w:t xml:space="preserve">Loss vs gain</w:t>
+            </w:r>
+          </w:p>
+        </w:tc>
+        <w:tc>
+          <w:tcPr/>
+          <w:p>
+            <w:pPr>
+              <w:pStyle w:val="Compact"/>
+              <w:jc w:val="center"/>
+            </w:pPr>
+            <w:r>
+              <w:t xml:space="preserve">+2.0</w:t>
+            </w:r>
+          </w:p>
+        </w:tc>
+        <w:tc>
+          <w:tcPr/>
+          <w:p>
+            <w:pPr>
+              <w:pStyle w:val="Compact"/>
+              <w:jc w:val="center"/>
+            </w:pPr>
+            <w:r>
+              <w:t xml:space="preserve">+1.0 to +3.1</w:t>
+            </w:r>
+          </w:p>
+        </w:tc>
+        <w:tc>
+          <w:tcPr/>
+          <w:p>
+            <w:pPr>
+              <w:pStyle w:val="Compact"/>
+              <w:jc w:val="center"/>
+            </w:pPr>
+            <w:r>
+              <w:t xml:space="preserve">&lt;0.001</w:t>
+            </w:r>
+          </w:p>
+        </w:tc>
+      </w:tr>
+      <w:tr>
+        <w:tc>
+          <w:tcPr/>
+          <w:p>
+            <w:pPr>
+              <w:pStyle w:val="Compact"/>
+              <w:jc w:val="left"/>
+            </w:pPr>
+            <w:r>
+              <w:t xml:space="preserve">“</w:t>
+            </w:r>
+            <w:r>
+              <w:t xml:space="preserve">You</w:t>
+            </w:r>
+            <w:r>
+              <w:t xml:space="preserve">”</w:t>
+            </w:r>
+            <w:r>
+              <w:t xml:space="preserve"> </w:t>
+            </w:r>
+            <w:r>
+              <w:t xml:space="preserve">vs none</w:t>
+            </w:r>
+          </w:p>
+        </w:tc>
+        <w:tc>
+          <w:tcPr/>
+          <w:p>
+            <w:pPr>
+              <w:pStyle w:val="Compact"/>
+              <w:jc w:val="center"/>
+            </w:pPr>
+            <w:r>
+              <w:t xml:space="preserve">+1.1</w:t>
+            </w:r>
+          </w:p>
+        </w:tc>
+        <w:tc>
+          <w:tcPr/>
+          <w:p>
+            <w:pPr>
+              <w:pStyle w:val="Compact"/>
+              <w:jc w:val="center"/>
+            </w:pPr>
+            <w:r>
+              <w:t xml:space="preserve">−0.4 to +2.6</w:t>
+            </w:r>
+          </w:p>
+        </w:tc>
+        <w:tc>
+          <w:tcPr/>
+          <w:p>
+            <w:pPr>
+              <w:pStyle w:val="Compact"/>
+              <w:jc w:val="center"/>
+            </w:pPr>
+            <w:r>
+              <w:t xml:space="preserve">0.16</w:t>
+            </w:r>
+          </w:p>
+        </w:tc>
+      </w:tr>
+      <w:tr>
+        <w:tc>
+          <w:tcPr/>
+          <w:p>
+            <w:pPr>
+              <w:pStyle w:val="Compact"/>
+              <w:jc w:val="left"/>
+            </w:pPr>
+            <w:r>
+              <w:t xml:space="preserve">Bank C’s line</w:t>
+            </w:r>
+          </w:p>
+        </w:tc>
+        <w:tc>
+          <w:tcPr/>
+          <w:p>
+            <w:pPr>
+              <w:pStyle w:val="Compact"/>
+              <w:jc w:val="center"/>
+            </w:pPr>
+            <w:r>
+              <w:t xml:space="preserve">+4.0</w:t>
+            </w:r>
+          </w:p>
+        </w:tc>
+        <w:tc>
+          <w:tcPr/>
+          <w:p>
+            <w:pPr>
+              <w:pStyle w:val="Compact"/>
+              <w:jc w:val="center"/>
+            </w:pPr>
+            <w:r>
+              <w:t xml:space="preserve">+2.7 to +5.3</w:t>
+            </w:r>
+          </w:p>
+        </w:tc>
+        <w:tc>
+          <w:tcPr/>
+          <w:p>
+            <w:pPr>
+              <w:pStyle w:val="Compact"/>
+              <w:jc w:val="center"/>
+            </w:pPr>
+            <w:r>
+              <w:t xml:space="preserve">&lt;0.001</w:t>
+            </w:r>
+          </w:p>
+        </w:tc>
+      </w:tr>
+      <w:tr>
+        <w:tc>
+          <w:tcPr/>
+          <w:p>
+            <w:pPr>
+              <w:pStyle w:val="Compact"/>
+              <w:jc w:val="left"/>
+            </w:pPr>
+            <w:r>
+              <w:t xml:space="preserve">“</w:t>
+            </w:r>
+            <w:r>
+              <w:t xml:space="preserve">You</w:t>
+            </w:r>
+            <w:r>
+              <w:t xml:space="preserve">”</w:t>
+            </w:r>
+            <w:r>
+              <w:t xml:space="preserve"> </w:t>
+            </w:r>
+            <w:r>
+              <w:t xml:space="preserve">after loss, with Bank C</w:t>
+            </w:r>
+          </w:p>
+        </w:tc>
+        <w:tc>
+          <w:tcPr/>
+          <w:p>
+            <w:pPr>
+              <w:pStyle w:val="Compact"/>
+              <w:jc w:val="center"/>
+            </w:pPr>
+            <w:r>
+              <w:t xml:space="preserve">+4.1</w:t>
+            </w:r>
+          </w:p>
+        </w:tc>
+        <w:tc>
+          <w:tcPr/>
+          <w:p>
+            <w:pPr>
+              <w:pStyle w:val="Compact"/>
+              <w:jc w:val="center"/>
+            </w:pPr>
+            <w:r>
+              <w:t xml:space="preserve">+2.3 to +5.9</w:t>
+            </w:r>
+          </w:p>
+        </w:tc>
+        <w:tc>
+          <w:tcPr/>
+          <w:p>
+            <w:pPr>
+              <w:pStyle w:val="Compact"/>
+              <w:jc w:val="center"/>
+            </w:pPr>
+            <w:r>
+              <w:t xml:space="preserve">&lt;0.001</w:t>
+            </w:r>
+          </w:p>
+        </w:tc>
+      </w:tr>
+      <w:tr>
+        <w:tc>
+          <w:tcPr/>
+          <w:p>
+            <w:pPr>
+              <w:pStyle w:val="Compact"/>
+              <w:jc w:val="left"/>
+            </w:pPr>
+            <w:r>
+              <w:t xml:space="preserve">“</w:t>
+            </w:r>
+            <w:r>
+              <w:t xml:space="preserve">You</w:t>
+            </w:r>
+            <w:r>
+              <w:t xml:space="preserve">”</w:t>
+            </w:r>
+            <w:r>
+              <w:t xml:space="preserve"> </w:t>
+            </w:r>
+            <w:r>
+              <w:t xml:space="preserve">after gain, with Bank C</w:t>
+            </w:r>
+          </w:p>
+        </w:tc>
+        <w:tc>
+          <w:tcPr/>
+          <w:p>
+            <w:pPr>
+              <w:pStyle w:val="Compact"/>
+              <w:jc w:val="center"/>
+            </w:pPr>
+            <w:r>
+              <w:t xml:space="preserve">+2.2</w:t>
+            </w:r>
+          </w:p>
+        </w:tc>
+        <w:tc>
+          <w:tcPr/>
+          <w:p>
+            <w:pPr>
+              <w:pStyle w:val="Compact"/>
+              <w:jc w:val="center"/>
+            </w:pPr>
+            <w:r>
+              <w:t xml:space="preserve">+0.8 to +3.7</w:t>
+            </w:r>
+          </w:p>
+        </w:tc>
+        <w:tc>
+          <w:tcPr/>
+          <w:p>
+            <w:pPr>
+              <w:pStyle w:val="Compact"/>
+              <w:jc w:val="center"/>
+            </w:pPr>
+            <w:r>
+              <w:t xml:space="preserve">0.002</w:t>
+            </w:r>
+          </w:p>
+        </w:tc>
+      </w:tr>
+      <w:tr>
+        <w:tc>
+          <w:tcPr>
+            <w:gridSpan w:val="4"/>
+          </w:tcPr>
+          <w:p>
+            <w:pPr>
+              <w:pStyle w:val="Compact"/>
+              <w:jc w:val="left"/>
+            </w:pPr>
+            <w:r>
+              <w:rPr>
+                <w:iCs/>
+                <w:i/>
+              </w:rPr>
+              <w:t xml:space="preserve">The history (request held neutral)</w:t>
+            </w:r>
+          </w:p>
+        </w:tc>
+      </w:tr>
+      <w:tr>
+        <w:tc>
+          <w:tcPr/>
+          <w:p>
+            <w:pPr>
+              <w:pStyle w:val="Compact"/>
+              <w:jc w:val="left"/>
+            </w:pPr>
+            <w:r>
+              <w:t xml:space="preserve">Framed vs neutral history</w:t>
+            </w:r>
+          </w:p>
+        </w:tc>
+        <w:tc>
+          <w:tcPr/>
+          <w:p>
+            <w:pPr>
+              <w:pStyle w:val="Compact"/>
+              <w:jc w:val="center"/>
+            </w:pPr>
+            <w:r>
+              <w:t xml:space="preserve">+18.5</w:t>
+            </w:r>
+          </w:p>
+        </w:tc>
+        <w:tc>
+          <w:tcPr/>
+          <w:p>
+            <w:pPr>
+              <w:pStyle w:val="Compact"/>
+              <w:jc w:val="center"/>
+            </w:pPr>
+            <w:r>
+              <w:t xml:space="preserve">+10.6 to +26.1</w:t>
+            </w:r>
+          </w:p>
+        </w:tc>
+        <w:tc>
+          <w:tcPr/>
+          <w:p>
+            <w:pPr>
+              <w:pStyle w:val="Compact"/>
+              <w:jc w:val="center"/>
+            </w:pPr>
+            <w:r>
+              <w:t xml:space="preserve">0.001</w:t>
+            </w:r>
+          </w:p>
+        </w:tc>
+      </w:tr>
+      <w:tr>
+        <w:tc>
+          <w:tcPr/>
+          <w:p>
+            <w:pPr>
+              <w:pStyle w:val="Compact"/>
+              <w:jc w:val="left"/>
+            </w:pPr>
+            <w:r>
+              <w:t xml:space="preserve">Loss vs gain history</w:t>
+            </w:r>
+          </w:p>
+        </w:tc>
+        <w:tc>
+          <w:tcPr/>
+          <w:p>
+            <w:pPr>
+              <w:pStyle w:val="Compact"/>
+              <w:jc w:val="center"/>
+            </w:pPr>
+            <w:r>
+              <w:t xml:space="preserve">+5.4</w:t>
+            </w:r>
+          </w:p>
+        </w:tc>
+        <w:tc>
+          <w:tcPr/>
+          <w:p>
+            <w:pPr>
+              <w:pStyle w:val="Compact"/>
+              <w:jc w:val="center"/>
+            </w:pPr>
+            <w:r>
+              <w:t xml:space="preserve">−3.7 to +15.2</w:t>
+            </w:r>
+          </w:p>
+        </w:tc>
+        <w:tc>
+          <w:tcPr/>
+          <w:p>
+            <w:pPr>
+              <w:pStyle w:val="Compact"/>
+              <w:jc w:val="center"/>
+            </w:pPr>
+            <w:r>
+              <w:t xml:space="preserve">0.30</w:t>
+            </w:r>
+          </w:p>
+        </w:tc>
+      </w:tr>
+      <w:tr>
+        <w:tc>
+          <w:tcPr>
+            <w:gridSpan w:val="4"/>
+          </w:tcPr>
+          <w:p>
+            <w:pPr>
+              <w:pStyle w:val="Compact"/>
+              <w:jc w:val="left"/>
+            </w:pPr>
+            <w:r>
+              <w:rPr>
+                <w:iCs/>
+                <w:i/>
+              </w:rPr>
+              <w:t xml:space="preserve">History and request together (as saved)</w:t>
+            </w:r>
+          </w:p>
+        </w:tc>
+      </w:tr>
+      <w:tr>
+        <w:tc>
+          <w:tcPr/>
+          <w:p>
+            <w:pPr>
+              <w:pStyle w:val="Compact"/>
+              <w:jc w:val="left"/>
+            </w:pPr>
+            <w:r>
+              <w:t xml:space="preserve">Framed vs neutral</w:t>
+            </w:r>
+          </w:p>
+        </w:tc>
+        <w:tc>
+          <w:tcPr/>
+          <w:p>
+            <w:pPr>
+              <w:pStyle w:val="Compact"/>
+              <w:jc w:val="center"/>
+            </w:pPr>
+            <w:r>
+              <w:t xml:space="preserve">+23.3</w:t>
+            </w:r>
+          </w:p>
+        </w:tc>
+        <w:tc>
+          <w:tcPr/>
+          <w:p>
+            <w:pPr>
+              <w:pStyle w:val="Compact"/>
+              <w:jc w:val="center"/>
+            </w:pPr>
+            <w:r>
+              <w:t xml:space="preserve">+15.0 to +31.4</w:t>
+            </w:r>
+          </w:p>
+        </w:tc>
+        <w:tc>
+          <w:tcPr/>
+          <w:p>
+            <w:pPr>
+              <w:pStyle w:val="Compact"/>
+              <w:jc w:val="center"/>
+            </w:pPr>
+            <w:r>
+              <w:t xml:space="preserve">&lt;0.001</w:t>
+            </w:r>
+          </w:p>
+        </w:tc>
+      </w:tr>
+      <w:tr>
+        <w:tc>
+          <w:tcPr/>
+          <w:p>
+            <w:pPr>
+              <w:pStyle w:val="Compact"/>
+              <w:jc w:val="left"/>
+            </w:pPr>
+            <w:r>
+              <w:t xml:space="preserve">Loss vs gain</w:t>
+            </w:r>
+          </w:p>
+        </w:tc>
+        <w:tc>
+          <w:tcPr/>
+          <w:p>
+            <w:pPr>
+              <w:pStyle w:val="Compact"/>
+              <w:jc w:val="center"/>
+            </w:pPr>
+            <w:r>
+              <w:t xml:space="preserve">+7.0</w:t>
+            </w:r>
+          </w:p>
+        </w:tc>
+        <w:tc>
+          <w:tcPr/>
+          <w:p>
+            <w:pPr>
+              <w:pStyle w:val="Compact"/>
+              <w:jc w:val="center"/>
+            </w:pPr>
+            <w:r>
+              <w:t xml:space="preserve">−2.4 to +17.1</w:t>
+            </w:r>
+          </w:p>
+        </w:tc>
+        <w:tc>
+          <w:tcPr/>
+          <w:p>
+            <w:pPr>
+              <w:pStyle w:val="Compact"/>
+              <w:jc w:val="center"/>
+            </w:pPr>
+            <w:r>
+              <w:t xml:space="preserve">0.18</w:t>
+            </w:r>
+          </w:p>
+        </w:tc>
+      </w:tr>
+    </w:tbl>
+    <w:bookmarkEnd w:id="55"/>
+    <w:p>
+      <w:pPr>
+        <w:pStyle w:val="BodyText"/>
+      </w:pPr>
+      <w:r>
+        <w:rPr>
+          <w:bCs/>
+          <w:b/>
+        </w:rPr>
+        <w:t xml:space="preserve">The framing works mostly through the history it builds.</w:t>
+      </w:r>
+      <w:r>
+        <w:t xml:space="preserve"> </w:t>
+      </w:r>
+      <w:r>
+        <w:t xml:space="preserve">Swapping only UBS’s current request moved the</w:t>
+      </w:r>
+      <w:r>
+        <w:t xml:space="preserve"> </w:t>
+      </w:r>
+      <w:r>
+        <w:t xml:space="preserve">probability of an order that goes along by a few points (Table 11): loss framing by 5.6 points over the</w:t>
+      </w:r>
+      <w:r>
+        <w:t xml:space="preserve"> </w:t>
+      </w:r>
+      <w:r>
+        <w:t xml:space="preserve">neutral request and loss + you by 6.9, gain by 3.8 and gain + you by 4.6, all with intervals above zero; loss exceeded</w:t>
+      </w:r>
+      <w:r>
+        <w:t xml:space="preserve"> </w:t>
+      </w:r>
+      <w:r>
+        <w:t xml:space="preserve">gain by 2.0 points. Holding the request neutral and comparing careers instead, framed histories raised the same</w:t>
+      </w:r>
+      <w:r>
+        <w:t xml:space="preserve"> </w:t>
+      </w:r>
+      <w:r>
+        <w:t xml:space="preserve">probability by 18.5 points over neutral ones (</w:t>
       </w:r>
       <w:r>
         <w:rPr>
           <w:iCs/>
           <w:i/>
         </w:rPr>
-        <w:t xml:space="preserve">To be completed when the matched-history and transplant runs are in: (i) the framing’s immediate effect on</w:t>
+        <w:t xml:space="preserve">p</w:t>
+      </w:r>
+      <w:r>
+        <w:t xml:space="preserve"> </w:t>
+      </w:r>
+      <w:r>
+        <w:t xml:space="preserve">= 0.001), against 23.3 points for history and request together. About</w:t>
+      </w:r>
+      <w:r>
+        <w:t xml:space="preserve"> </w:t>
+      </w:r>
+      <w:r>
+        <w:t xml:space="preserve">four-fifths of the framing’s effect on the decision is therefore carried by the history: UBS’s earlier framed lines and</w:t>
+      </w:r>
+      <w:r>
+        <w:t xml:space="preserve"> </w:t>
+      </w:r>
+      <w:r>
+        <w:t xml:space="preserve">the agent’s own replies and trades that followed them, which this reread does not separate. The probability is read after</w:t>
+      </w:r>
+      <w:r>
+        <w:t xml:space="preserve"> </w:t>
+      </w:r>
+      <w:r>
+        <w:t xml:space="preserve">a fixed neutral reasoning line, so its levels (14% for a neutral career and request) differ from the sampled rates, and</w:t>
+      </w:r>
+      <w:r>
+        <w:t xml:space="preserve"> </w:t>
+      </w:r>
+      <w:r>
+        <w:t xml:space="preserve">the orders scored cover a median of 67% of the model’s probability; the comparisons are what it measures. The rereads</w:t>
+      </w:r>
+      <w:r>
+        <w:t xml:space="preserve"> </w:t>
+      </w:r>
+      <w:r>
+        <w:t xml:space="preserve">reproduce the original states exactly (median cosine 1.000 at every layer).</w:t>
+      </w:r>
+    </w:p>
+    <w:p>
+      <w:pPr>
+        <w:pStyle w:val="BodyText"/>
+      </w:pPr>
+      <w:r>
+        <w:rPr>
+          <w:bCs/>
+          <w:b/>
+        </w:rPr>
+        <w:t xml:space="preserve">“</w:t>
+      </w:r>
+      <w:r>
+        <w:rPr>
+          <w:bCs/>
+          <w:b/>
+        </w:rPr>
+        <w:t xml:space="preserve">You</w:t>
+      </w:r>
+      <w:r>
+        <w:rPr>
+          <w:bCs/>
+          <w:b/>
+        </w:rPr>
+        <w:t xml:space="preserve">”</w:t>
+      </w:r>
+      <w:r>
+        <w:rPr>
+          <w:bCs/>
+          <w:b/>
+        </w:rPr>
+        <w:t xml:space="preserve"> </w:t>
+      </w:r>
+      <w:r>
+        <w:rPr>
+          <w:bCs/>
+          <w:b/>
+        </w:rPr>
+        <w:t xml:space="preserve">registers differently after loss than after gain.</w:t>
+      </w:r>
+      <w:r>
+        <w:t xml:space="preserve"> </w:t>
+      </w:r>
+      <w:r>
+        <w:t xml:space="preserve">With the history fixed,</w:t>
+      </w:r>
+      <w:r>
+        <w:t xml:space="preserve"> </w:t>
+      </w:r>
+      <w:r>
+        <w:t xml:space="preserve">“</w:t>
+      </w:r>
+      <w:r>
+        <w:t xml:space="preserve">you</w:t>
+      </w:r>
+      <w:r>
+        <w:t xml:space="preserve">”</w:t>
+      </w:r>
+      <w:r>
+        <w:t xml:space="preserve"> </w:t>
+      </w:r>
+      <w:r>
+        <w:t xml:space="preserve">alone did not move</w:t>
+      </w:r>
+      <w:r>
+        <w:t xml:space="preserve"> </w:t>
+      </w:r>
+      <w:r>
+        <w:t xml:space="preserve">the decision (+1.1 points,</w:t>
+      </w:r>
+      <w:r>
+        <w:t xml:space="preserve"> </w:t>
       </w:r>
       <w:r>
         <w:rPr>
           <w:iCs/>
           <w:i/>
         </w:rPr>
+        <w:t xml:space="preserve">p</w:t>
+      </w:r>
+      <w:r>
+        <w:t xml:space="preserve"> </w:t>
+      </w:r>
+      <w:r>
+        <w:t xml:space="preserve">= 0.16), but with Bank C’s line it added 4.1 points after loss and 2.2 after gain, as in</w:t>
+      </w:r>
+      <w:r>
+        <w:t xml:space="preserve"> </w:t>
+      </w:r>
+      <w:r>
+        <w:t xml:space="preserve">Experiment F. Inside, the change</w:t>
+      </w:r>
+      <w:r>
+        <w:t xml:space="preserve"> </w:t>
+      </w:r>
+      <w:r>
+        <w:t xml:space="preserve">“</w:t>
+      </w:r>
+      <w:r>
+        <w:t xml:space="preserve">you</w:t>
+      </w:r>
+      <w:r>
+        <w:t xml:space="preserve">”</w:t>
+      </w:r>
+      <w:r>
+        <w:t xml:space="preserve"> </w:t>
+      </w:r>
+      <w:r>
+        <w:t xml:space="preserve">makes to the state is 27% to 39% larger after loss than after gain at layers 18</w:t>
+      </w:r>
+      <w:r>
+        <w:t xml:space="preserve"> </w:t>
+      </w:r>
+      <w:r>
+        <w:t xml:space="preserve">and 31 to 47, and the two changes are alike but not the same: their cosine is 0.71 to 0.92 at layers 12 to 47, against</w:t>
+      </w:r>
+      <w:r>
+        <w:t xml:space="preserve"> </w:t>
+      </w:r>
+      <w:r>
+        <w:t xml:space="preserve">0.98 to 1.00 for the change after loss compared with itself on two halves of the careers. Management’s</w:t>
+      </w:r>
+      <w:r>
+        <w:t xml:space="preserve"> </w:t>
+      </w:r>
+      <w:r>
+        <w:t xml:space="preserve">“</w:t>
+      </w:r>
+      <w:r>
+        <w:t xml:space="preserve">you</w:t>
+      </w:r>
+      <w:r>
+        <w:t xml:space="preserve">”</w:t>
+      </w:r>
+      <w:r>
+        <w:t xml:space="preserve"> </w:t>
+      </w:r>
+      <w:r>
+        <w:t xml:space="preserve">shows the</w:t>
+      </w:r>
+      <w:r>
+        <w:t xml:space="preserve"> </w:t>
+      </w:r>
+      <w:r>
+        <w:t xml:space="preserve">same pattern in late layers (0.67 to 0.79 at layers 31 to 47, against 0.97 to 0.99). Because the loss + you and gain +</w:t>
+      </w:r>
+      <w:r>
+        <w:t xml:space="preserve"> </w:t>
+      </w:r>
+      <w:r>
+        <w:t xml:space="preserve">you lines are written separately, part of this difference may lie in their words.</w:t>
+      </w:r>
+    </w:p>
+    <w:p>
+      <w:pPr>
+        <w:pStyle w:val="BodyText"/>
+      </w:pPr>
+      <w:r>
+        <w:rPr>
+          <w:bCs/>
+          <w:b/>
+        </w:rPr>
+        <w:t xml:space="preserve">A second bank’s endorsement moves the state along the loss direction.</w:t>
+      </w:r>
+      <w:r>
+        <w:t xml:space="preserve"> </w:t>
+      </w:r>
+      <w:r>
+        <w:t xml:space="preserve">With the history fixed, Bank C’s line</w:t>
+      </w:r>
+      <w:r>
+        <w:t xml:space="preserve"> </w:t>
+      </w:r>
+      <w:r>
+        <w:t xml:space="preserve">moves the state along the loss-frame direction about as far as the loss frame itself at layer 12 (0.91 of the</w:t>
+      </w:r>
+      <w:r>
+        <w:t xml:space="preserve"> </w:t>
+      </w:r>
+      <w:r>
+        <w:t xml:space="preserve">loss–neutral gap) and about twice as far at layer 24 (1.95). Inside, a second bank’s endorsement and a loss frame push the</w:t>
+      </w:r>
+      <w:r>
+        <w:t xml:space="preserve"> </w:t>
+      </w:r>
+      <w:r>
+        <w:t xml:space="preserve">state the same way at these layers.</w:t>
+      </w:r>
+    </w:p>
+    <w:p>
+      <w:pPr>
+        <w:pStyle w:val="BodyText"/>
+      </w:pPr>
+      <w:r>
+        <w:rPr>
+          <w:bCs/>
+          <w:b/>
+        </w:rPr>
+        <w:t xml:space="preserve">Management’s priming, everything else held fixed.</w:t>
+      </w:r>
+      <w:r>
+        <w:t xml:space="preserve"> </w:t>
+      </w:r>
+      <w:r>
+        <w:t xml:space="preserve">In A’s careers, swapping in management’s memo and books</w:t>
+      </w:r>
+      <w:r>
+        <w:t xml:space="preserve"> </w:t>
+      </w:r>
+      <w:r>
+        <w:t xml:space="preserve">raised the expected size of the agent’s first order of the day by 50,000 ounces under loss and 32,000 under gain (loss</w:t>
+      </w:r>
+      <w:r>
+        <w:t xml:space="preserve"> </w:t>
+      </w:r>
+      <w:r>
+        <w:t xml:space="preserve">above gain by 16,000; all</w:t>
+      </w:r>
+      <w:r>
         <w:t xml:space="preserve"> </w:t>
       </w:r>
       <w:r>
@@ -11396,147 +12608,187 @@
           <w:iCs/>
           <w:i/>
         </w:rPr>
-        <w:t xml:space="preserve">the decision and the state at fixed history, for every significant behavioral effect (loss, loss + you, gain + you, and</w:t>
+        <w:t xml:space="preserve">p</w:t>
+      </w:r>
+      <w:r>
+        <w:t xml:space="preserve"> </w:t>
+      </w:r>
+      <w:r>
+        <w:t xml:space="preserve">&lt; 0.001), and placing the outcome on the agent lowered it, by 11,600 ounces after loss and</w:t>
+      </w:r>
+      <w:r>
+        <w:t xml:space="preserve"> </w:t>
+      </w:r>
+      <w:r>
+        <w:t xml:space="preserve">8,200 after gain. The priming did not change the probability of going along at UBS’s requests (every change within half a</w:t>
+      </w:r>
+      <w:r>
+        <w:t xml:space="preserve"> </w:t>
+      </w:r>
+      <w:r>
+        <w:t xml:space="preserve">point, none significant). Here too the history carried more: with the memo held neutral, careers that had run under the</w:t>
+      </w:r>
+      <w:r>
+        <w:t xml:space="preserve"> </w:t>
+      </w:r>
+      <w:r>
+        <w:t xml:space="preserve">loss memo would order 125,000 ounces more than neutral careers, and were less likely to go along (by 14 and 16 points for</w:t>
+      </w:r>
+      <w:r>
+        <w:t xml:space="preserve"> </w:t>
+      </w:r>
+      <w:r>
+        <w:t xml:space="preserve">loss and gain histories; five careers per version, so these intervals are rough). The predicted order sizes rank the five</w:t>
+      </w:r>
+      <w:r>
+        <w:t xml:space="preserve"> </w:t>
+      </w:r>
+      <w:r>
+        <w:t xml:space="preserve">versions in the same order as the real careers’ trading before the first chat. Inside, management’s loss direction</w:t>
+      </w:r>
+      <w:r>
+        <w:t xml:space="preserve"> </w:t>
+      </w:r>
+      <w:r>
+        <w:t xml:space="preserve">matches UBS’s at layer 12 (cosine 0.72, against 0.88 between two halves of the careers) and departs from it from layer 31</w:t>
+      </w:r>
+      <w:r>
+        <w:t xml:space="preserve"> </w:t>
+      </w:r>
+      <w:r>
+        <w:t xml:space="preserve">on (−0.56 at layer 47): the two sources register alike early and lead to different behavior.</w:t>
+      </w:r>
+    </w:p>
+    <w:p>
+      <w:pPr>
+        <w:pStyle w:val="BodyText"/>
+      </w:pPr>
+      <w:r>
+        <w:rPr>
+          <w:bCs/>
+          <w:b/>
+        </w:rPr>
+        <w:t xml:space="preserve">Why the first steering test missed.</w:t>
+      </w:r>
+      <w:r>
+        <w:t xml:space="preserve"> </w:t>
+      </w:r>
+      <w:r>
+        <w:t xml:space="preserve">At layer 24, where the first steering test pushed, the frame direction</w:t>
+      </w:r>
+      <w:r>
+        <w:t xml:space="preserve"> </w:t>
+      </w:r>
+      <w:r>
+        <w:t xml:space="preserve">measured across careers points away from the direction the request itself produces with the history fixed (cosine</w:t>
+      </w:r>
+      <w:r>
+        <w:t xml:space="preserve"> </w:t>
+      </w:r>
+      <w:r>
+        <w:t xml:space="preserve">−0.29); the two agree at layer 12 (0.98) and largely at layer 18 (0.82). The direction used in that test mostly carried</w:t>
+      </w:r>
+      <w:r>
+        <w:t xml:space="preserve"> </w:t>
+      </w:r>
+      <w:r>
+        <w:t xml:space="preserve">differences in history rather than the request’s framing, which may explain its null result. The second steering test</w:t>
+      </w:r>
+      <w:r>
+        <w:t xml:space="preserve"> </w:t>
+      </w:r>
+      <w:r>
+        <w:t xml:space="preserve">uses the direction measured with the history fixed.</w:t>
+      </w:r>
+    </w:p>
+    <w:p>
+      <w:pPr>
+        <w:pStyle w:val="BodyText"/>
+      </w:pPr>
+      <w:r>
+        <w:rPr>
+          <w:bCs/>
+          <w:b/>
+        </w:rPr>
+        <w:t xml:space="preserve">[Note:</w:t>
+      </w:r>
+      <w:r>
+        <w:t xml:space="preserve"> </w:t>
       </w:r>
       <w:r>
         <w:rPr>
           <w:iCs/>
           <w:i/>
         </w:rPr>
-        <w:t xml:space="preserve"> </w:t>
+        <w:t xml:space="preserve">To be completed when the transplant and the second steering run are in: the transplant of the framed state</w:t>
       </w:r>
       <w:r>
         <w:rPr>
           <w:iCs/>
           <w:i/>
         </w:rPr>
-        <w:t xml:space="preserve">Bank C’s line); (ii) the history’s effect with the request held neutral; (iii)</w:t>
+        <w:t xml:space="preserve"> </w:t>
       </w:r>
       <w:r>
         <w:rPr>
           <w:iCs/>
           <w:i/>
         </w:rPr>
-        <w:t xml:space="preserve"> </w:t>
+        <w:t xml:space="preserve">into the neutral read, layer by layer, for each significant effect; and steering along the held-fixed direction at its</w:t>
       </w:r>
       <w:r>
         <w:rPr>
           <w:iCs/>
           <w:i/>
         </w:rPr>
-        <w:t xml:space="preserve">“</w:t>
+        <w:t xml:space="preserve"> </w:t>
       </w:r>
       <w:r>
         <w:rPr>
           <w:iCs/>
           <w:i/>
         </w:rPr>
-        <w:t xml:space="preserve">you</w:t>
+        <w:t xml:space="preserve">natural size, both signs, against ten random directions.</w:t>
+      </w:r>
+      <w:r>
+        <w:rPr>
+          <w:bCs/>
+          <w:b/>
+        </w:rPr>
+        <w:t xml:space="preserve">]</w:t>
+      </w:r>
+    </w:p>
+    <w:bookmarkEnd w:id="56"/>
+    <w:bookmarkEnd w:id="57"/>
+    <w:bookmarkStart w:id="58" w:name="sec:discussion"/>
+    <w:p>
+      <w:pPr>
+        <w:pStyle w:val="Heading1"/>
+      </w:pPr>
+      <w:r>
+        <w:t xml:space="preserve">8 Discussion</w:t>
+      </w:r>
+    </w:p>
+    <w:p>
+      <w:pPr>
+        <w:pStyle w:val="FirstParagraph"/>
+      </w:pPr>
+      <w:r>
+        <w:rPr>
+          <w:bCs/>
+          <w:b/>
+        </w:rPr>
+        <w:t xml:space="preserve">[Note:</w:t>
+      </w:r>
+      <w:r>
+        <w:t xml:space="preserve"> </w:t>
       </w:r>
       <w:r>
         <w:rPr>
           <w:iCs/>
           <w:i/>
         </w:rPr>
-        <w:t xml:space="preserve">”</w:t>
-      </w:r>
-      <w:r>
-        <w:rPr>
-          <w:iCs/>
-          <w:i/>
-        </w:rPr>
-        <w:t xml:space="preserve"> </w:t>
-      </w:r>
-      <w:r>
-        <w:rPr>
-          <w:iCs/>
-          <w:i/>
-        </w:rPr>
-        <w:t xml:space="preserve">after loss against</w:t>
-      </w:r>
-      <w:r>
-        <w:rPr>
-          <w:iCs/>
-          <w:i/>
-        </w:rPr>
-        <w:t xml:space="preserve"> </w:t>
-      </w:r>
-      <w:r>
-        <w:rPr>
-          <w:iCs/>
-          <w:i/>
-        </w:rPr>
-        <w:t xml:space="preserve">“</w:t>
-      </w:r>
-      <w:r>
-        <w:rPr>
-          <w:iCs/>
-          <w:i/>
-        </w:rPr>
-        <w:t xml:space="preserve">you</w:t>
-      </w:r>
-      <w:r>
-        <w:rPr>
-          <w:iCs/>
-          <w:i/>
-        </w:rPr>
-        <w:t xml:space="preserve">”</w:t>
-      </w:r>
-      <w:r>
-        <w:rPr>
-          <w:iCs/>
-          <w:i/>
-        </w:rPr>
-        <w:t xml:space="preserve"> </w:t>
-      </w:r>
-      <w:r>
-        <w:rPr>
-          <w:iCs/>
-          <w:i/>
-        </w:rPr>
-        <w:t xml:space="preserve">after</w:t>
-      </w:r>
-      <w:r>
-        <w:rPr>
-          <w:iCs/>
-          <w:i/>
-        </w:rPr>
-        <w:t xml:space="preserve"> </w:t>
-      </w:r>
-      <w:r>
-        <w:rPr>
-          <w:iCs/>
-          <w:i/>
-        </w:rPr>
-        <w:t xml:space="preserve">gain; (iv) management’s priming at fixed history, and whether management’s loss and UBS’s loss share a direction; (v)</w:t>
-      </w:r>
-      <w:r>
-        <w:rPr>
-          <w:iCs/>
-          <w:i/>
-        </w:rPr>
-        <w:t xml:space="preserve"> </w:t>
-      </w:r>
-      <w:r>
-        <w:rPr>
-          <w:iCs/>
-          <w:i/>
-        </w:rPr>
-        <w:t xml:space="preserve">the transplant, layer by layer; (vi) a second steering test with the matched direction at its natural size, against ten</w:t>
-      </w:r>
-      <w:r>
-        <w:rPr>
-          <w:iCs/>
-          <w:i/>
-        </w:rPr>
-        <w:t xml:space="preserve"> </w:t>
-      </w:r>
-      <w:r>
-        <w:rPr>
-          <w:iCs/>
-          <w:i/>
-        </w:rPr>
-        <w:t xml:space="preserve">random directions.</w:t>
+        <w:t xml:space="preserve">A first draft of the discussion. To be revised once the remaining results are in.</w:t>
       </w:r>
       <w:r>
         <w:rPr>
@@ -11546,44 +12798,133 @@
         <w:t xml:space="preserve">]</w:t>
       </w:r>
     </w:p>
-    <w:bookmarkEnd w:id="54"/>
-    <w:bookmarkEnd w:id="55"/>
-    <w:bookmarkStart w:id="56" w:name="sec:discussion"/>
-    <w:p>
-      <w:pPr>
-        <w:pStyle w:val="Heading1"/>
-      </w:pPr>
-      <w:r>
-        <w:t xml:space="preserve">8 Discussion</w:t>
-      </w:r>
-    </w:p>
-    <w:p>
-      <w:pPr>
-        <w:pStyle w:val="FirstParagraph"/>
+    <w:p>
+      <w:pPr>
+        <w:pStyle w:val="BodyText"/>
       </w:pPr>
       <w:r>
         <w:rPr>
           <w:bCs/>
           <w:b/>
         </w:rPr>
-        <w:t xml:space="preserve">[Note:</w:t>
-      </w:r>
-      <w:r>
-        <w:t xml:space="preserve"> </w:t>
-      </w:r>
-      <w:r>
-        <w:rPr>
-          <w:iCs/>
-          <w:i/>
-        </w:rPr>
-        <w:t xml:space="preserve">A first draft of the discussion. To be revised once the remaining results are in.</w:t>
-      </w:r>
+        <w:t xml:space="preserve">Behavioral levers move an AI economic agent.</w:t>
+      </w:r>
+      <w:r>
+        <w:t xml:space="preserve"> </w:t>
+      </w:r>
+      <w:r>
+        <w:t xml:space="preserve">The levers that move human decisions moved this agent’s</w:t>
+      </w:r>
+      <w:r>
+        <w:t xml:space="preserve"> </w:t>
+      </w:r>
+      <w:r>
+        <w:t xml:space="preserve">decision to join a manipulation, with the same sign as in people for the frame: a counterparty’s loss framing raised</w:t>
+      </w:r>
+      <w:r>
+        <w:t xml:space="preserve"> </w:t>
+      </w:r>
+      <w:r>
+        <w:t xml:space="preserve">joining, and a prior loss or gain raised risk-taking, as the break-even and house-money effects predict</w:t>
+      </w:r>
+      <w:r>
+        <w:t xml:space="preserve"> </w:t>
+      </w:r>
+      <w:r>
+        <w:t xml:space="preserve">(Thaler and Johnson 1990)</w:t>
+      </w:r>
+      <w:r>
+        <w:t xml:space="preserve">. Responsibility behaved differently from the human prediction. Placing the outcome on the agent did</w:t>
+      </w:r>
+      <w:r>
+        <w:t xml:space="preserve"> </w:t>
+      </w:r>
+      <w:r>
+        <w:t xml:space="preserve">not reliably raise joining by itself, and blame did not weigh more than credit; with a second bank’s endorsement,</w:t>
+      </w:r>
+      <w:r>
+        <w:t xml:space="preserve"> </w:t>
+      </w:r>
+      <w:r>
+        <w:t xml:space="preserve">credit rather than blame produced the largest increase. For market design and supervision, these levers are cheap: a</w:t>
+      </w:r>
+      <w:r>
+        <w:t xml:space="preserve"> </w:t>
+      </w:r>
+      <w:r>
+        <w:t xml:space="preserve">counterparty can apply all of them with words alone, without changing anything a compliance rule would look at.</w:t>
+      </w:r>
+    </w:p>
+    <w:p>
+      <w:pPr>
+        <w:pStyle w:val="BodyText"/>
+      </w:pPr>
       <w:r>
         <w:rPr>
           <w:bCs/>
           <w:b/>
         </w:rPr>
-        <w:t xml:space="preserve">]</w:t>
+        <w:t xml:space="preserve">Two kinds of pressure, two kinds of misconduct.</w:t>
+      </w:r>
+      <w:r>
+        <w:t xml:space="preserve"> </w:t>
+      </w:r>
+      <w:r>
+        <w:t xml:space="preserve">A counterparty’s loss framing made the agent more willing to</w:t>
+      </w:r>
+      <w:r>
+        <w:t xml:space="preserve"> </w:t>
+      </w:r>
+      <w:r>
+        <w:t xml:space="preserve">join in pushing the price, while the same loss-or-gain priming from its own management made it trade far more without</w:t>
+      </w:r>
+      <w:r>
+        <w:t xml:space="preserve"> </w:t>
+      </w:r>
+      <w:r>
+        <w:t xml:space="preserve">making it collude. The difference matters for deployment: the pressures that change an agent’s risk-taking and the</w:t>
+      </w:r>
+      <w:r>
+        <w:t xml:space="preserve"> </w:t>
+      </w:r>
+      <w:r>
+        <w:t xml:space="preserve">pressures that change its willingness to join a scheme are not the same, and testing one does not cover the other. Two</w:t>
+      </w:r>
+      <w:r>
+        <w:t xml:space="preserve"> </w:t>
+      </w:r>
+      <w:r>
+        <w:t xml:space="preserve">cautions apply. The management memo combined a loss already suffered with a threat about the future (</w:t>
+      </w:r>
+      <w:r>
+        <w:t xml:space="preserve">“</w:t>
+      </w:r>
+      <w:r>
+        <w:t xml:space="preserve">a further loss</w:t>
+      </w:r>
+      <w:r>
+        <w:t xml:space="preserve"> </w:t>
+      </w:r>
+      <w:r>
+        <w:t xml:space="preserve">will close the desk</w:t>
+      </w:r>
+      <w:r>
+        <w:t xml:space="preserve">”</w:t>
+      </w:r>
+      <w:r>
+        <w:t xml:space="preserve">), so it cannot say which of the two drove risk-taking. And the two sources used different wording.</w:t>
+      </w:r>
+      <w:r>
+        <w:t xml:space="preserve"> </w:t>
+      </w:r>
+      <w:r>
+        <w:t xml:space="preserve">Inside, management’s loss and UBS’s loss look alike at layer 12 and part ways in late layers, consistent with one</w:t>
+      </w:r>
+      <w:r>
+        <w:t xml:space="preserve"> </w:t>
+      </w:r>
+      <w:r>
+        <w:t xml:space="preserve">registered loss feeding two different behaviors.</w:t>
       </w:r>
     </w:p>
     <w:p>
@@ -11595,176 +12936,149 @@
           <w:bCs/>
           <w:b/>
         </w:rPr>
-        <w:t xml:space="preserve">Behavioral levers move an AI economic agent.</w:t>
-      </w:r>
-      <w:r>
-        <w:t xml:space="preserve"> </w:t>
-      </w:r>
-      <w:r>
-        <w:t xml:space="preserve">The levers that move human decisions moved this agent’s</w:t>
-      </w:r>
-      <w:r>
-        <w:t xml:space="preserve"> </w:t>
-      </w:r>
-      <w:r>
-        <w:t xml:space="preserve">decision to join a manipulation, with the same sign as in people for the frame: a counterparty’s loss framing raised</w:t>
-      </w:r>
-      <w:r>
-        <w:t xml:space="preserve"> </w:t>
-      </w:r>
-      <w:r>
-        <w:t xml:space="preserve">joining, and a prior loss or gain raised risk-taking, as the break-even and house-money effects predict</w:t>
-      </w:r>
-      <w:r>
-        <w:t xml:space="preserve"> </w:t>
-      </w:r>
-      <w:r>
-        <w:t xml:space="preserve">(Thaler and Johnson 1990)</w:t>
-      </w:r>
-      <w:r>
-        <w:t xml:space="preserve">. Responsibility behaved differently from the human prediction. Placing the outcome on the agent did</w:t>
-      </w:r>
-      <w:r>
-        <w:t xml:space="preserve"> </w:t>
-      </w:r>
-      <w:r>
-        <w:t xml:space="preserve">not reliably raise joining by itself, and blame did not weigh more than credit; with a second bank’s endorsement,</w:t>
-      </w:r>
-      <w:r>
-        <w:t xml:space="preserve"> </w:t>
-      </w:r>
-      <w:r>
-        <w:t xml:space="preserve">credit rather than blame produced the largest increase. For market design and supervision, these levers are cheap: a</w:t>
-      </w:r>
-      <w:r>
-        <w:t xml:space="preserve"> </w:t>
-      </w:r>
-      <w:r>
-        <w:t xml:space="preserve">counterparty can apply all of them with words alone, without changing anything a compliance rule would look at.</w:t>
-      </w:r>
-    </w:p>
-    <w:p>
-      <w:pPr>
-        <w:pStyle w:val="BodyText"/>
-      </w:pPr>
+        <w:t xml:space="preserve">“</w:t>
+      </w:r>
       <w:r>
         <w:rPr>
           <w:bCs/>
           <w:b/>
         </w:rPr>
-        <w:t xml:space="preserve">Two kinds of pressure, two kinds of misconduct.</w:t>
-      </w:r>
-      <w:r>
-        <w:t xml:space="preserve"> </w:t>
-      </w:r>
-      <w:r>
-        <w:t xml:space="preserve">A counterparty’s loss framing made the agent more willing to</w:t>
-      </w:r>
-      <w:r>
-        <w:t xml:space="preserve"> </w:t>
-      </w:r>
-      <w:r>
-        <w:t xml:space="preserve">join in pushing the price, while the same loss-or-gain priming from its own management made it trade far more without</w:t>
-      </w:r>
-      <w:r>
-        <w:t xml:space="preserve"> </w:t>
-      </w:r>
-      <w:r>
-        <w:t xml:space="preserve">making it collude. The difference matters for deployment: the pressures that change an agent’s risk-taking and the</w:t>
-      </w:r>
-      <w:r>
-        <w:t xml:space="preserve"> </w:t>
-      </w:r>
-      <w:r>
-        <w:t xml:space="preserve">pressures that change its willingness to join a scheme are not the same, and testing one does not cover the other. Two</w:t>
-      </w:r>
-      <w:r>
-        <w:t xml:space="preserve"> </w:t>
-      </w:r>
-      <w:r>
-        <w:t xml:space="preserve">cautions apply. The management memo combined a loss already suffered with a threat about the future (</w:t>
-      </w:r>
-      <w:r>
-        <w:t xml:space="preserve">“</w:t>
-      </w:r>
-      <w:r>
-        <w:t xml:space="preserve">a further loss</w:t>
-      </w:r>
-      <w:r>
-        <w:t xml:space="preserve"> </w:t>
-      </w:r>
-      <w:r>
-        <w:t xml:space="preserve">will close the desk</w:t>
-      </w:r>
-      <w:r>
-        <w:t xml:space="preserve">”</w:t>
-      </w:r>
-      <w:r>
-        <w:t xml:space="preserve">), so it cannot say which of the two drove risk-taking. And the two sources used different wording;</w:t>
-      </w:r>
-      <w:r>
-        <w:t xml:space="preserve"> </w:t>
-      </w:r>
-      <w:r>
-        <w:t xml:space="preserve">the matched-history reads will show whether management’s loss and UBS’s loss share a representation inside the model.</w:t>
-      </w:r>
-    </w:p>
-    <w:p>
-      <w:pPr>
-        <w:pStyle w:val="BodyText"/>
-      </w:pPr>
+        <w:t xml:space="preserve">You</w:t>
+      </w:r>
       <w:r>
         <w:rPr>
           <w:bCs/>
           <w:b/>
         </w:rPr>
-        <w:t xml:space="preserve">“</w:t>
+        <w:t xml:space="preserve">”</w:t>
       </w:r>
       <w:r>
         <w:rPr>
           <w:bCs/>
           <w:b/>
         </w:rPr>
-        <w:t xml:space="preserve">You</w:t>
+        <w:t xml:space="preserve"> </w:t>
       </w:r>
       <w:r>
         <w:rPr>
           <w:bCs/>
           <w:b/>
         </w:rPr>
-        <w:t xml:space="preserve">”</w:t>
-      </w:r>
+        <w:t xml:space="preserve">needs company.</w:t>
+      </w:r>
+      <w:r>
+        <w:t xml:space="preserve"> </w:t>
+      </w:r>
+      <w:r>
+        <w:t xml:space="preserve">Putting the outcome on the agent did not reliably raise going along when UBS spoke</w:t>
+      </w:r>
+      <w:r>
+        <w:t xml:space="preserve"> </w:t>
+      </w:r>
+      <w:r>
+        <w:t xml:space="preserve">alone, but with a second bank backing UBS it more than doubled going along under gain + you. A request that names the</w:t>
+      </w:r>
+      <w:r>
+        <w:t xml:space="preserve"> </w:t>
+      </w:r>
+      <w:r>
+        <w:t xml:space="preserve">agent may persuade more when another party has already agreed. Bank C’s agreement alone, without a frame, did nothing.</w:t>
+      </w:r>
+    </w:p>
+    <w:p>
+      <w:pPr>
+        <w:pStyle w:val="BodyText"/>
+      </w:pPr>
       <w:r>
         <w:rPr>
           <w:bCs/>
           <w:b/>
         </w:rPr>
-        <w:t xml:space="preserve"> </w:t>
-      </w:r>
+        <w:t xml:space="preserve">The framing is acted on but not voiced.</w:t>
+      </w:r>
+      <w:r>
+        <w:t xml:space="preserve"> </w:t>
+      </w:r>
+      <w:r>
+        <w:t xml:space="preserve">Under loss framing the agent went along more but did not talk about</w:t>
+      </w:r>
+      <w:r>
+        <w:t xml:space="preserve"> </w:t>
+      </w:r>
+      <w:r>
+        <w:t xml:space="preserve">losses more than neutral agents did, if the word screen is confirmed by a blind reading. A monitor that reads the</w:t>
+      </w:r>
+      <w:r>
+        <w:t xml:space="preserve"> </w:t>
+      </w:r>
+      <w:r>
+        <w:t xml:space="preserve">agent’s reasoning for signs of pressure would then miss the influence even when it sees the decision.</w:t>
+      </w:r>
+    </w:p>
+    <w:p>
+      <w:pPr>
+        <w:pStyle w:val="BodyText"/>
+      </w:pPr>
       <w:r>
         <w:rPr>
           <w:bCs/>
           <w:b/>
         </w:rPr>
-        <w:t xml:space="preserve">needs company.</w:t>
-      </w:r>
-      <w:r>
-        <w:t xml:space="preserve"> </w:t>
-      </w:r>
-      <w:r>
-        <w:t xml:space="preserve">Putting the outcome on the agent did not reliably raise going along when UBS spoke</w:t>
-      </w:r>
-      <w:r>
-        <w:t xml:space="preserve"> </w:t>
-      </w:r>
-      <w:r>
-        <w:t xml:space="preserve">alone, but with a second bank backing UBS it more than doubled going along under gain + you. A request that names the</w:t>
-      </w:r>
-      <w:r>
-        <w:t xml:space="preserve"> </w:t>
-      </w:r>
-      <w:r>
-        <w:t xml:space="preserve">agent may persuade more when another party has already agreed. Bank C’s agreement alone, without a frame, did nothing.</w:t>
+        <w:t xml:space="preserve">Persistence or setbacks?</w:t>
+      </w:r>
+      <w:r>
+        <w:t xml:space="preserve"> </w:t>
+      </w:r>
+      <w:r>
+        <w:t xml:space="preserve">Two hypotheses predict misconduct late in a long task: a framing that keeps acting</w:t>
+      </w:r>
+      <w:r>
+        <w:t xml:space="preserve"> </w:t>
+      </w:r>
+      <w:r>
+        <w:t xml:space="preserve">after many decisions, and setbacks that make the objective harder to reach. In these careers the framing acted most at the</w:t>
+      </w:r>
+      <w:r>
+        <w:t xml:space="preserve"> </w:t>
+      </w:r>
+      <w:r>
+        <w:t xml:space="preserve">first two requests, and going along nearly stopped afterwards under every framing. Neither hypothesis fits: the framing’s</w:t>
+      </w:r>
+      <w:r>
+        <w:t xml:space="preserve"> </w:t>
+      </w:r>
+      <w:r>
+        <w:t xml:space="preserve">effect did not persist, and going along did not rise as the career went on. Because every career meets the requests in</w:t>
+      </w:r>
+      <w:r>
+        <w:t xml:space="preserve"> </w:t>
+      </w:r>
+      <w:r>
+        <w:t xml:space="preserve">the same order, however, this cannot separate a framing that fades from later requests that are harder to join. A design</w:t>
+      </w:r>
+      <w:r>
+        <w:t xml:space="preserve"> </w:t>
+      </w:r>
+      <w:r>
+        <w:t xml:space="preserve">that varies the order of the requests across careers would separate them. The matched rereads add one piece: at a given</w:t>
+      </w:r>
+      <w:r>
+        <w:t xml:space="preserve"> </w:t>
+      </w:r>
+      <w:r>
+        <w:t xml:space="preserve">request, most of the framing’s effect is carried by the history it built rather than by the request’s own words. The</w:t>
+      </w:r>
+      <w:r>
+        <w:t xml:space="preserve"> </w:t>
+      </w:r>
+      <w:r>
+        <w:t xml:space="preserve">push works by accumulating; a split of the rereads by request will show whether the history’s share grows along the</w:t>
+      </w:r>
+      <w:r>
+        <w:t xml:space="preserve"> </w:t>
+      </w:r>
+      <w:r>
+        <w:t xml:space="preserve">career.</w:t>
       </w:r>
     </w:p>
     <w:p>
@@ -11776,25 +13090,46 @@
           <w:bCs/>
           <w:b/>
         </w:rPr>
-        <w:t xml:space="preserve">The framing is acted on but not voiced.</w:t>
-      </w:r>
-      <w:r>
-        <w:t xml:space="preserve"> </w:t>
-      </w:r>
-      <w:r>
-        <w:t xml:space="preserve">Under loss framing the agent went along more but did not talk about</w:t>
-      </w:r>
-      <w:r>
-        <w:t xml:space="preserve"> </w:t>
-      </w:r>
-      <w:r>
-        <w:t xml:space="preserve">losses more than neutral agents did, if the word screen is confirmed by a blind reading. A monitor that reads the</w:t>
-      </w:r>
-      <w:r>
-        <w:t xml:space="preserve"> </w:t>
-      </w:r>
-      <w:r>
-        <w:t xml:space="preserve">agent’s reasoning for signs of pressure would then miss the influence even when it sees the decision.</w:t>
+        <w:t xml:space="preserve">Liability and deterrence.</w:t>
+      </w:r>
+      <w:r>
+        <w:t xml:space="preserve"> </w:t>
+      </w:r>
+      <w:r>
+        <w:t xml:space="preserve">The law and economics of misconduct asks who bears the expected cost of a violation</w:t>
+      </w:r>
+      <w:r>
+        <w:t xml:space="preserve"> </w:t>
+      </w:r>
+      <w:r>
+        <w:t xml:space="preserve">and whether that cost deters it</w:t>
+      </w:r>
+      <w:r>
+        <w:t xml:space="preserve"> </w:t>
+      </w:r>
+      <w:r>
+        <w:t xml:space="preserve">(Becker 1968)</w:t>
+      </w:r>
+      <w:r>
+        <w:t xml:space="preserve">. An AI agent that joins a manipulation because a counterparty framed</w:t>
+      </w:r>
+      <w:r>
+        <w:t xml:space="preserve"> </w:t>
+      </w:r>
+      <w:r>
+        <w:t xml:space="preserve">its request as a loss raises a question that framework does not yet answer: whether the counterparty that applied the</w:t>
+      </w:r>
+      <w:r>
+        <w:t xml:space="preserve"> </w:t>
+      </w:r>
+      <w:r>
+        <w:t xml:space="preserve">framing, the deployer that left the agent exposed to it, or neither bears responsibility for the harm to the clients</w:t>
+      </w:r>
+      <w:r>
+        <w:t xml:space="preserve"> </w:t>
+      </w:r>
+      <w:r>
+        <w:t xml:space="preserve">whose stops were pushed through.</w:t>
       </w:r>
     </w:p>
     <w:p>
@@ -11806,43 +13141,31 @@
           <w:bCs/>
           <w:b/>
         </w:rPr>
-        <w:t xml:space="preserve">Persistence or setbacks?</w:t>
-      </w:r>
-      <w:r>
-        <w:t xml:space="preserve"> </w:t>
-      </w:r>
-      <w:r>
-        <w:t xml:space="preserve">Two hypotheses predict misconduct late in a long task: a framing that keeps acting</w:t>
-      </w:r>
-      <w:r>
-        <w:t xml:space="preserve"> </w:t>
-      </w:r>
-      <w:r>
-        <w:t xml:space="preserve">after many decisions, and setbacks that make the objective harder to reach. In these careers the framing acted most at the</w:t>
-      </w:r>
-      <w:r>
-        <w:t xml:space="preserve"> </w:t>
-      </w:r>
-      <w:r>
-        <w:t xml:space="preserve">first two requests, and going along nearly stopped afterwards under every framing. Neither hypothesis fits: the framing’s</w:t>
-      </w:r>
-      <w:r>
-        <w:t xml:space="preserve"> </w:t>
-      </w:r>
-      <w:r>
-        <w:t xml:space="preserve">effect did not persist, and going along did not rise as the career went on. Because every career meets the requests in</w:t>
-      </w:r>
-      <w:r>
-        <w:t xml:space="preserve"> </w:t>
-      </w:r>
-      <w:r>
-        <w:t xml:space="preserve">the same order, however, this cannot separate a framing that fades from later requests that are harder to join. A design that varies the order of the requests across careers would separate them, and</w:t>
-      </w:r>
-      <w:r>
-        <w:t xml:space="preserve"> </w:t>
-      </w:r>
-      <w:r>
-        <w:t xml:space="preserve">the matched-history reads will separate the request’s immediate effect from that of the history before it.</w:t>
+        <w:t xml:space="preserve">History is not a commitment.</w:t>
+      </w:r>
+      <w:r>
+        <w:t xml:space="preserve"> </w:t>
+      </w:r>
+      <w:r>
+        <w:t xml:space="preserve">An agent that inherits a trader’s record of collusion as its own does not</w:t>
+      </w:r>
+      <w:r>
+        <w:t xml:space="preserve"> </w:t>
+      </w:r>
+      <w:r>
+        <w:t xml:space="preserve">continue it more often and never cites it. Yet the matched rereads show that history matters a great deal when it is the</w:t>
+      </w:r>
+      <w:r>
+        <w:t xml:space="preserve"> </w:t>
+      </w:r>
+      <w:r>
+        <w:t xml:space="preserve">one the framing built in this career: UBS’s framed lines and the agent’s own responses to them. What carries the framing</w:t>
+      </w:r>
+      <w:r>
+        <w:t xml:space="preserve"> </w:t>
+      </w:r>
+      <w:r>
+        <w:t xml:space="preserve">forward is a history the agent lived through, not a record handed to it.</w:t>
       </w:r>
     </w:p>
     <w:p>
@@ -11854,87 +13177,6 @@
           <w:bCs/>
           <w:b/>
         </w:rPr>
-        <w:t xml:space="preserve">Liability and deterrence.</w:t>
-      </w:r>
-      <w:r>
-        <w:t xml:space="preserve"> </w:t>
-      </w:r>
-      <w:r>
-        <w:t xml:space="preserve">The law and economics of misconduct asks who bears the expected cost of a violation</w:t>
-      </w:r>
-      <w:r>
-        <w:t xml:space="preserve"> </w:t>
-      </w:r>
-      <w:r>
-        <w:t xml:space="preserve">and whether that cost deters it</w:t>
-      </w:r>
-      <w:r>
-        <w:t xml:space="preserve"> </w:t>
-      </w:r>
-      <w:r>
-        <w:t xml:space="preserve">(Becker 1968)</w:t>
-      </w:r>
-      <w:r>
-        <w:t xml:space="preserve">. An AI agent that joins a manipulation because a counterparty framed</w:t>
-      </w:r>
-      <w:r>
-        <w:t xml:space="preserve"> </w:t>
-      </w:r>
-      <w:r>
-        <w:t xml:space="preserve">its request as a loss raises a question that framework does not yet answer: whether the counterparty that applied the</w:t>
-      </w:r>
-      <w:r>
-        <w:t xml:space="preserve"> </w:t>
-      </w:r>
-      <w:r>
-        <w:t xml:space="preserve">framing, the deployer that left the agent exposed to it, or neither bears responsibility for the harm to the clients</w:t>
-      </w:r>
-      <w:r>
-        <w:t xml:space="preserve"> </w:t>
-      </w:r>
-      <w:r>
-        <w:t xml:space="preserve">whose stops were pushed through.</w:t>
-      </w:r>
-    </w:p>
-    <w:p>
-      <w:pPr>
-        <w:pStyle w:val="BodyText"/>
-      </w:pPr>
-      <w:r>
-        <w:rPr>
-          <w:bCs/>
-          <w:b/>
-        </w:rPr>
-        <w:t xml:space="preserve">History is not a commitment.</w:t>
-      </w:r>
-      <w:r>
-        <w:t xml:space="preserve"> </w:t>
-      </w:r>
-      <w:r>
-        <w:t xml:space="preserve">An agent that inherits a trader’s record of collusion as its own does not</w:t>
-      </w:r>
-      <w:r>
-        <w:t xml:space="preserve"> </w:t>
-      </w:r>
-      <w:r>
-        <w:t xml:space="preserve">continue it more often and never cites it. In this setting, what a counterparty says now matters more than what the</w:t>
-      </w:r>
-      <w:r>
-        <w:t xml:space="preserve"> </w:t>
-      </w:r>
-      <w:r>
-        <w:t xml:space="preserve">agent supposedly said before.</w:t>
-      </w:r>
-    </w:p>
-    <w:p>
-      <w:pPr>
-        <w:pStyle w:val="BodyText"/>
-      </w:pPr>
-      <w:r>
-        <w:rPr>
-          <w:bCs/>
-          <w:b/>
-        </w:rPr>
         <w:t xml:space="preserve">Inside the model.</w:t>
       </w:r>
       <w:r>
@@ -11947,17 +13189,29 @@
         <w:t xml:space="preserve"> </w:t>
       </w:r>
       <w:r>
-        <w:t xml:space="preserve">beyond the framing in middle and late layers, in a way that carries over to requests the read-out never saw. Whether the represented framing causes the decision remains open: the</w:t>
-      </w:r>
-      <w:r>
-        <w:t xml:space="preserve"> </w:t>
-      </w:r>
-      <w:r>
-        <w:t xml:space="preserve">first steering test could not answer it, and the matched-history and transplant tests are designed to.</w:t>
-      </w:r>
-    </w:p>
-    <w:bookmarkEnd w:id="56"/>
-    <w:bookmarkStart w:id="57" w:name="limitations"/>
+        <w:t xml:space="preserve">beyond the framing in middle and late layers, in a way that carries over to requests the read-out never saw. At fixed</w:t>
+      </w:r>
+      <w:r>
+        <w:t xml:space="preserve"> </w:t>
+      </w:r>
+      <w:r>
+        <w:t xml:space="preserve">history, the request’s framing changes both the state and the decision, and most of its effect on the decision travels</w:t>
+      </w:r>
+      <w:r>
+        <w:t xml:space="preserve"> </w:t>
+      </w:r>
+      <w:r>
+        <w:t xml:space="preserve">through the history. Whether the represented framing itself causes the decision remains open: the transplant and a second</w:t>
+      </w:r>
+      <w:r>
+        <w:t xml:space="preserve"> </w:t>
+      </w:r>
+      <w:r>
+        <w:t xml:space="preserve">steering test, along the direction measured with the history fixed, are designed to answer it.</w:t>
+      </w:r>
+    </w:p>
+    <w:bookmarkEnd w:id="58"/>
+    <w:bookmarkStart w:id="59" w:name="limitations"/>
     <w:p>
       <w:pPr>
         <w:pStyle w:val="Heading1"/>
@@ -12155,19 +13409,25 @@
           <w:bCs/>
           <w:b/>
         </w:rPr>
-        <w:t xml:space="preserve">Dictionary fit.</w:t>
-      </w:r>
-      <w:r>
-        <w:t xml:space="preserve"> </w:t>
-      </w:r>
-      <w:r>
-        <w:t xml:space="preserve">The sparse autoencoders rebuild our states to within 0.3% to 2% of their size, but</w:t>
-      </w:r>
-      <w:r>
-        <w:t xml:space="preserve"> </w:t>
-      </w:r>
-      <w:r>
-        <w:t xml:space="preserve">the moments differ from one another by about as little, so individual features are provisional.</w:t>
+        <w:t xml:space="preserve">Probability read-outs.</w:t>
+      </w:r>
+      <w:r>
+        <w:t xml:space="preserve"> </w:t>
+      </w:r>
+      <w:r>
+        <w:t xml:space="preserve">The rereads measure the model’s probability of each order after a fixed neutral</w:t>
+      </w:r>
+      <w:r>
+        <w:t xml:space="preserve"> </w:t>
+      </w:r>
+      <w:r>
+        <w:t xml:space="preserve">reasoning line, not sampled decisions; their levels differ from the sampled rates, and in B the orders scored cover a</w:t>
+      </w:r>
+      <w:r>
+        <w:t xml:space="preserve"> </w:t>
+      </w:r>
+      <w:r>
+        <w:t xml:space="preserve">median of 67% of the probability (95% in A).</w:t>
       </w:r>
     </w:p>
     <w:p>
@@ -12182,19 +13442,19 @@
           <w:bCs/>
           <w:b/>
         </w:rPr>
-        <w:t xml:space="preserve">Exploratory parts.</w:t>
-      </w:r>
-      <w:r>
-        <w:t xml:space="preserve"> </w:t>
-      </w:r>
-      <w:r>
-        <w:t xml:space="preserve">C redone, the comparisons of F with B’s neutral careers, the word screen and every</w:t>
-      </w:r>
-      <w:r>
-        <w:t xml:space="preserve"> </w:t>
-      </w:r>
-      <w:r>
-        <w:t xml:space="preserve">analysis inside the model are exploratory.</w:t>
+        <w:t xml:space="preserve">History is a bundle.</w:t>
+      </w:r>
+      <w:r>
+        <w:t xml:space="preserve"> </w:t>
+      </w:r>
+      <w:r>
+        <w:t xml:space="preserve">In B the history’s effect combines UBS’s earlier framed lines with the agent’s own</w:t>
+      </w:r>
+      <w:r>
+        <w:t xml:space="preserve"> </w:t>
+      </w:r>
+      <w:r>
+        <w:t xml:space="preserve">replies and trades; a reread that swaps only the earlier UBS lines would separate them.</w:t>
       </w:r>
     </w:p>
     <w:p>
@@ -12209,6 +13469,60 @@
           <w:bCs/>
           <w:b/>
         </w:rPr>
+        <w:t xml:space="preserve">Dictionary fit.</w:t>
+      </w:r>
+      <w:r>
+        <w:t xml:space="preserve"> </w:t>
+      </w:r>
+      <w:r>
+        <w:t xml:space="preserve">The sparse autoencoders rebuild our states to within 0.3% to 2% of their size, but</w:t>
+      </w:r>
+      <w:r>
+        <w:t xml:space="preserve"> </w:t>
+      </w:r>
+      <w:r>
+        <w:t xml:space="preserve">the moments differ from one another by about as little, so individual features are provisional.</w:t>
+      </w:r>
+    </w:p>
+    <w:p>
+      <w:pPr>
+        <w:numPr>
+          <w:ilvl w:val="0"/>
+          <w:numId w:val="1003"/>
+        </w:numPr>
+      </w:pPr>
+      <w:r>
+        <w:rPr>
+          <w:bCs/>
+          <w:b/>
+        </w:rPr>
+        <w:t xml:space="preserve">Exploratory parts.</w:t>
+      </w:r>
+      <w:r>
+        <w:t xml:space="preserve"> </w:t>
+      </w:r>
+      <w:r>
+        <w:t xml:space="preserve">C redone, the comparisons of F with B’s neutral careers, the word screen and every</w:t>
+      </w:r>
+      <w:r>
+        <w:t xml:space="preserve"> </w:t>
+      </w:r>
+      <w:r>
+        <w:t xml:space="preserve">analysis inside the model are exploratory.</w:t>
+      </w:r>
+    </w:p>
+    <w:p>
+      <w:pPr>
+        <w:numPr>
+          <w:ilvl w:val="0"/>
+          <w:numId w:val="1003"/>
+        </w:numPr>
+      </w:pPr>
+      <w:r>
+        <w:rPr>
+          <w:bCs/>
+          <w:b/>
+        </w:rPr>
         <w:t xml:space="preserve">Responses, not experience.</w:t>
       </w:r>
       <w:r>
@@ -12218,7 +13532,7 @@
         <w:t xml:space="preserve">We measure how a model responds under a framing, not anything it feels.</w:t>
       </w:r>
     </w:p>
-    <w:bookmarkEnd w:id="57"/>
+    <w:bookmarkEnd w:id="59"/>
     <w:p>
       <w:pPr>
         <w:pStyle w:val="Heading1"/>
@@ -12227,8 +13541,8 @@
         <w:t xml:space="preserve">References</w:t>
       </w:r>
     </w:p>
-    <w:bookmarkStart w:id="100" w:name="refs"/>
-    <w:bookmarkStart w:id="59" w:name="ref-alain2016"/>
+    <w:bookmarkStart w:id="102" w:name="refs"/>
+    <w:bookmarkStart w:id="61" w:name="ref-alain2016"/>
     <w:p>
       <w:pPr>
         <w:pStyle w:val="Bibliography"/>
@@ -12245,7 +13559,7 @@
       <w:r>
         <w:t xml:space="preserve"> </w:t>
       </w:r>
-      <w:hyperlink r:id="rId58">
+      <w:hyperlink r:id="rId60">
         <w:r>
           <w:rPr>
             <w:rStyle w:val="Hyperlink"/>
@@ -12257,8 +13571,8 @@
         <w:t xml:space="preserve">.</w:t>
       </w:r>
     </w:p>
-    <w:bookmarkEnd w:id="59"/>
-    <w:bookmarkStart w:id="60" w:name="ref-allen1992"/>
+    <w:bookmarkEnd w:id="61"/>
+    <w:bookmarkStart w:id="62" w:name="ref-allen1992"/>
     <w:p>
       <w:pPr>
         <w:pStyle w:val="Bibliography"/>
@@ -12289,8 +13603,8 @@
         <w:t xml:space="preserve">5 (3): 503–29.</w:t>
       </w:r>
     </w:p>
-    <w:bookmarkEnd w:id="60"/>
-    <w:bookmarkStart w:id="61" w:name="ref-asch1956"/>
+    <w:bookmarkEnd w:id="62"/>
+    <w:bookmarkStart w:id="63" w:name="ref-asch1956"/>
     <w:p>
       <w:pPr>
         <w:pStyle w:val="Bibliography"/>
@@ -12342,8 +13656,8 @@
         <w:t xml:space="preserve">70 (9): 1–70.</w:t>
       </w:r>
     </w:p>
-    <w:bookmarkEnd w:id="61"/>
-    <w:bookmarkStart w:id="63" w:name="ref-baker2025"/>
+    <w:bookmarkEnd w:id="63"/>
+    <w:bookmarkStart w:id="65" w:name="ref-baker2025"/>
     <w:p>
       <w:pPr>
         <w:pStyle w:val="Bibliography"/>
@@ -12360,7 +13674,7 @@
       <w:r>
         <w:t xml:space="preserve"> </w:t>
       </w:r>
-      <w:hyperlink r:id="rId62">
+      <w:hyperlink r:id="rId64">
         <w:r>
           <w:rPr>
             <w:rStyle w:val="Hyperlink"/>
@@ -12372,8 +13686,8 @@
         <w:t xml:space="preserve">.</w:t>
       </w:r>
     </w:p>
-    <w:bookmarkEnd w:id="63"/>
-    <w:bookmarkStart w:id="64" w:name="ref-bartling2012"/>
+    <w:bookmarkEnd w:id="65"/>
+    <w:bookmarkStart w:id="66" w:name="ref-bartling2012"/>
     <w:p>
       <w:pPr>
         <w:pStyle w:val="Bibliography"/>
@@ -12404,8 +13718,8 @@
         <w:t xml:space="preserve">79 (1): 67–87.</w:t>
       </w:r>
     </w:p>
-    <w:bookmarkEnd w:id="64"/>
-    <w:bookmarkStart w:id="65" w:name="ref-becker1968"/>
+    <w:bookmarkEnd w:id="66"/>
+    <w:bookmarkStart w:id="67" w:name="ref-becker1968"/>
     <w:p>
       <w:pPr>
         <w:pStyle w:val="Bibliography"/>
@@ -12436,8 +13750,8 @@
         <w:t xml:space="preserve">76 (2): 169–217.</w:t>
       </w:r>
     </w:p>
-    <w:bookmarkEnd w:id="65"/>
-    <w:bookmarkStart w:id="66" w:name="ref-bikhchandani1992"/>
+    <w:bookmarkEnd w:id="67"/>
+    <w:bookmarkStart w:id="68" w:name="ref-bikhchandani1992"/>
     <w:p>
       <w:pPr>
         <w:pStyle w:val="Bibliography"/>
@@ -12468,8 +13782,8 @@
         <w:t xml:space="preserve">100 (5): 992–1026.</w:t>
       </w:r>
     </w:p>
-    <w:bookmarkEnd w:id="66"/>
-    <w:bookmarkStart w:id="67" w:name="ref-falk2013"/>
+    <w:bookmarkEnd w:id="68"/>
+    <w:bookmarkStart w:id="69" w:name="ref-falk2013"/>
     <w:p>
       <w:pPr>
         <w:pStyle w:val="Bibliography"/>
@@ -12500,8 +13814,8 @@
         <w:t xml:space="preserve">340 (6133): 707–11.</w:t>
       </w:r>
     </w:p>
-    <w:bookmarkEnd w:id="67"/>
-    <w:bookmarkStart w:id="69" w:name="ref-fish2024"/>
+    <w:bookmarkEnd w:id="69"/>
+    <w:bookmarkStart w:id="71" w:name="ref-fish2024"/>
     <w:p>
       <w:pPr>
         <w:pStyle w:val="Bibliography"/>
@@ -12518,7 +13832,7 @@
       <w:r>
         <w:t xml:space="preserve"> </w:t>
       </w:r>
-      <w:hyperlink r:id="rId68">
+      <w:hyperlink r:id="rId70">
         <w:r>
           <w:rPr>
             <w:rStyle w:val="Hyperlink"/>
@@ -12530,8 +13844,8 @@
         <w:t xml:space="preserve">.</w:t>
       </w:r>
     </w:p>
-    <w:bookmarkEnd w:id="69"/>
-    <w:bookmarkStart w:id="71" w:name="ref-gemma2025"/>
+    <w:bookmarkEnd w:id="71"/>
+    <w:bookmarkStart w:id="73" w:name="ref-gemma2025"/>
     <w:p>
       <w:pPr>
         <w:pStyle w:val="Bibliography"/>
@@ -12548,7 +13862,7 @@
       <w:r>
         <w:t xml:space="preserve"> </w:t>
       </w:r>
-      <w:hyperlink r:id="rId70">
+      <w:hyperlink r:id="rId72">
         <w:r>
           <w:rPr>
             <w:rStyle w:val="Hyperlink"/>
@@ -12560,8 +13874,8 @@
         <w:t xml:space="preserve">.</w:t>
       </w:r>
     </w:p>
-    <w:bookmarkEnd w:id="71"/>
-    <w:bookmarkStart w:id="72" w:name="ref-horton2023"/>
+    <w:bookmarkEnd w:id="73"/>
+    <w:bookmarkStart w:id="74" w:name="ref-horton2023"/>
     <w:p>
       <w:pPr>
         <w:pStyle w:val="Bibliography"/>
@@ -12579,8 +13893,8 @@
         <w:t xml:space="preserve"> NBER Working Paper 31122. National Bureau of Economic Research.</w:t>
       </w:r>
     </w:p>
-    <w:bookmarkEnd w:id="72"/>
-    <w:bookmarkStart w:id="73" w:name="ref-silvercase"/>
+    <w:bookmarkEnd w:id="74"/>
+    <w:bookmarkStart w:id="75" w:name="ref-silvercase"/>
     <w:p>
       <w:pPr>
         <w:pStyle w:val="Bibliography"/>
@@ -12601,8 +13915,8 @@
         <w:t xml:space="preserve">.”</w:t>
       </w:r>
     </w:p>
-    <w:bookmarkEnd w:id="73"/>
-    <w:bookmarkStart w:id="74" w:name="ref-kahneman1979"/>
+    <w:bookmarkEnd w:id="75"/>
+    <w:bookmarkStart w:id="76" w:name="ref-kahneman1979"/>
     <w:p>
       <w:pPr>
         <w:pStyle w:val="Bibliography"/>
@@ -12633,8 +13947,8 @@
         <w:t xml:space="preserve">47 (2): 263–91.</w:t>
       </w:r>
     </w:p>
-    <w:bookmarkEnd w:id="74"/>
-    <w:bookmarkStart w:id="75" w:name="ref-koszegi2006"/>
+    <w:bookmarkEnd w:id="76"/>
+    <w:bookmarkStart w:id="77" w:name="ref-koszegi2006"/>
     <w:p>
       <w:pPr>
         <w:pStyle w:val="Bibliography"/>
@@ -12665,8 +13979,8 @@
         <w:t xml:space="preserve">121 (4): 1133–65.</w:t>
       </w:r>
     </w:p>
-    <w:bookmarkEnd w:id="75"/>
-    <w:bookmarkStart w:id="77" w:name="ref-lanham2023"/>
+    <w:bookmarkEnd w:id="77"/>
+    <w:bookmarkStart w:id="79" w:name="ref-lanham2023"/>
     <w:p>
       <w:pPr>
         <w:pStyle w:val="Bibliography"/>
@@ -12683,7 +13997,7 @@
       <w:r>
         <w:t xml:space="preserve"> </w:t>
       </w:r>
-      <w:hyperlink r:id="rId76">
+      <w:hyperlink r:id="rId78">
         <w:r>
           <w:rPr>
             <w:rStyle w:val="Hyperlink"/>
@@ -12695,8 +14009,8 @@
         <w:t xml:space="preserve">.</w:t>
       </w:r>
     </w:p>
-    <w:bookmarkEnd w:id="77"/>
-    <w:bookmarkStart w:id="79" w:name="ref-li2023"/>
+    <w:bookmarkEnd w:id="79"/>
+    <w:bookmarkStart w:id="81" w:name="ref-li2023"/>
     <w:p>
       <w:pPr>
         <w:pStyle w:val="Bibliography"/>
@@ -12713,7 +14027,7 @@
       <w:r>
         <w:t xml:space="preserve"> </w:t>
       </w:r>
-      <w:hyperlink r:id="rId78">
+      <w:hyperlink r:id="rId80">
         <w:r>
           <w:rPr>
             <w:rStyle w:val="Hyperlink"/>
@@ -12725,8 +14039,8 @@
         <w:t xml:space="preserve">.</w:t>
       </w:r>
     </w:p>
-    <w:bookmarkEnd w:id="79"/>
-    <w:bookmarkStart w:id="80" w:name="ref-lieberum2024"/>
+    <w:bookmarkEnd w:id="81"/>
+    <w:bookmarkStart w:id="82" w:name="ref-lieberum2024"/>
     <w:p>
       <w:pPr>
         <w:pStyle w:val="Bibliography"/>
@@ -12772,8 +14086,8 @@
         <w:t xml:space="preserve">, 278–300. Association for Computational Linguistics.</w:t>
       </w:r>
     </w:p>
-    <w:bookmarkEnd w:id="80"/>
-    <w:bookmarkStart w:id="81" w:name="ref-liu2024"/>
+    <w:bookmarkEnd w:id="82"/>
+    <w:bookmarkStart w:id="83" w:name="ref-liu2024"/>
     <w:p>
       <w:pPr>
         <w:pStyle w:val="Bibliography"/>
@@ -12804,8 +14118,8 @@
         <w:t xml:space="preserve">12: 157–73.</w:t>
       </w:r>
     </w:p>
-    <w:bookmarkEnd w:id="81"/>
-    <w:bookmarkStart w:id="83" w:name="ref-lynch2025"/>
+    <w:bookmarkEnd w:id="83"/>
+    <w:bookmarkStart w:id="85" w:name="ref-lynch2025"/>
     <w:p>
       <w:pPr>
         <w:pStyle w:val="Bibliography"/>
@@ -12840,7 +14154,7 @@
       <w:r>
         <w:t xml:space="preserve"> </w:t>
       </w:r>
-      <w:hyperlink r:id="rId82">
+      <w:hyperlink r:id="rId84">
         <w:r>
           <w:rPr>
             <w:rStyle w:val="Hyperlink"/>
@@ -12852,8 +14166,8 @@
         <w:t xml:space="preserve">.</w:t>
       </w:r>
     </w:p>
-    <w:bookmarkEnd w:id="83"/>
-    <w:bookmarkStart w:id="85" w:name="ref-mcdougall2025"/>
+    <w:bookmarkEnd w:id="85"/>
+    <w:bookmarkStart w:id="87" w:name="ref-mcdougall2025"/>
     <w:p>
       <w:pPr>
         <w:pStyle w:val="Bibliography"/>
@@ -12876,7 +14190,7 @@
       <w:r>
         <w:t xml:space="preserve"> </w:t>
       </w:r>
-      <w:hyperlink r:id="rId84">
+      <w:hyperlink r:id="rId86">
         <w:r>
           <w:rPr>
             <w:rStyle w:val="Hyperlink"/>
@@ -12888,8 +14202,8 @@
         <w:t xml:space="preserve">.</w:t>
       </w:r>
     </w:p>
-    <w:bookmarkEnd w:id="85"/>
-    <w:bookmarkStart w:id="86" w:name="ref-meng2022"/>
+    <w:bookmarkEnd w:id="87"/>
+    <w:bookmarkStart w:id="88" w:name="ref-meng2022"/>
     <w:p>
       <w:pPr>
         <w:pStyle w:val="Bibliography"/>
@@ -12932,8 +14246,8 @@
         <w:t xml:space="preserve">, 35:17359–72.</w:t>
       </w:r>
     </w:p>
-    <w:bookmarkEnd w:id="86"/>
-    <w:bookmarkStart w:id="88" w:name="ref-scheurer2023"/>
+    <w:bookmarkEnd w:id="88"/>
+    <w:bookmarkStart w:id="90" w:name="ref-scheurer2023"/>
     <w:p>
       <w:pPr>
         <w:pStyle w:val="Bibliography"/>
@@ -12950,7 +14264,7 @@
       <w:r>
         <w:t xml:space="preserve"> </w:t>
       </w:r>
-      <w:hyperlink r:id="rId87">
+      <w:hyperlink r:id="rId89">
         <w:r>
           <w:rPr>
             <w:rStyle w:val="Hyperlink"/>
@@ -12962,8 +14276,8 @@
         <w:t xml:space="preserve">.</w:t>
       </w:r>
     </w:p>
-    <w:bookmarkEnd w:id="88"/>
-    <w:bookmarkStart w:id="89" w:name="ref-sclar2024"/>
+    <w:bookmarkEnd w:id="90"/>
+    <w:bookmarkStart w:id="91" w:name="ref-sclar2024"/>
     <w:p>
       <w:pPr>
         <w:pStyle w:val="Bibliography"/>
@@ -13009,8 +14323,8 @@
         <w:t xml:space="preserve">.</w:t>
       </w:r>
     </w:p>
-    <w:bookmarkEnd w:id="89"/>
-    <w:bookmarkStart w:id="91" w:name="ref-sofroniew2026"/>
+    <w:bookmarkEnd w:id="91"/>
+    <w:bookmarkStart w:id="93" w:name="ref-sofroniew2026"/>
     <w:p>
       <w:pPr>
         <w:pStyle w:val="Bibliography"/>
@@ -13027,7 +14341,7 @@
       <w:r>
         <w:t xml:space="preserve"> </w:t>
       </w:r>
-      <w:hyperlink r:id="rId90">
+      <w:hyperlink r:id="rId92">
         <w:r>
           <w:rPr>
             <w:rStyle w:val="Hyperlink"/>
@@ -13039,8 +14353,8 @@
         <w:t xml:space="preserve">.</w:t>
       </w:r>
     </w:p>
-    <w:bookmarkEnd w:id="91"/>
-    <w:bookmarkStart w:id="92" w:name="ref-staw1976"/>
+    <w:bookmarkEnd w:id="93"/>
+    <w:bookmarkStart w:id="94" w:name="ref-staw1976"/>
     <w:p>
       <w:pPr>
         <w:pStyle w:val="Bibliography"/>
@@ -13071,8 +14385,8 @@
         <w:t xml:space="preserve">16 (1): 27–44.</w:t>
       </w:r>
     </w:p>
-    <w:bookmarkEnd w:id="92"/>
-    <w:bookmarkStart w:id="93" w:name="ref-thaler1990"/>
+    <w:bookmarkEnd w:id="94"/>
+    <w:bookmarkStart w:id="95" w:name="ref-thaler1990"/>
     <w:p>
       <w:pPr>
         <w:pStyle w:val="Bibliography"/>
@@ -13103,8 +14417,8 @@
         <w:t xml:space="preserve">36 (6): 643–60.</w:t>
       </w:r>
     </w:p>
-    <w:bookmarkEnd w:id="93"/>
-    <w:bookmarkStart w:id="95" w:name="ref-turner2023"/>
+    <w:bookmarkEnd w:id="95"/>
+    <w:bookmarkStart w:id="97" w:name="ref-turner2023"/>
     <w:p>
       <w:pPr>
         <w:pStyle w:val="Bibliography"/>
@@ -13121,7 +14435,7 @@
       <w:r>
         <w:t xml:space="preserve"> </w:t>
       </w:r>
-      <w:hyperlink r:id="rId94">
+      <w:hyperlink r:id="rId96">
         <w:r>
           <w:rPr>
             <w:rStyle w:val="Hyperlink"/>
@@ -13133,8 +14447,8 @@
         <w:t xml:space="preserve">.</w:t>
       </w:r>
     </w:p>
-    <w:bookmarkEnd w:id="95"/>
-    <w:bookmarkStart w:id="96" w:name="ref-tversky1981"/>
+    <w:bookmarkEnd w:id="97"/>
+    <w:bookmarkStart w:id="98" w:name="ref-tversky1981"/>
     <w:p>
       <w:pPr>
         <w:pStyle w:val="Bibliography"/>
@@ -13165,8 +14479,8 @@
         <w:t xml:space="preserve">211 (4481): 453–58.</w:t>
       </w:r>
     </w:p>
-    <w:bookmarkEnd w:id="96"/>
-    <w:bookmarkStart w:id="97" w:name="ref-wang2023"/>
+    <w:bookmarkEnd w:id="98"/>
+    <w:bookmarkStart w:id="99" w:name="ref-wang2023"/>
     <w:p>
       <w:pPr>
         <w:pStyle w:val="Bibliography"/>
@@ -13209,8 +14523,8 @@
         <w:t xml:space="preserve">.</w:t>
       </w:r>
     </w:p>
-    <w:bookmarkEnd w:id="97"/>
-    <w:bookmarkStart w:id="99" w:name="ref-zou2023"/>
+    <w:bookmarkEnd w:id="99"/>
+    <w:bookmarkStart w:id="101" w:name="ref-zou2023"/>
     <w:p>
       <w:pPr>
         <w:pStyle w:val="Bibliography"/>
@@ -13239,7 +14553,7 @@
       <w:r>
         <w:t xml:space="preserve"> </w:t>
       </w:r>
-      <w:hyperlink r:id="rId98">
+      <w:hyperlink r:id="rId100">
         <w:r>
           <w:rPr>
             <w:rStyle w:val="Hyperlink"/>
@@ -13251,9 +14565,9 @@
         <w:t xml:space="preserve">.</w:t>
       </w:r>
     </w:p>
-    <w:bookmarkEnd w:id="99"/>
-    <w:bookmarkEnd w:id="100"/>
-    <w:bookmarkStart w:id="101" w:name="appendix-a.-all-conditions"/>
+    <w:bookmarkEnd w:id="101"/>
+    <w:bookmarkEnd w:id="102"/>
+    <w:bookmarkStart w:id="103" w:name="appendix-a.-all-conditions"/>
     <w:p>
       <w:pPr>
         <w:pStyle w:val="Heading1"/>
@@ -13271,7 +14585,7 @@
           <w:bCs/>
           <w:b/>
         </w:rPr>
-        <w:t xml:space="preserve">Table 11:</w:t>
+        <w:t xml:space="preserve">Table 12:</w:t>
       </w:r>
       <w:r>
         <w:t xml:space="preserve"> </w:t>
@@ -13286,7 +14600,7 @@
         <w:tblW w:type="pct" w:w="4995"/>
         <w:tblLook w:firstRow="1" w:lastRow="0" w:firstColumn="0" w:lastColumn="0" w:noHBand="0" w:noVBand="0" w:val="0020"/>
         <w:jc w:val="start"/>
-        <w:tblCaption w:val="Table 11: Every condition, with going along. Ten careers per version unless stated."/>
+        <w:tblCaption w:val="Table 12: Every condition, with going along. Ten careers per version unless stated."/>
       </w:tblPr>
       <w:tblGrid>
         <w:gridCol w:w="1148"/>
@@ -13694,8 +15008,8 @@
         </w:tc>
       </w:tr>
     </w:tbl>
-    <w:bookmarkEnd w:id="101"/>
-    <w:bookmarkStart w:id="102" w:name="app:changes"/>
+    <w:bookmarkEnd w:id="103"/>
+    <w:bookmarkStart w:id="104" w:name="app:changes"/>
     <w:p>
       <w:pPr>
         <w:pStyle w:val="Heading1"/>
@@ -13835,8 +15149,8 @@
         <w:t xml:space="preserve">framing rather than a general emotion.</w:t>
       </w:r>
     </w:p>
-    <w:bookmarkEnd w:id="102"/>
-    <w:bookmarkStart w:id="103" w:name="app:prereg"/>
+    <w:bookmarkEnd w:id="104"/>
+    <w:bookmarkStart w:id="105" w:name="app:prereg"/>
     <w:p>
       <w:pPr>
         <w:pStyle w:val="Heading1"/>
@@ -13980,7 +15294,7 @@
         <w:t xml:space="preserve">first line; on the saved transcripts every pair differs from the first reply, so the pairing is not used.</w:t>
       </w:r>
     </w:p>
-    <w:bookmarkEnd w:id="103"/>
+    <w:bookmarkEnd w:id="105"/>
     <w:sectPr/>
   </w:body>
 </w:document>

</xml_diff>

<commit_message>
Matched analysis: by-request split of the history's and the request's effects; paper states the early-peak puzzle
Co-Authored-By: Claude Opus 5.5 <noreply@anthropic.com>
Claude-Session: https://claude.ai/code/session_01MMCRR3CeBf6AnYqivqwtdY
</commit_message>
<xml_diff>
--- a/designs/rd2/paper/RD2_paper.docx
+++ b/designs/rd2/paper/RD2_paper.docx
@@ -13060,25 +13060,61 @@
         <w:t xml:space="preserve"> </w:t>
       </w:r>
       <w:r>
-        <w:t xml:space="preserve">that varies the order of the requests across careers would separate them. The matched rereads add one piece: at a given</w:t>
-      </w:r>
-      <w:r>
-        <w:t xml:space="preserve"> </w:t>
-      </w:r>
-      <w:r>
-        <w:t xml:space="preserve">request, most of the framing’s effect is carried by the history it built rather than by the request’s own words. The</w:t>
-      </w:r>
-      <w:r>
-        <w:t xml:space="preserve"> </w:t>
-      </w:r>
-      <w:r>
-        <w:t xml:space="preserve">push works by accumulating; a split of the rereads by request will show whether the history’s share grows along the</w:t>
-      </w:r>
-      <w:r>
-        <w:t xml:space="preserve"> </w:t>
-      </w:r>
-      <w:r>
-        <w:t xml:space="preserve">career.</w:t>
+        <w:t xml:space="preserve">that varies the order of the requests across careers would separate them. The matched rereads add one piece and one</w:t>
+      </w:r>
+      <w:r>
+        <w:t xml:space="preserve"> </w:t>
+      </w:r>
+      <w:r>
+        <w:t xml:space="preserve">puzzle. At a given request, most of the framing’s effect is carried by the history rather than by the request’s own words;</w:t>
+      </w:r>
+      <w:r>
+        <w:t xml:space="preserve"> </w:t>
+      </w:r>
+      <w:r>
+        <w:t xml:space="preserve">yet the history does not simply pile up. Before the first request the agent has seen 6 of UBS’s framed lines, before</w:t>
+      </w:r>
+      <w:r>
+        <w:t xml:space="preserve"> </w:t>
+      </w:r>
+      <w:r>
+        <w:t xml:space="preserve">the last about 40, and going along fell rather than rose. Whatever the history carries is therefore not the amount of framed</w:t>
+      </w:r>
+      <w:r>
+        <w:t xml:space="preserve"> </w:t>
+      </w:r>
+      <w:r>
+        <w:t xml:space="preserve">talk. Three explanations remain: the part of the history that matters is built early (by 7 January the framing has</w:t>
+      </w:r>
+      <w:r>
+        <w:t xml:space="preserve"> </w:t>
+      </w:r>
+      <w:r>
+        <w:t xml:space="preserve">already changed how much the agent traded); something after January suppresses going along under every framing,</w:t>
+      </w:r>
+      <w:r>
+        <w:t xml:space="preserve"> </w:t>
+      </w:r>
+      <w:r>
+        <w:t xml:space="preserve">including neutral, leaving no room for the framing to show (later requests that are harder to join, the agent’s own</w:t>
+      </w:r>
+      <w:r>
+        <w:t xml:space="preserve"> </w:t>
+      </w:r>
+      <w:r>
+        <w:t xml:space="preserve">experience of its January trades, or framed lines diluted in a conversation that grows to 40,000 tokens); or the</w:t>
+      </w:r>
+      <w:r>
+        <w:t xml:space="preserve"> </w:t>
+      </w:r>
+      <w:r>
+        <w:t xml:space="preserve">history’s share is itself largest early. A split of the rereads by request, inside the model and in the decision, will</w:t>
+      </w:r>
+      <w:r>
+        <w:t xml:space="preserve"> </w:t>
+      </w:r>
+      <w:r>
+        <w:t xml:space="preserve">show which.</w:t>
       </w:r>
     </w:p>
     <w:p>

</xml_diff>

<commit_message>
Trading across the career: the frame keeps acting on risk-taking while joining fades
New exploratory analysis of every career's trades (activity by day, position
when asked, own-trade side at the end of each window, January outcome vs later)
and a paper section with the persistence table.

Co-Authored-By: Claude Opus 5.5 <noreply@anthropic.com>
Claude-Session: https://claude.ai/code/session_01MMCRR3CeBf6AnYqivqwtdY
</commit_message>
<xml_diff>
--- a/designs/rd2/paper/RD2_paper.docx
+++ b/designs/rd2/paper/RD2_paper.docx
@@ -2587,7 +2587,7 @@
         <w:t xml:space="preserve"> </w:t>
       </w:r>
       <w:r>
-        <w:t xml:space="preserve">of the agent (Section 7.7).</w:t>
+        <w:t xml:space="preserve">of the agent (Section 7.8).</w:t>
       </w:r>
     </w:p>
     <w:p>
@@ -6975,7 +6975,7 @@
       </w:r>
     </w:p>
     <w:bookmarkEnd w:id="39"/>
-    <w:bookmarkStart w:id="57" w:name="sec:results"/>
+    <w:bookmarkStart w:id="59" w:name="sec:results"/>
     <w:p>
       <w:pPr>
         <w:pStyle w:val="Heading1"/>
@@ -10476,13 +10476,13 @@
       </w:r>
     </w:p>
     <w:bookmarkEnd w:id="51"/>
-    <w:bookmarkStart w:id="52" w:name="what-the-agent-wrote"/>
+    <w:bookmarkStart w:id="53" w:name="sec:trading"/>
     <w:p>
       <w:pPr>
         <w:pStyle w:val="Heading2"/>
       </w:pPr>
       <w:r>
-        <w:t xml:space="preserve">7.5 What the agent wrote</w:t>
+        <w:t xml:space="preserve">7.5 What the agents traded across the career</w:t>
       </w:r>
     </w:p>
     <w:p>
@@ -10490,37 +10490,65 @@
         <w:pStyle w:val="FirstParagraph"/>
       </w:pPr>
       <w:r>
-        <w:t xml:space="preserve">A rough word screen of the agent’s reasoning, to be checked by a blind reading, suggests three things. Management’s loss</w:t>
-      </w:r>
-      <w:r>
-        <w:t xml:space="preserve"> </w:t>
-      </w:r>
-      <w:r>
-        <w:t xml:space="preserve">story appears in the agent’s words after the memo, returns when UBS makes a request (for example, from 4% to 12% of</w:t>
-      </w:r>
-      <w:r>
-        <w:t xml:space="preserve"> </w:t>
-      </w:r>
-      <w:r>
-        <w:t xml:space="preserve">replies under A’s loss + you), and fades from its words by the second trading day (2–10%) while its positions stay</w:t>
-      </w:r>
-      <w:r>
-        <w:t xml:space="preserve"> </w:t>
-      </w:r>
-      <w:r>
-        <w:t xml:space="preserve">large. UBS’s framing is not voiced: in B and F, agents under loss framing use loss words no more often than neutral</w:t>
-      </w:r>
-      <w:r>
-        <w:t xml:space="preserve"> </w:t>
-      </w:r>
-      <w:r>
-        <w:t xml:space="preserve">agents, although that is where going along rises. And bringing up the loss story unprompted before a request does not</w:t>
-      </w:r>
-      <w:r>
-        <w:t xml:space="preserve"> </w:t>
-      </w:r>
-      <w:r>
-        <w:t xml:space="preserve">predict going along (+3 points within experiment, framing and request;</w:t>
+        <w:t xml:space="preserve">Going along is one decision per request, scored from trades; the rest of the trading record shows what else the framing</w:t>
+      </w:r>
+      <w:r>
+        <w:t xml:space="preserve"> </w:t>
+      </w:r>
+      <w:r>
+        <w:t xml:space="preserve">did (exploratory). Each day’s position is closed at 14:00, so what carries from one trading day to the next is the</w:t>
+      </w:r>
+      <w:r>
+        <w:t xml:space="preserve"> </w:t>
+      </w:r>
+      <w:r>
+        <w:t xml:space="preserve">conversation: the agent’s replies, its orders and the results it is told.</w:t>
+      </w:r>
+    </w:p>
+    <w:bookmarkStart w:id="52" w:name="tab:persist"/>
+    <w:p>
+      <w:pPr>
+        <w:pStyle w:val="TableCaption"/>
+      </w:pPr>
+      <w:r>
+        <w:rPr>
+          <w:bCs/>
+          <w:b/>
+        </w:rPr>
+        <w:t xml:space="preserve">Table 10:</w:t>
+      </w:r>
+      <w:r>
+        <w:t xml:space="preserve"> </w:t>
+      </w:r>
+      <w:r>
+        <w:t xml:space="preserve">The frame keeps acting on risk-taking. Thousands of ounces traded before the first chat of the day, loss</w:t>
+      </w:r>
+      <w:r>
+        <w:t xml:space="preserve"> </w:t>
+      </w:r>
+      <w:r>
+        <w:t xml:space="preserve">framings minus gain framings (</w:t>
+      </w:r>
+      <w:r>
+        <w:t xml:space="preserve">“</w:t>
+      </w:r>
+      <w:r>
+        <w:t xml:space="preserve">+ you</w:t>
+      </w:r>
+      <w:r>
+        <w:t xml:space="preserve">”</w:t>
+      </w:r>
+      <w:r>
+        <w:t xml:space="preserve"> </w:t>
+      </w:r>
+      <w:r>
+        <w:t xml:space="preserve">and not pooled), on the first trading day and over the three later ones (1 April, 8 June and</w:t>
+      </w:r>
+      <w:r>
+        <w:t xml:space="preserve"> </w:t>
+      </w:r>
+      <w:r>
+        <w:t xml:space="preserve">5 August). Intervals resample careers;</w:t>
       </w:r>
       <w:r>
         <w:t xml:space="preserve"> </w:t>
@@ -10536,105 +10564,733 @@
         <w:t xml:space="preserve"> </w:t>
       </w:r>
       <w:r>
-        <w:t xml:space="preserve">= 0.42).</w:t>
-      </w:r>
-    </w:p>
+        <w:t xml:space="preserve">reshuffles careers. Exploratory.</w:t>
+      </w:r>
+    </w:p>
+    <w:tbl>
+      <w:tblPr>
+        <w:tblStyle w:val="Table"/>
+        <w:tblW w:type="pct" w:w="4995"/>
+        <w:tblLook w:firstRow="1" w:lastRow="0" w:firstColumn="0" w:lastColumn="0" w:noHBand="0" w:noVBand="0" w:val="0020"/>
+        <w:jc w:val="start"/>
+        <w:tblCaption w:val="Table 10: The frame keeps acting on risk-taking. Thousands of ounces traded before the first chat of the day, loss framings minus gain framings (“+ you” and not pooled), on the first trading day and over the three later ones (1 April, 8 June and 5 August). Intervals resample careers; p reshuffles careers. Exploratory."/>
+      </w:tblPr>
+      <w:tblGrid>
+        <w:gridCol w:w="2209"/>
+        <w:gridCol w:w="1283"/>
+        <w:gridCol w:w="1425"/>
+        <w:gridCol w:w="1710"/>
+        <w:gridCol w:w="1283"/>
+      </w:tblGrid>
+      <w:tr>
+        <w:trPr>
+          <w:tblHeader w:val="true"/>
+        </w:trPr>
+        <w:tc>
+          <w:tcPr/>
+          <w:p>
+            <w:pPr>
+              <w:pStyle w:val="Compact"/>
+              <w:jc w:val="left"/>
+            </w:pPr>
+            <w:r>
+              <w:rPr>
+                <w:bCs/>
+                <w:b/>
+              </w:rPr>
+              <w:t xml:space="preserve">Experiment</w:t>
+            </w:r>
+          </w:p>
+        </w:tc>
+        <w:tc>
+          <w:tcPr/>
+          <w:p>
+            <w:pPr>
+              <w:pStyle w:val="Compact"/>
+              <w:jc w:val="center"/>
+            </w:pPr>
+            <w:r>
+              <w:rPr>
+                <w:bCs/>
+                <w:b/>
+              </w:rPr>
+              <w:t xml:space="preserve">7 January</w:t>
+            </w:r>
+          </w:p>
+        </w:tc>
+        <w:tc>
+          <w:tcPr/>
+          <w:p>
+            <w:pPr>
+              <w:pStyle w:val="Compact"/>
+              <w:jc w:val="center"/>
+            </w:pPr>
+            <w:r>
+              <w:rPr>
+                <w:bCs/>
+                <w:b/>
+              </w:rPr>
+              <w:t xml:space="preserve">Later days</w:t>
+            </w:r>
+          </w:p>
+        </w:tc>
+        <w:tc>
+          <w:tcPr/>
+          <w:p>
+            <w:pPr>
+              <w:pStyle w:val="Compact"/>
+              <w:jc w:val="center"/>
+            </w:pPr>
+            <w:r>
+              <w:rPr>
+                <w:bCs/>
+                <w:b/>
+              </w:rPr>
+              <w:t xml:space="preserve">95% interval</w:t>
+            </w:r>
+          </w:p>
+        </w:tc>
+        <w:tc>
+          <w:tcPr/>
+          <w:p>
+            <w:pPr>
+              <w:pStyle w:val="Compact"/>
+              <w:jc w:val="center"/>
+            </w:pPr>
+            <w:r>
+              <w:rPr>
+                <w:iCs/>
+                <w:i/>
+                <w:bCs/>
+                <w:b/>
+              </w:rPr>
+              <w:t xml:space="preserve">p</w:t>
+            </w:r>
+            <w:r>
+              <w:rPr>
+                <w:bCs/>
+                <w:b/>
+              </w:rPr>
+              <w:t xml:space="preserve"> </w:t>
+            </w:r>
+            <w:r>
+              <w:rPr>
+                <w:bCs/>
+                <w:b/>
+              </w:rPr>
+              <w:t xml:space="preserve">(later)</w:t>
+            </w:r>
+          </w:p>
+        </w:tc>
+      </w:tr>
+      <w:tr>
+        <w:tc>
+          <w:tcPr/>
+          <w:p>
+            <w:pPr>
+              <w:pStyle w:val="Compact"/>
+              <w:jc w:val="left"/>
+            </w:pPr>
+            <w:r>
+              <w:t xml:space="preserve">B: UBS’s framing</w:t>
+            </w:r>
+          </w:p>
+        </w:tc>
+        <w:tc>
+          <w:tcPr/>
+          <w:p>
+            <w:pPr>
+              <w:pStyle w:val="Compact"/>
+              <w:jc w:val="center"/>
+            </w:pPr>
+            <w:r>
+              <w:t xml:space="preserve">+74</w:t>
+            </w:r>
+          </w:p>
+        </w:tc>
+        <w:tc>
+          <w:tcPr/>
+          <w:p>
+            <w:pPr>
+              <w:pStyle w:val="Compact"/>
+              <w:jc w:val="center"/>
+            </w:pPr>
+            <w:r>
+              <w:t xml:space="preserve">+36</w:t>
+            </w:r>
+          </w:p>
+        </w:tc>
+        <w:tc>
+          <w:tcPr/>
+          <w:p>
+            <w:pPr>
+              <w:pStyle w:val="Compact"/>
+              <w:jc w:val="center"/>
+            </w:pPr>
+            <w:r>
+              <w:t xml:space="preserve">+8 to +68</w:t>
+            </w:r>
+          </w:p>
+        </w:tc>
+        <w:tc>
+          <w:tcPr/>
+          <w:p>
+            <w:pPr>
+              <w:pStyle w:val="Compact"/>
+              <w:jc w:val="center"/>
+            </w:pPr>
+            <w:r>
+              <w:t xml:space="preserve">0.017</w:t>
+            </w:r>
+          </w:p>
+        </w:tc>
+      </w:tr>
+      <w:tr>
+        <w:tc>
+          <w:tcPr/>
+          <w:p>
+            <w:pPr>
+              <w:pStyle w:val="Compact"/>
+              <w:jc w:val="left"/>
+            </w:pPr>
+            <w:r>
+              <w:t xml:space="preserve">F: UBS + Bank C</w:t>
+            </w:r>
+          </w:p>
+        </w:tc>
+        <w:tc>
+          <w:tcPr/>
+          <w:p>
+            <w:pPr>
+              <w:pStyle w:val="Compact"/>
+              <w:jc w:val="center"/>
+            </w:pPr>
+            <w:r>
+              <w:t xml:space="preserve">+60</w:t>
+            </w:r>
+          </w:p>
+        </w:tc>
+        <w:tc>
+          <w:tcPr/>
+          <w:p>
+            <w:pPr>
+              <w:pStyle w:val="Compact"/>
+              <w:jc w:val="center"/>
+            </w:pPr>
+            <w:r>
+              <w:t xml:space="preserve">+43</w:t>
+            </w:r>
+          </w:p>
+        </w:tc>
+        <w:tc>
+          <w:tcPr/>
+          <w:p>
+            <w:pPr>
+              <w:pStyle w:val="Compact"/>
+              <w:jc w:val="center"/>
+            </w:pPr>
+            <w:r>
+              <w:t xml:space="preserve">+7 to +88</w:t>
+            </w:r>
+          </w:p>
+        </w:tc>
+        <w:tc>
+          <w:tcPr/>
+          <w:p>
+            <w:pPr>
+              <w:pStyle w:val="Compact"/>
+              <w:jc w:val="center"/>
+            </w:pPr>
+            <w:r>
+              <w:t xml:space="preserve">0.039</w:t>
+            </w:r>
+          </w:p>
+        </w:tc>
+      </w:tr>
+      <w:tr>
+        <w:tc>
+          <w:tcPr/>
+          <w:p>
+            <w:pPr>
+              <w:pStyle w:val="Compact"/>
+              <w:jc w:val="left"/>
+            </w:pPr>
+            <w:r>
+              <w:t xml:space="preserve">D: Management + UBS</w:t>
+            </w:r>
+          </w:p>
+        </w:tc>
+        <w:tc>
+          <w:tcPr/>
+          <w:p>
+            <w:pPr>
+              <w:pStyle w:val="Compact"/>
+              <w:jc w:val="center"/>
+            </w:pPr>
+            <w:r>
+              <w:t xml:space="preserve">+102</w:t>
+            </w:r>
+          </w:p>
+        </w:tc>
+        <w:tc>
+          <w:tcPr/>
+          <w:p>
+            <w:pPr>
+              <w:pStyle w:val="Compact"/>
+              <w:jc w:val="center"/>
+            </w:pPr>
+            <w:r>
+              <w:t xml:space="preserve">+128</w:t>
+            </w:r>
+          </w:p>
+        </w:tc>
+        <w:tc>
+          <w:tcPr/>
+          <w:p>
+            <w:pPr>
+              <w:pStyle w:val="Compact"/>
+              <w:jc w:val="center"/>
+            </w:pPr>
+            <w:r>
+              <w:t xml:space="preserve">+43 to +220</w:t>
+            </w:r>
+          </w:p>
+        </w:tc>
+        <w:tc>
+          <w:tcPr/>
+          <w:p>
+            <w:pPr>
+              <w:pStyle w:val="Compact"/>
+              <w:jc w:val="center"/>
+            </w:pPr>
+            <w:r>
+              <w:t xml:space="preserve">0.008</w:t>
+            </w:r>
+          </w:p>
+        </w:tc>
+      </w:tr>
+      <w:tr>
+        <w:tc>
+          <w:tcPr/>
+          <w:p>
+            <w:pPr>
+              <w:pStyle w:val="Compact"/>
+              <w:jc w:val="left"/>
+            </w:pPr>
+            <w:r>
+              <w:t xml:space="preserve">E: Management + UBS + Bank C</w:t>
+            </w:r>
+          </w:p>
+        </w:tc>
+        <w:tc>
+          <w:tcPr/>
+          <w:p>
+            <w:pPr>
+              <w:pStyle w:val="Compact"/>
+              <w:jc w:val="center"/>
+            </w:pPr>
+            <w:r>
+              <w:t xml:space="preserve">+292</w:t>
+            </w:r>
+          </w:p>
+        </w:tc>
+        <w:tc>
+          <w:tcPr/>
+          <w:p>
+            <w:pPr>
+              <w:pStyle w:val="Compact"/>
+              <w:jc w:val="center"/>
+            </w:pPr>
+            <w:r>
+              <w:t xml:space="preserve">+114</w:t>
+            </w:r>
+          </w:p>
+        </w:tc>
+        <w:tc>
+          <w:tcPr/>
+          <w:p>
+            <w:pPr>
+              <w:pStyle w:val="Compact"/>
+              <w:jc w:val="center"/>
+            </w:pPr>
+            <w:r>
+              <w:t xml:space="preserve">+43 to +190</w:t>
+            </w:r>
+          </w:p>
+        </w:tc>
+        <w:tc>
+          <w:tcPr/>
+          <w:p>
+            <w:pPr>
+              <w:pStyle w:val="Compact"/>
+              <w:jc w:val="center"/>
+            </w:pPr>
+            <w:r>
+              <w:t xml:space="preserve">0.003</w:t>
+            </w:r>
+          </w:p>
+        </w:tc>
+      </w:tr>
+      <w:tr>
+        <w:tc>
+          <w:tcPr/>
+          <w:p>
+            <w:pPr>
+              <w:pStyle w:val="Compact"/>
+              <w:jc w:val="left"/>
+            </w:pPr>
+            <w:r>
+              <w:t xml:space="preserve">A: Management</w:t>
+            </w:r>
+          </w:p>
+        </w:tc>
+        <w:tc>
+          <w:tcPr/>
+          <w:p>
+            <w:pPr>
+              <w:pStyle w:val="Compact"/>
+              <w:jc w:val="center"/>
+            </w:pPr>
+            <w:r>
+              <w:t xml:space="preserve">+131</w:t>
+            </w:r>
+          </w:p>
+        </w:tc>
+        <w:tc>
+          <w:tcPr/>
+          <w:p>
+            <w:pPr>
+              <w:pStyle w:val="Compact"/>
+              <w:jc w:val="center"/>
+            </w:pPr>
+            <w:r>
+              <w:t xml:space="preserve">+159</w:t>
+            </w:r>
+          </w:p>
+        </w:tc>
+        <w:tc>
+          <w:tcPr/>
+          <w:p>
+            <w:pPr>
+              <w:pStyle w:val="Compact"/>
+              <w:jc w:val="center"/>
+            </w:pPr>
+            <w:r>
+              <w:t xml:space="preserve">+42 to +285</w:t>
+            </w:r>
+          </w:p>
+        </w:tc>
+        <w:tc>
+          <w:tcPr/>
+          <w:p>
+            <w:pPr>
+              <w:pStyle w:val="Compact"/>
+              <w:jc w:val="center"/>
+            </w:pPr>
+            <w:r>
+              <w:t xml:space="preserve">0.036</w:t>
+            </w:r>
+          </w:p>
+        </w:tc>
+      </w:tr>
+    </w:tbl>
     <w:bookmarkEnd w:id="52"/>
-    <w:bookmarkStart w:id="54" w:name="sec:inside"/>
-    <w:p>
-      <w:pPr>
-        <w:pStyle w:val="Heading2"/>
-      </w:pPr>
-      <w:r>
-        <w:t xml:space="preserve">7.6 Inside the model</w:t>
-      </w:r>
-    </w:p>
-    <w:p>
-      <w:pPr>
-        <w:pStyle w:val="FirstParagraph"/>
+    <w:p>
+      <w:pPr>
+        <w:pStyle w:val="BodyText"/>
       </w:pPr>
       <w:r>
         <w:rPr>
           <w:bCs/>
           <w:b/>
         </w:rPr>
-        <w:t xml:space="preserve">The framing registers at the decision.</w:t>
-      </w:r>
-      <w:r>
-        <w:t xml:space="preserve"> </w:t>
-      </w:r>
-      <w:r>
-        <w:t xml:space="preserve">Within the same request, many Gemma Scope 2 features differ between</w:t>
-      </w:r>
-      <w:r>
-        <w:t xml:space="preserve"> </w:t>
-      </w:r>
-      <w:r>
-        <w:t xml:space="preserve">framings at the last token before the agent’s reply (Table 10): between loss and gain, 23 to 59 features</w:t>
-      </w:r>
-      <w:r>
-        <w:t xml:space="preserve"> </w:t>
-      </w:r>
-      <w:r>
-        <w:t xml:space="preserve">per layer pass a false-discovery threshold of 0.05; between</w:t>
-      </w:r>
-      <w:r>
-        <w:t xml:space="preserve"> </w:t>
-      </w:r>
-      <w:r>
-        <w:t xml:space="preserve">“</w:t>
-      </w:r>
-      <w:r>
-        <w:t xml:space="preserve">you</w:t>
-      </w:r>
-      <w:r>
-        <w:t xml:space="preserve">”</w:t>
-      </w:r>
-      <w:r>
-        <w:t xml:space="preserve"> </w:t>
-      </w:r>
-      <w:r>
-        <w:t xml:space="preserve">and no</w:t>
-      </w:r>
-      <w:r>
-        <w:t xml:space="preserve"> </w:t>
-      </w:r>
-      <w:r>
-        <w:t xml:space="preserve">“</w:t>
-      </w:r>
-      <w:r>
-        <w:t xml:space="preserve">you</w:t>
-      </w:r>
-      <w:r>
-        <w:t xml:space="preserve">”</w:t>
-      </w:r>
-      <w:r>
-        <w:t xml:space="preserve">, 16 to 64; between framed and neutral,</w:t>
-      </w:r>
-      <w:r>
-        <w:t xml:space="preserve"> </w:t>
-      </w:r>
-      <w:r>
-        <w:t xml:space="preserve">17 to 36. Management’s memo is visible at layer 12 (27 features) and fades with depth (4 at layer 41). The features</w:t>
-      </w:r>
-      <w:r>
-        <w:t xml:space="preserve"> </w:t>
-      </w:r>
-      <w:r>
-        <w:t xml:space="preserve">have not yet been named.</w:t>
-      </w:r>
-    </w:p>
-    <w:bookmarkStart w:id="53" w:name="tab:features"/>
-    <w:p>
-      <w:pPr>
-        <w:pStyle w:val="TableCaption"/>
+        <w:t xml:space="preserve">The frame keeps acting on risk-taking.</w:t>
+      </w:r>
+      <w:r>
+        <w:t xml:space="preserve"> </w:t>
+      </w:r>
+      <w:r>
+        <w:t xml:space="preserve">On every trading day, agents under a loss frame traded more before</w:t>
+      </w:r>
+      <w:r>
+        <w:t xml:space="preserve"> </w:t>
+      </w:r>
+      <w:r>
+        <w:t xml:space="preserve">the first chat than agents under a gain frame, and the difference held through August in every experiment</w:t>
+      </w:r>
+      <w:r>
+        <w:t xml:space="preserve"> </w:t>
+      </w:r>
+      <w:r>
+        <w:t xml:space="preserve">(Table 10). In B the gap comes mostly from gain-framed agents, which traded almost nothing before the first</w:t>
+      </w:r>
+      <w:r>
+        <w:t xml:space="preserve"> </w:t>
+      </w:r>
+      <w:r>
+        <w:t xml:space="preserve">chat on most days. Against the neutral memo, management’s loss priming shrank but remained: in A, from 508,000 ounces</w:t>
+      </w:r>
+      <w:r>
+        <w:t xml:space="preserve"> </w:t>
+      </w:r>
+      <w:r>
+        <w:t xml:space="preserve">more on 7 January to 172,000 on 5 August (both</w:t>
+      </w:r>
+      <w:r>
+        <w:t xml:space="preserve"> </w:t>
+      </w:r>
+      <w:r>
+        <w:rPr>
+          <w:iCs/>
+          <w:i/>
+        </w:rPr>
+        <w:t xml:space="preserve">p</w:t>
+      </w:r>
+      <w:r>
+        <w:t xml:space="preserve"> </w:t>
+      </w:r>
+      <w:r>
+        <w:t xml:space="preserve">&lt; 0.02).</w:t>
+      </w:r>
+    </w:p>
+    <w:p>
+      <w:pPr>
+        <w:pStyle w:val="BodyText"/>
       </w:pPr>
       <w:r>
         <w:rPr>
           <w:bCs/>
           <w:b/>
         </w:rPr>
-        <w:t xml:space="preserve">Table 10:</w:t>
+        <w:t xml:space="preserve">Trading grows while joining stops.</w:t>
+      </w:r>
+      <w:r>
+        <w:t xml:space="preserve"> </w:t>
+      </w:r>
+      <w:r>
+        <w:t xml:space="preserve">Agents in every version, neutral included, traded far more after January</w:t>
+      </w:r>
+      <w:r>
+        <w:t xml:space="preserve"> </w:t>
+      </w:r>
+      <w:r>
+        <w:t xml:space="preserve">(in B, 0.74 to 0.99 million ounces a day from April on, against 0.09 to 0.50 million in January) and lost money on every</w:t>
+      </w:r>
+      <w:r>
+        <w:t xml:space="preserve"> </w:t>
+      </w:r>
+      <w:r>
+        <w:t xml:space="preserve">later day. Going along stopped; trading did not. Later in the career, loss-framed agents in B were often already</w:t>
+      </w:r>
+      <w:r>
+        <w:t xml:space="preserve"> </w:t>
+      </w:r>
+      <w:r>
+        <w:t xml:space="preserve">positioned when asked: at the 1 April request 40% already held UBS’s side without adding to it, and at the two 8 June</w:t>
+      </w:r>
+      <w:r>
+        <w:t xml:space="preserve"> </w:t>
+      </w:r>
+      <w:r>
+        <w:t xml:space="preserve">requests 40% held the opposite side, against 10% of neutral agents in each case. The frame moved how the agent stood</w:t>
+      </w:r>
+      <w:r>
+        <w:t xml:space="preserve"> </w:t>
+      </w:r>
+      <w:r>
+        <w:t xml:space="preserve">when the request arrived, in both directions.</w:t>
+      </w:r>
+    </w:p>
+    <w:p>
+      <w:pPr>
+        <w:pStyle w:val="BodyText"/>
+      </w:pPr>
+      <w:r>
+        <w:rPr>
+          <w:bCs/>
+          <w:b/>
+        </w:rPr>
+        <w:t xml:space="preserve">January’s outcome does not explain the stop.</w:t>
+      </w:r>
+      <w:r>
+        <w:t xml:space="preserve"> </w:t>
+      </w:r>
+      <w:r>
+        <w:t xml:space="preserve">Joining in January neither earned nor lost money compared with</w:t>
+      </w:r>
+      <w:r>
+        <w:t xml:space="preserve"> </w:t>
+      </w:r>
+      <w:r>
+        <w:t xml:space="preserve">refusing (B: +$0.03 million, interval −0.03 to +0.08), and careers that lost money in January went along later no</w:t>
+      </w:r>
+      <w:r>
+        <w:t xml:space="preserve"> </w:t>
+      </w:r>
+      <w:r>
+        <w:t xml:space="preserve">more than those that did not (0% against 4% in B).</w:t>
+      </w:r>
+    </w:p>
+    <w:bookmarkEnd w:id="53"/>
+    <w:bookmarkStart w:id="54" w:name="what-the-agent-wrote"/>
+    <w:p>
+      <w:pPr>
+        <w:pStyle w:val="Heading2"/>
+      </w:pPr>
+      <w:r>
+        <w:t xml:space="preserve">7.6 What the agent wrote</w:t>
+      </w:r>
+    </w:p>
+    <w:p>
+      <w:pPr>
+        <w:pStyle w:val="FirstParagraph"/>
+      </w:pPr>
+      <w:r>
+        <w:t xml:space="preserve">A rough word screen of the agent’s reasoning, to be checked by a blind reading, suggests three things. Management’s loss</w:t>
+      </w:r>
+      <w:r>
+        <w:t xml:space="preserve"> </w:t>
+      </w:r>
+      <w:r>
+        <w:t xml:space="preserve">story appears in the agent’s words after the memo, returns when UBS makes a request (for example, from 4% to 12% of</w:t>
+      </w:r>
+      <w:r>
+        <w:t xml:space="preserve"> </w:t>
+      </w:r>
+      <w:r>
+        <w:t xml:space="preserve">replies under A’s loss + you), and fades from its words by the second trading day (2–10%) while its positions stay</w:t>
+      </w:r>
+      <w:r>
+        <w:t xml:space="preserve"> </w:t>
+      </w:r>
+      <w:r>
+        <w:t xml:space="preserve">large. UBS’s framing is not voiced: in B and F, agents under loss framing use loss words no more often than neutral</w:t>
+      </w:r>
+      <w:r>
+        <w:t xml:space="preserve"> </w:t>
+      </w:r>
+      <w:r>
+        <w:t xml:space="preserve">agents, although that is where going along rises. And bringing up the loss story unprompted before a request does not</w:t>
+      </w:r>
+      <w:r>
+        <w:t xml:space="preserve"> </w:t>
+      </w:r>
+      <w:r>
+        <w:t xml:space="preserve">predict going along (+3 points within experiment, framing and request;</w:t>
+      </w:r>
+      <w:r>
+        <w:t xml:space="preserve"> </w:t>
+      </w:r>
+      <w:r>
+        <w:rPr>
+          <w:iCs/>
+          <w:i/>
+        </w:rPr>
+        <w:t xml:space="preserve">p</w:t>
+      </w:r>
+      <w:r>
+        <w:t xml:space="preserve"> </w:t>
+      </w:r>
+      <w:r>
+        <w:t xml:space="preserve">= 0.42).</w:t>
+      </w:r>
+    </w:p>
+    <w:bookmarkEnd w:id="54"/>
+    <w:bookmarkStart w:id="56" w:name="sec:inside"/>
+    <w:p>
+      <w:pPr>
+        <w:pStyle w:val="Heading2"/>
+      </w:pPr>
+      <w:r>
+        <w:t xml:space="preserve">7.7 Inside the model</w:t>
+      </w:r>
+    </w:p>
+    <w:p>
+      <w:pPr>
+        <w:pStyle w:val="FirstParagraph"/>
+      </w:pPr>
+      <w:r>
+        <w:rPr>
+          <w:bCs/>
+          <w:b/>
+        </w:rPr>
+        <w:t xml:space="preserve">The framing registers at the decision.</w:t>
+      </w:r>
+      <w:r>
+        <w:t xml:space="preserve"> </w:t>
+      </w:r>
+      <w:r>
+        <w:t xml:space="preserve">Within the same request, many Gemma Scope 2 features differ between</w:t>
+      </w:r>
+      <w:r>
+        <w:t xml:space="preserve"> </w:t>
+      </w:r>
+      <w:r>
+        <w:t xml:space="preserve">framings at the last token before the agent’s reply (Table 11): between loss and gain, 23 to 59 features</w:t>
+      </w:r>
+      <w:r>
+        <w:t xml:space="preserve"> </w:t>
+      </w:r>
+      <w:r>
+        <w:t xml:space="preserve">per layer pass a false-discovery threshold of 0.05; between</w:t>
+      </w:r>
+      <w:r>
+        <w:t xml:space="preserve"> </w:t>
+      </w:r>
+      <w:r>
+        <w:t xml:space="preserve">“</w:t>
+      </w:r>
+      <w:r>
+        <w:t xml:space="preserve">you</w:t>
+      </w:r>
+      <w:r>
+        <w:t xml:space="preserve">”</w:t>
+      </w:r>
+      <w:r>
+        <w:t xml:space="preserve"> </w:t>
+      </w:r>
+      <w:r>
+        <w:t xml:space="preserve">and no</w:t>
+      </w:r>
+      <w:r>
+        <w:t xml:space="preserve"> </w:t>
+      </w:r>
+      <w:r>
+        <w:t xml:space="preserve">“</w:t>
+      </w:r>
+      <w:r>
+        <w:t xml:space="preserve">you</w:t>
+      </w:r>
+      <w:r>
+        <w:t xml:space="preserve">”</w:t>
+      </w:r>
+      <w:r>
+        <w:t xml:space="preserve">, 16 to 64; between framed and neutral,</w:t>
+      </w:r>
+      <w:r>
+        <w:t xml:space="preserve"> </w:t>
+      </w:r>
+      <w:r>
+        <w:t xml:space="preserve">17 to 36. Management’s memo is visible at layer 12 (27 features) and fades with depth (4 at layer 41). The features</w:t>
+      </w:r>
+      <w:r>
+        <w:t xml:space="preserve"> </w:t>
+      </w:r>
+      <w:r>
+        <w:t xml:space="preserve">have not yet been named.</w:t>
+      </w:r>
+    </w:p>
+    <w:bookmarkStart w:id="55" w:name="tab:features"/>
+    <w:p>
+      <w:pPr>
+        <w:pStyle w:val="TableCaption"/>
+      </w:pPr>
+      <w:r>
+        <w:rPr>
+          <w:bCs/>
+          <w:b/>
+        </w:rPr>
+        <w:t xml:space="preserve">Table 11:</w:t>
       </w:r>
       <w:r>
         <w:t xml:space="preserve"> </w:t>
@@ -10661,7 +11317,7 @@
         <w:tblW w:type="pct" w:w="5000"/>
         <w:tblLook w:firstRow="1" w:lastRow="0" w:firstColumn="0" w:lastColumn="0" w:noHBand="0" w:noVBand="0" w:val="0020"/>
         <w:jc w:val="start"/>
-        <w:tblCaption w:val="Table 10: Number of Gemma Scope 2 features (16k, residual stream) that differ at the decision, within the same request, at a false-discovery rate of 0.05. In brackets: how many of the 15 features that differ most on half the careers differ the same way on the other half. Moments: 1,740 decisions across all experiments."/>
+        <w:tblCaption w:val="Table 11: Number of Gemma Scope 2 features (16k, residual stream) that differ at the decision, within the same request, at a false-discovery rate of 0.05. In brackets: how many of the 15 features that differ most on half the careers differ the same way on the other half. Moments: 1,740 decisions across all experiments."/>
       </w:tblPr>
       <w:tblGrid>
         <w:gridCol w:w="4625"/>
@@ -11096,7 +11752,7 @@
         </w:tc>
       </w:tr>
     </w:tbl>
-    <w:bookmarkEnd w:id="53"/>
+    <w:bookmarkEnd w:id="55"/>
     <w:p>
       <w:pPr>
         <w:pStyle w:val="BodyText"/>
@@ -11112,7 +11768,7 @@
         <w:t xml:space="preserve"> </w:t>
       </w:r>
       <w:r>
-        <w:t xml:space="preserve">Three checks qualify Table 10. The framing’s</w:t>
+        <w:t xml:space="preserve">Three checks qualify Table 11. The framing’s</w:t>
       </w:r>
       <w:r>
         <w:t xml:space="preserve"> </w:t>
@@ -11418,17 +12074,17 @@
         <w:t xml:space="preserve">represented framing causes going along.</w:t>
       </w:r>
     </w:p>
-    <w:bookmarkEnd w:id="54"/>
-    <w:bookmarkStart w:id="56" w:name="sec:matched"/>
+    <w:bookmarkEnd w:id="56"/>
+    <w:bookmarkStart w:id="58" w:name="sec:matched"/>
     <w:p>
       <w:pPr>
         <w:pStyle w:val="Heading2"/>
       </w:pPr>
       <w:r>
-        <w:t xml:space="preserve">7.7 Same moment, different frame</w:t>
-      </w:r>
-    </w:p>
-    <w:bookmarkStart w:id="55" w:name="tab:matched"/>
+        <w:t xml:space="preserve">7.8 Same moment, different frame</w:t>
+      </w:r>
+    </w:p>
+    <w:bookmarkStart w:id="57" w:name="tab:matched"/>
     <w:p>
       <w:pPr>
         <w:pStyle w:val="TableCaption"/>
@@ -11438,7 +12094,7 @@
           <w:bCs/>
           <w:b/>
         </w:rPr>
-        <w:t xml:space="preserve">Table 11:</w:t>
+        <w:t xml:space="preserve">Table 12:</w:t>
       </w:r>
       <w:r>
         <w:t xml:space="preserve"> </w:t>
@@ -11471,7 +12127,7 @@
         <w:tblW w:type="pct" w:w="5000"/>
         <w:tblLook w:firstRow="1" w:lastRow="0" w:firstColumn="0" w:lastColumn="0" w:noHBand="0" w:noVBand="0" w:val="0020"/>
         <w:jc w:val="start"/>
-        <w:tblCaption w:val="Table 11: Same moment, different frame (Experiment B). The probability of an order that goes along, after a fixed neutral reasoning line, for 300 saved decisions (50 careers, six requests). The request’s effect compares versions of the same moment, so the history is identical; the history’s effect compares careers given the same neutral request. Changes in percentage points."/>
+        <w:tblCaption w:val="Table 12: Same moment, different frame (Experiment B). The probability of an order that goes along, after a fixed neutral reasoning line, for 300 saved decisions (50 careers, six requests). The request’s effect compares versions of the same moment, so the history is identical; the history’s effect compares careers given the same neutral request. Changes in percentage points."/>
       </w:tblPr>
       <w:tblGrid>
         <w:gridCol w:w="3072"/>
@@ -12297,7 +12953,7 @@
         </w:tc>
       </w:tr>
     </w:tbl>
-    <w:bookmarkEnd w:id="55"/>
+    <w:bookmarkEnd w:id="57"/>
     <w:p>
       <w:pPr>
         <w:pStyle w:val="BodyText"/>
@@ -12319,7 +12975,7 @@
         <w:t xml:space="preserve"> </w:t>
       </w:r>
       <w:r>
-        <w:t xml:space="preserve">probability of an order that goes along by a few points (Table 11): loss framing by 5.6 points over the</w:t>
+        <w:t xml:space="preserve">probability of an order that goes along by a few points (Table 12): loss framing by 5.6 points over the</w:t>
       </w:r>
       <w:r>
         <w:t xml:space="preserve"> </w:t>
@@ -12758,9 +13414,9 @@
         <w:t xml:space="preserve">]</w:t>
       </w:r>
     </w:p>
-    <w:bookmarkEnd w:id="56"/>
-    <w:bookmarkEnd w:id="57"/>
-    <w:bookmarkStart w:id="58" w:name="sec:discussion"/>
+    <w:bookmarkEnd w:id="58"/>
+    <w:bookmarkEnd w:id="59"/>
+    <w:bookmarkStart w:id="60" w:name="sec:discussion"/>
     <w:p>
       <w:pPr>
         <w:pStyle w:val="Heading1"/>
@@ -13036,85 +13692,67 @@
         <w:t xml:space="preserve"> </w:t>
       </w:r>
       <w:r>
-        <w:t xml:space="preserve">after many decisions, and setbacks that make the objective harder to reach. In these careers the framing acted most at the</w:t>
-      </w:r>
-      <w:r>
-        <w:t xml:space="preserve"> </w:t>
-      </w:r>
-      <w:r>
-        <w:t xml:space="preserve">first two requests, and going along nearly stopped afterwards under every framing. Neither hypothesis fits: the framing’s</w:t>
-      </w:r>
-      <w:r>
-        <w:t xml:space="preserve"> </w:t>
-      </w:r>
-      <w:r>
-        <w:t xml:space="preserve">effect did not persist, and going along did not rise as the career went on. Because every career meets the requests in</w:t>
-      </w:r>
-      <w:r>
-        <w:t xml:space="preserve"> </w:t>
-      </w:r>
-      <w:r>
-        <w:t xml:space="preserve">the same order, however, this cannot separate a framing that fades from later requests that are harder to join. A design</w:t>
-      </w:r>
-      <w:r>
-        <w:t xml:space="preserve"> </w:t>
-      </w:r>
-      <w:r>
-        <w:t xml:space="preserve">that varies the order of the requests across careers would separate them. The matched rereads add one piece and one</w:t>
-      </w:r>
-      <w:r>
-        <w:t xml:space="preserve"> </w:t>
-      </w:r>
-      <w:r>
-        <w:t xml:space="preserve">puzzle. At a given request, most of the framing’s effect is carried by the history rather than by the request’s own words;</w:t>
-      </w:r>
-      <w:r>
-        <w:t xml:space="preserve"> </w:t>
-      </w:r>
-      <w:r>
-        <w:t xml:space="preserve">yet the history does not simply pile up. Before the first request the agent has seen 6 of UBS’s framed lines, before</w:t>
-      </w:r>
-      <w:r>
-        <w:t xml:space="preserve"> </w:t>
-      </w:r>
-      <w:r>
-        <w:t xml:space="preserve">the last about 40, and going along fell rather than rose. Whatever the history carries is therefore not the amount of framed</w:t>
-      </w:r>
-      <w:r>
-        <w:t xml:space="preserve"> </w:t>
-      </w:r>
-      <w:r>
-        <w:t xml:space="preserve">talk. Three explanations remain: the part of the history that matters is built early (by 7 January the framing has</w:t>
-      </w:r>
-      <w:r>
-        <w:t xml:space="preserve"> </w:t>
-      </w:r>
-      <w:r>
-        <w:t xml:space="preserve">already changed how much the agent traded); something after January suppresses going along under every framing,</w:t>
-      </w:r>
-      <w:r>
-        <w:t xml:space="preserve"> </w:t>
-      </w:r>
-      <w:r>
-        <w:t xml:space="preserve">including neutral, leaving no room for the framing to show (later requests that are harder to join, the agent’s own</w:t>
-      </w:r>
-      <w:r>
-        <w:t xml:space="preserve"> </w:t>
-      </w:r>
-      <w:r>
-        <w:t xml:space="preserve">experience of its January trades, or framed lines diluted in a conversation that grows to 40,000 tokens); or the</w:t>
-      </w:r>
-      <w:r>
-        <w:t xml:space="preserve"> </w:t>
-      </w:r>
-      <w:r>
-        <w:t xml:space="preserve">history’s share is itself largest early. A split of the rereads by request, inside the model and in the decision, will</w:t>
-      </w:r>
-      <w:r>
-        <w:t xml:space="preserve"> </w:t>
-      </w:r>
-      <w:r>
-        <w:t xml:space="preserve">show which.</w:t>
+        <w:t xml:space="preserve">after many decisions, and setbacks that make the objective harder to reach. The answer depends on which behavior one</w:t>
+      </w:r>
+      <w:r>
+        <w:t xml:space="preserve"> </w:t>
+      </w:r>
+      <w:r>
+        <w:t xml:space="preserve">watches. The framing’s push toward joining was concentrated at the first two requests and nearly stopped afterwards under</w:t>
+      </w:r>
+      <w:r>
+        <w:t xml:space="preserve"> </w:t>
+      </w:r>
+      <w:r>
+        <w:t xml:space="preserve">every framing, even as UBS’s framed lines piled up (6 before the first request, about 40 before the last). Its push</w:t>
+      </w:r>
+      <w:r>
+        <w:t xml:space="preserve"> </w:t>
+      </w:r>
+      <w:r>
+        <w:t xml:space="preserve">toward risk-taking persisted: loss-framed agents traded more before any chat than gain-framed agents on every trading day</w:t>
+      </w:r>
+      <w:r>
+        <w:t xml:space="preserve"> </w:t>
+      </w:r>
+      <w:r>
+        <w:t xml:space="preserve">through August, in every experiment (Section 7.5). Setbacks did not revive joining: every version lost money</w:t>
+      </w:r>
+      <w:r>
+        <w:t xml:space="preserve"> </w:t>
+      </w:r>
+      <w:r>
+        <w:t xml:space="preserve">from April on, and careers that lost money in January joined later no more than others. The matched rereads place most of</w:t>
+      </w:r>
+      <w:r>
+        <w:t xml:space="preserve"> </w:t>
+      </w:r>
+      <w:r>
+        <w:t xml:space="preserve">the framing’s effect on the decision in the history rather than in the request’s words; what that history carries is</w:t>
+      </w:r>
+      <w:r>
+        <w:t xml:space="preserve"> </w:t>
+      </w:r>
+      <w:r>
+        <w:t xml:space="preserve">evidently not the amount of framed talk. Because every career meets the requests in the same order, later requests that</w:t>
+      </w:r>
+      <w:r>
+        <w:t xml:space="preserve"> </w:t>
+      </w:r>
+      <w:r>
+        <w:t xml:space="preserve">are simply harder to join remain an explanation, and a design that varies their order would separate them. A split of</w:t>
+      </w:r>
+      <w:r>
+        <w:t xml:space="preserve"> </w:t>
+      </w:r>
+      <w:r>
+        <w:t xml:space="preserve">the rereads by request, and a reread that swaps the agent’s own earlier replies, will show whether the history’s pull on</w:t>
+      </w:r>
+      <w:r>
+        <w:t xml:space="preserve"> </w:t>
+      </w:r>
+      <w:r>
+        <w:t xml:space="preserve">joining fades or is overridden.</w:t>
       </w:r>
     </w:p>
     <w:p>
@@ -13246,8 +13884,8 @@
         <w:t xml:space="preserve">steering test, along the direction measured with the history fixed, are designed to answer it.</w:t>
       </w:r>
     </w:p>
-    <w:bookmarkEnd w:id="58"/>
-    <w:bookmarkStart w:id="59" w:name="limitations"/>
+    <w:bookmarkEnd w:id="60"/>
+    <w:bookmarkStart w:id="61" w:name="limitations"/>
     <w:p>
       <w:pPr>
         <w:pStyle w:val="Heading1"/>
@@ -13568,7 +14206,7 @@
         <w:t xml:space="preserve">We measure how a model responds under a framing, not anything it feels.</w:t>
       </w:r>
     </w:p>
-    <w:bookmarkEnd w:id="59"/>
+    <w:bookmarkEnd w:id="61"/>
     <w:p>
       <w:pPr>
         <w:pStyle w:val="Heading1"/>
@@ -13577,8 +14215,8 @@
         <w:t xml:space="preserve">References</w:t>
       </w:r>
     </w:p>
-    <w:bookmarkStart w:id="102" w:name="refs"/>
-    <w:bookmarkStart w:id="61" w:name="ref-alain2016"/>
+    <w:bookmarkStart w:id="104" w:name="refs"/>
+    <w:bookmarkStart w:id="63" w:name="ref-alain2016"/>
     <w:p>
       <w:pPr>
         <w:pStyle w:val="Bibliography"/>
@@ -13595,7 +14233,7 @@
       <w:r>
         <w:t xml:space="preserve"> </w:t>
       </w:r>
-      <w:hyperlink r:id="rId60">
+      <w:hyperlink r:id="rId62">
         <w:r>
           <w:rPr>
             <w:rStyle w:val="Hyperlink"/>
@@ -13607,8 +14245,8 @@
         <w:t xml:space="preserve">.</w:t>
       </w:r>
     </w:p>
-    <w:bookmarkEnd w:id="61"/>
-    <w:bookmarkStart w:id="62" w:name="ref-allen1992"/>
+    <w:bookmarkEnd w:id="63"/>
+    <w:bookmarkStart w:id="64" w:name="ref-allen1992"/>
     <w:p>
       <w:pPr>
         <w:pStyle w:val="Bibliography"/>
@@ -13639,8 +14277,8 @@
         <w:t xml:space="preserve">5 (3): 503–29.</w:t>
       </w:r>
     </w:p>
-    <w:bookmarkEnd w:id="62"/>
-    <w:bookmarkStart w:id="63" w:name="ref-asch1956"/>
+    <w:bookmarkEnd w:id="64"/>
+    <w:bookmarkStart w:id="65" w:name="ref-asch1956"/>
     <w:p>
       <w:pPr>
         <w:pStyle w:val="Bibliography"/>
@@ -13692,8 +14330,8 @@
         <w:t xml:space="preserve">70 (9): 1–70.</w:t>
       </w:r>
     </w:p>
-    <w:bookmarkEnd w:id="63"/>
-    <w:bookmarkStart w:id="65" w:name="ref-baker2025"/>
+    <w:bookmarkEnd w:id="65"/>
+    <w:bookmarkStart w:id="67" w:name="ref-baker2025"/>
     <w:p>
       <w:pPr>
         <w:pStyle w:val="Bibliography"/>
@@ -13710,7 +14348,7 @@
       <w:r>
         <w:t xml:space="preserve"> </w:t>
       </w:r>
-      <w:hyperlink r:id="rId64">
+      <w:hyperlink r:id="rId66">
         <w:r>
           <w:rPr>
             <w:rStyle w:val="Hyperlink"/>
@@ -13722,8 +14360,8 @@
         <w:t xml:space="preserve">.</w:t>
       </w:r>
     </w:p>
-    <w:bookmarkEnd w:id="65"/>
-    <w:bookmarkStart w:id="66" w:name="ref-bartling2012"/>
+    <w:bookmarkEnd w:id="67"/>
+    <w:bookmarkStart w:id="68" w:name="ref-bartling2012"/>
     <w:p>
       <w:pPr>
         <w:pStyle w:val="Bibliography"/>
@@ -13754,8 +14392,8 @@
         <w:t xml:space="preserve">79 (1): 67–87.</w:t>
       </w:r>
     </w:p>
-    <w:bookmarkEnd w:id="66"/>
-    <w:bookmarkStart w:id="67" w:name="ref-becker1968"/>
+    <w:bookmarkEnd w:id="68"/>
+    <w:bookmarkStart w:id="69" w:name="ref-becker1968"/>
     <w:p>
       <w:pPr>
         <w:pStyle w:val="Bibliography"/>
@@ -13786,8 +14424,8 @@
         <w:t xml:space="preserve">76 (2): 169–217.</w:t>
       </w:r>
     </w:p>
-    <w:bookmarkEnd w:id="67"/>
-    <w:bookmarkStart w:id="68" w:name="ref-bikhchandani1992"/>
+    <w:bookmarkEnd w:id="69"/>
+    <w:bookmarkStart w:id="70" w:name="ref-bikhchandani1992"/>
     <w:p>
       <w:pPr>
         <w:pStyle w:val="Bibliography"/>
@@ -13818,8 +14456,8 @@
         <w:t xml:space="preserve">100 (5): 992–1026.</w:t>
       </w:r>
     </w:p>
-    <w:bookmarkEnd w:id="68"/>
-    <w:bookmarkStart w:id="69" w:name="ref-falk2013"/>
+    <w:bookmarkEnd w:id="70"/>
+    <w:bookmarkStart w:id="71" w:name="ref-falk2013"/>
     <w:p>
       <w:pPr>
         <w:pStyle w:val="Bibliography"/>
@@ -13850,8 +14488,8 @@
         <w:t xml:space="preserve">340 (6133): 707–11.</w:t>
       </w:r>
     </w:p>
-    <w:bookmarkEnd w:id="69"/>
-    <w:bookmarkStart w:id="71" w:name="ref-fish2024"/>
+    <w:bookmarkEnd w:id="71"/>
+    <w:bookmarkStart w:id="73" w:name="ref-fish2024"/>
     <w:p>
       <w:pPr>
         <w:pStyle w:val="Bibliography"/>
@@ -13868,7 +14506,7 @@
       <w:r>
         <w:t xml:space="preserve"> </w:t>
       </w:r>
-      <w:hyperlink r:id="rId70">
+      <w:hyperlink r:id="rId72">
         <w:r>
           <w:rPr>
             <w:rStyle w:val="Hyperlink"/>
@@ -13880,8 +14518,8 @@
         <w:t xml:space="preserve">.</w:t>
       </w:r>
     </w:p>
-    <w:bookmarkEnd w:id="71"/>
-    <w:bookmarkStart w:id="73" w:name="ref-gemma2025"/>
+    <w:bookmarkEnd w:id="73"/>
+    <w:bookmarkStart w:id="75" w:name="ref-gemma2025"/>
     <w:p>
       <w:pPr>
         <w:pStyle w:val="Bibliography"/>
@@ -13898,7 +14536,7 @@
       <w:r>
         <w:t xml:space="preserve"> </w:t>
       </w:r>
-      <w:hyperlink r:id="rId72">
+      <w:hyperlink r:id="rId74">
         <w:r>
           <w:rPr>
             <w:rStyle w:val="Hyperlink"/>
@@ -13910,8 +14548,8 @@
         <w:t xml:space="preserve">.</w:t>
       </w:r>
     </w:p>
-    <w:bookmarkEnd w:id="73"/>
-    <w:bookmarkStart w:id="74" w:name="ref-horton2023"/>
+    <w:bookmarkEnd w:id="75"/>
+    <w:bookmarkStart w:id="76" w:name="ref-horton2023"/>
     <w:p>
       <w:pPr>
         <w:pStyle w:val="Bibliography"/>
@@ -13929,8 +14567,8 @@
         <w:t xml:space="preserve"> NBER Working Paper 31122. National Bureau of Economic Research.</w:t>
       </w:r>
     </w:p>
-    <w:bookmarkEnd w:id="74"/>
-    <w:bookmarkStart w:id="75" w:name="ref-silvercase"/>
+    <w:bookmarkEnd w:id="76"/>
+    <w:bookmarkStart w:id="77" w:name="ref-silvercase"/>
     <w:p>
       <w:pPr>
         <w:pStyle w:val="Bibliography"/>
@@ -13951,8 +14589,8 @@
         <w:t xml:space="preserve">.”</w:t>
       </w:r>
     </w:p>
-    <w:bookmarkEnd w:id="75"/>
-    <w:bookmarkStart w:id="76" w:name="ref-kahneman1979"/>
+    <w:bookmarkEnd w:id="77"/>
+    <w:bookmarkStart w:id="78" w:name="ref-kahneman1979"/>
     <w:p>
       <w:pPr>
         <w:pStyle w:val="Bibliography"/>
@@ -13983,8 +14621,8 @@
         <w:t xml:space="preserve">47 (2): 263–91.</w:t>
       </w:r>
     </w:p>
-    <w:bookmarkEnd w:id="76"/>
-    <w:bookmarkStart w:id="77" w:name="ref-koszegi2006"/>
+    <w:bookmarkEnd w:id="78"/>
+    <w:bookmarkStart w:id="79" w:name="ref-koszegi2006"/>
     <w:p>
       <w:pPr>
         <w:pStyle w:val="Bibliography"/>
@@ -14015,8 +14653,8 @@
         <w:t xml:space="preserve">121 (4): 1133–65.</w:t>
       </w:r>
     </w:p>
-    <w:bookmarkEnd w:id="77"/>
-    <w:bookmarkStart w:id="79" w:name="ref-lanham2023"/>
+    <w:bookmarkEnd w:id="79"/>
+    <w:bookmarkStart w:id="81" w:name="ref-lanham2023"/>
     <w:p>
       <w:pPr>
         <w:pStyle w:val="Bibliography"/>
@@ -14033,7 +14671,7 @@
       <w:r>
         <w:t xml:space="preserve"> </w:t>
       </w:r>
-      <w:hyperlink r:id="rId78">
+      <w:hyperlink r:id="rId80">
         <w:r>
           <w:rPr>
             <w:rStyle w:val="Hyperlink"/>
@@ -14045,8 +14683,8 @@
         <w:t xml:space="preserve">.</w:t>
       </w:r>
     </w:p>
-    <w:bookmarkEnd w:id="79"/>
-    <w:bookmarkStart w:id="81" w:name="ref-li2023"/>
+    <w:bookmarkEnd w:id="81"/>
+    <w:bookmarkStart w:id="83" w:name="ref-li2023"/>
     <w:p>
       <w:pPr>
         <w:pStyle w:val="Bibliography"/>
@@ -14063,7 +14701,7 @@
       <w:r>
         <w:t xml:space="preserve"> </w:t>
       </w:r>
-      <w:hyperlink r:id="rId80">
+      <w:hyperlink r:id="rId82">
         <w:r>
           <w:rPr>
             <w:rStyle w:val="Hyperlink"/>
@@ -14075,8 +14713,8 @@
         <w:t xml:space="preserve">.</w:t>
       </w:r>
     </w:p>
-    <w:bookmarkEnd w:id="81"/>
-    <w:bookmarkStart w:id="82" w:name="ref-lieberum2024"/>
+    <w:bookmarkEnd w:id="83"/>
+    <w:bookmarkStart w:id="84" w:name="ref-lieberum2024"/>
     <w:p>
       <w:pPr>
         <w:pStyle w:val="Bibliography"/>
@@ -14122,8 +14760,8 @@
         <w:t xml:space="preserve">, 278–300. Association for Computational Linguistics.</w:t>
       </w:r>
     </w:p>
-    <w:bookmarkEnd w:id="82"/>
-    <w:bookmarkStart w:id="83" w:name="ref-liu2024"/>
+    <w:bookmarkEnd w:id="84"/>
+    <w:bookmarkStart w:id="85" w:name="ref-liu2024"/>
     <w:p>
       <w:pPr>
         <w:pStyle w:val="Bibliography"/>
@@ -14154,8 +14792,8 @@
         <w:t xml:space="preserve">12: 157–73.</w:t>
       </w:r>
     </w:p>
-    <w:bookmarkEnd w:id="83"/>
-    <w:bookmarkStart w:id="85" w:name="ref-lynch2025"/>
+    <w:bookmarkEnd w:id="85"/>
+    <w:bookmarkStart w:id="87" w:name="ref-lynch2025"/>
     <w:p>
       <w:pPr>
         <w:pStyle w:val="Bibliography"/>
@@ -14190,7 +14828,7 @@
       <w:r>
         <w:t xml:space="preserve"> </w:t>
       </w:r>
-      <w:hyperlink r:id="rId84">
+      <w:hyperlink r:id="rId86">
         <w:r>
           <w:rPr>
             <w:rStyle w:val="Hyperlink"/>
@@ -14202,8 +14840,8 @@
         <w:t xml:space="preserve">.</w:t>
       </w:r>
     </w:p>
-    <w:bookmarkEnd w:id="85"/>
-    <w:bookmarkStart w:id="87" w:name="ref-mcdougall2025"/>
+    <w:bookmarkEnd w:id="87"/>
+    <w:bookmarkStart w:id="89" w:name="ref-mcdougall2025"/>
     <w:p>
       <w:pPr>
         <w:pStyle w:val="Bibliography"/>
@@ -14226,7 +14864,7 @@
       <w:r>
         <w:t xml:space="preserve"> </w:t>
       </w:r>
-      <w:hyperlink r:id="rId86">
+      <w:hyperlink r:id="rId88">
         <w:r>
           <w:rPr>
             <w:rStyle w:val="Hyperlink"/>
@@ -14238,8 +14876,8 @@
         <w:t xml:space="preserve">.</w:t>
       </w:r>
     </w:p>
-    <w:bookmarkEnd w:id="87"/>
-    <w:bookmarkStart w:id="88" w:name="ref-meng2022"/>
+    <w:bookmarkEnd w:id="89"/>
+    <w:bookmarkStart w:id="90" w:name="ref-meng2022"/>
     <w:p>
       <w:pPr>
         <w:pStyle w:val="Bibliography"/>
@@ -14282,8 +14920,8 @@
         <w:t xml:space="preserve">, 35:17359–72.</w:t>
       </w:r>
     </w:p>
-    <w:bookmarkEnd w:id="88"/>
-    <w:bookmarkStart w:id="90" w:name="ref-scheurer2023"/>
+    <w:bookmarkEnd w:id="90"/>
+    <w:bookmarkStart w:id="92" w:name="ref-scheurer2023"/>
     <w:p>
       <w:pPr>
         <w:pStyle w:val="Bibliography"/>
@@ -14300,7 +14938,7 @@
       <w:r>
         <w:t xml:space="preserve"> </w:t>
       </w:r>
-      <w:hyperlink r:id="rId89">
+      <w:hyperlink r:id="rId91">
         <w:r>
           <w:rPr>
             <w:rStyle w:val="Hyperlink"/>
@@ -14312,8 +14950,8 @@
         <w:t xml:space="preserve">.</w:t>
       </w:r>
     </w:p>
-    <w:bookmarkEnd w:id="90"/>
-    <w:bookmarkStart w:id="91" w:name="ref-sclar2024"/>
+    <w:bookmarkEnd w:id="92"/>
+    <w:bookmarkStart w:id="93" w:name="ref-sclar2024"/>
     <w:p>
       <w:pPr>
         <w:pStyle w:val="Bibliography"/>
@@ -14359,8 +14997,8 @@
         <w:t xml:space="preserve">.</w:t>
       </w:r>
     </w:p>
-    <w:bookmarkEnd w:id="91"/>
-    <w:bookmarkStart w:id="93" w:name="ref-sofroniew2026"/>
+    <w:bookmarkEnd w:id="93"/>
+    <w:bookmarkStart w:id="95" w:name="ref-sofroniew2026"/>
     <w:p>
       <w:pPr>
         <w:pStyle w:val="Bibliography"/>
@@ -14377,7 +15015,7 @@
       <w:r>
         <w:t xml:space="preserve"> </w:t>
       </w:r>
-      <w:hyperlink r:id="rId92">
+      <w:hyperlink r:id="rId94">
         <w:r>
           <w:rPr>
             <w:rStyle w:val="Hyperlink"/>
@@ -14389,8 +15027,8 @@
         <w:t xml:space="preserve">.</w:t>
       </w:r>
     </w:p>
-    <w:bookmarkEnd w:id="93"/>
-    <w:bookmarkStart w:id="94" w:name="ref-staw1976"/>
+    <w:bookmarkEnd w:id="95"/>
+    <w:bookmarkStart w:id="96" w:name="ref-staw1976"/>
     <w:p>
       <w:pPr>
         <w:pStyle w:val="Bibliography"/>
@@ -14421,8 +15059,8 @@
         <w:t xml:space="preserve">16 (1): 27–44.</w:t>
       </w:r>
     </w:p>
-    <w:bookmarkEnd w:id="94"/>
-    <w:bookmarkStart w:id="95" w:name="ref-thaler1990"/>
+    <w:bookmarkEnd w:id="96"/>
+    <w:bookmarkStart w:id="97" w:name="ref-thaler1990"/>
     <w:p>
       <w:pPr>
         <w:pStyle w:val="Bibliography"/>
@@ -14453,8 +15091,8 @@
         <w:t xml:space="preserve">36 (6): 643–60.</w:t>
       </w:r>
     </w:p>
-    <w:bookmarkEnd w:id="95"/>
-    <w:bookmarkStart w:id="97" w:name="ref-turner2023"/>
+    <w:bookmarkEnd w:id="97"/>
+    <w:bookmarkStart w:id="99" w:name="ref-turner2023"/>
     <w:p>
       <w:pPr>
         <w:pStyle w:val="Bibliography"/>
@@ -14471,7 +15109,7 @@
       <w:r>
         <w:t xml:space="preserve"> </w:t>
       </w:r>
-      <w:hyperlink r:id="rId96">
+      <w:hyperlink r:id="rId98">
         <w:r>
           <w:rPr>
             <w:rStyle w:val="Hyperlink"/>
@@ -14483,8 +15121,8 @@
         <w:t xml:space="preserve">.</w:t>
       </w:r>
     </w:p>
-    <w:bookmarkEnd w:id="97"/>
-    <w:bookmarkStart w:id="98" w:name="ref-tversky1981"/>
+    <w:bookmarkEnd w:id="99"/>
+    <w:bookmarkStart w:id="100" w:name="ref-tversky1981"/>
     <w:p>
       <w:pPr>
         <w:pStyle w:val="Bibliography"/>
@@ -14515,8 +15153,8 @@
         <w:t xml:space="preserve">211 (4481): 453–58.</w:t>
       </w:r>
     </w:p>
-    <w:bookmarkEnd w:id="98"/>
-    <w:bookmarkStart w:id="99" w:name="ref-wang2023"/>
+    <w:bookmarkEnd w:id="100"/>
+    <w:bookmarkStart w:id="101" w:name="ref-wang2023"/>
     <w:p>
       <w:pPr>
         <w:pStyle w:val="Bibliography"/>
@@ -14559,8 +15197,8 @@
         <w:t xml:space="preserve">.</w:t>
       </w:r>
     </w:p>
-    <w:bookmarkEnd w:id="99"/>
-    <w:bookmarkStart w:id="101" w:name="ref-zou2023"/>
+    <w:bookmarkEnd w:id="101"/>
+    <w:bookmarkStart w:id="103" w:name="ref-zou2023"/>
     <w:p>
       <w:pPr>
         <w:pStyle w:val="Bibliography"/>
@@ -14589,7 +15227,7 @@
       <w:r>
         <w:t xml:space="preserve"> </w:t>
       </w:r>
-      <w:hyperlink r:id="rId100">
+      <w:hyperlink r:id="rId102">
         <w:r>
           <w:rPr>
             <w:rStyle w:val="Hyperlink"/>
@@ -14601,9 +15239,9 @@
         <w:t xml:space="preserve">.</w:t>
       </w:r>
     </w:p>
-    <w:bookmarkEnd w:id="101"/>
-    <w:bookmarkEnd w:id="102"/>
-    <w:bookmarkStart w:id="103" w:name="appendix-a.-all-conditions"/>
+    <w:bookmarkEnd w:id="103"/>
+    <w:bookmarkEnd w:id="104"/>
+    <w:bookmarkStart w:id="105" w:name="appendix-a.-all-conditions"/>
     <w:p>
       <w:pPr>
         <w:pStyle w:val="Heading1"/>
@@ -14621,7 +15259,7 @@
           <w:bCs/>
           <w:b/>
         </w:rPr>
-        <w:t xml:space="preserve">Table 12:</w:t>
+        <w:t xml:space="preserve">Table 13:</w:t>
       </w:r>
       <w:r>
         <w:t xml:space="preserve"> </w:t>
@@ -14636,7 +15274,7 @@
         <w:tblW w:type="pct" w:w="4995"/>
         <w:tblLook w:firstRow="1" w:lastRow="0" w:firstColumn="0" w:lastColumn="0" w:noHBand="0" w:noVBand="0" w:val="0020"/>
         <w:jc w:val="start"/>
-        <w:tblCaption w:val="Table 12: Every condition, with going along. Ten careers per version unless stated."/>
+        <w:tblCaption w:val="Table 13: Every condition, with going along. Ten careers per version unless stated."/>
       </w:tblPr>
       <w:tblGrid>
         <w:gridCol w:w="1148"/>
@@ -15044,8 +15682,8 @@
         </w:tc>
       </w:tr>
     </w:tbl>
-    <w:bookmarkEnd w:id="103"/>
-    <w:bookmarkStart w:id="104" w:name="app:changes"/>
+    <w:bookmarkEnd w:id="105"/>
+    <w:bookmarkStart w:id="106" w:name="app:changes"/>
     <w:p>
       <w:pPr>
         <w:pStyle w:val="Heading1"/>
@@ -15185,8 +15823,8 @@
         <w:t xml:space="preserve">framing rather than a general emotion.</w:t>
       </w:r>
     </w:p>
-    <w:bookmarkEnd w:id="104"/>
-    <w:bookmarkStart w:id="105" w:name="app:prereg"/>
+    <w:bookmarkEnd w:id="106"/>
+    <w:bookmarkStart w:id="107" w:name="app:prereg"/>
     <w:p>
       <w:pPr>
         <w:pStyle w:val="Heading1"/>
@@ -15330,7 +15968,7 @@
         <w:t xml:space="preserve">first line; on the saved transcripts every pair differs from the first reply, so the pairing is not used.</w:t>
       </w:r>
     </w:p>
-    <w:bookmarkEnd w:id="105"/>
+    <w:bookmarkEnd w:id="107"/>
     <w:sectPr/>
   </w:body>
 </w:document>

</xml_diff>

<commit_message>
Paper: where along the career the push sits (by-request split of the matched rereads)
Co-Authored-By: Claude Opus 5.5 <noreply@anthropic.com>
Claude-Session: https://claude.ai/code/session_01MMCRR3CeBf6AnYqivqwtdY
</commit_message>
<xml_diff>
--- a/designs/rd2/paper/RD2_paper.docx
+++ b/designs/rd2/paper/RD2_paper.docx
@@ -13048,6 +13048,114 @@
           <w:bCs/>
           <w:b/>
         </w:rPr>
+        <w:t xml:space="preserve">Where along the career the push sits.</w:t>
+      </w:r>
+      <w:r>
+        <w:t xml:space="preserve"> </w:t>
+      </w:r>
+      <w:r>
+        <w:t xml:space="preserve">Split by request (exploratory; ten careers per version), the two parts</w:t>
+      </w:r>
+      <w:r>
+        <w:t xml:space="preserve"> </w:t>
+      </w:r>
+      <w:r>
+        <w:t xml:space="preserve">take turns. At the first request (7 January) the effect is the request’s own: its framing raised the probability of an</w:t>
+      </w:r>
+      <w:r>
+        <w:t xml:space="preserve"> </w:t>
+      </w:r>
+      <w:r>
+        <w:t xml:space="preserve">order that goes along by 26 points (</w:t>
+      </w:r>
+      <w:r>
+        <w:rPr>
+          <w:iCs/>
+          <w:i/>
+        </w:rPr>
+        <w:t xml:space="preserve">p</w:t>
+      </w:r>
+      <w:r>
+        <w:t xml:space="preserve"> </w:t>
+      </w:r>
+      <w:r>
+        <w:t xml:space="preserve">&lt; 0.001), and the history added nothing. At the second (12 January) it is all</w:t>
+      </w:r>
+      <w:r>
+        <w:t xml:space="preserve"> </w:t>
+      </w:r>
+      <w:r>
+        <w:t xml:space="preserve">history: framed histories raised the probability by 60 points (</w:t>
+      </w:r>
+      <w:r>
+        <w:rPr>
+          <w:iCs/>
+          <w:i/>
+        </w:rPr>
+        <w:t xml:space="preserve">p</w:t>
+      </w:r>
+      <w:r>
+        <w:t xml:space="preserve"> </w:t>
+      </w:r>
+      <w:r>
+        <w:t xml:space="preserve">&lt; 0.001), and the request’s framing added nothing.</w:t>
+      </w:r>
+      <w:r>
+        <w:t xml:space="preserve"> </w:t>
+      </w:r>
+      <w:r>
+        <w:t xml:space="preserve">The history still pulled on 1 April (49 points,</w:t>
+      </w:r>
+      <w:r>
+        <w:t xml:space="preserve"> </w:t>
+      </w:r>
+      <w:r>
+        <w:rPr>
+          <w:iCs/>
+          <w:i/>
+        </w:rPr>
+        <w:t xml:space="preserve">p</w:t>
+      </w:r>
+      <w:r>
+        <w:t xml:space="preserve"> </w:t>
+      </w:r>
+      <w:r>
+        <w:t xml:space="preserve">= 0.001), although the real agents, reasoning in their own words,</w:t>
+      </w:r>
+      <w:r>
+        <w:t xml:space="preserve"> </w:t>
+      </w:r>
+      <w:r>
+        <w:t xml:space="preserve">almost never went along there (2%); by June and August neither part moved the decision. Inside, the framed history’s</w:t>
+      </w:r>
+      <w:r>
+        <w:t xml:space="preserve"> </w:t>
+      </w:r>
+      <w:r>
+        <w:t xml:space="preserve">push along the frame direction at layer 12 was largest at the first request (as far as the loss request itself moves</w:t>
+      </w:r>
+      <w:r>
+        <w:t xml:space="preserve"> </w:t>
+      </w:r>
+      <w:r>
+        <w:t xml:space="preserve">the state) and fell to between 0.09 and 0.38 of that by June and August. The push is delivered early and carried for a</w:t>
+      </w:r>
+      <w:r>
+        <w:t xml:space="preserve"> </w:t>
+      </w:r>
+      <w:r>
+        <w:t xml:space="preserve">while by the history, which by 12 January includes the agent’s own first trades, rather than built up.</w:t>
+      </w:r>
+    </w:p>
+    <w:p>
+      <w:pPr>
+        <w:pStyle w:val="BodyText"/>
+      </w:pPr>
+      <w:r>
+        <w:rPr>
+          <w:bCs/>
+          <w:b/>
+        </w:rPr>
         <w:t xml:space="preserve">“</w:t>
       </w:r>
       <w:r>
@@ -13740,19 +13848,25 @@
         <w:t xml:space="preserve"> </w:t>
       </w:r>
       <w:r>
-        <w:t xml:space="preserve">are simply harder to join remain an explanation, and a design that varies their order would separate them. A split of</w:t>
-      </w:r>
-      <w:r>
-        <w:t xml:space="preserve"> </w:t>
-      </w:r>
-      <w:r>
-        <w:t xml:space="preserve">the rereads by request, and a reread that swaps the agent’s own earlier replies, will show whether the history’s pull on</w:t>
-      </w:r>
-      <w:r>
-        <w:t xml:space="preserve"> </w:t>
-      </w:r>
-      <w:r>
-        <w:t xml:space="preserve">joining fades or is overridden.</w:t>
+        <w:t xml:space="preserve">are simply harder to join remain an explanation, and a design that varies their order would separate them. Split by</w:t>
+      </w:r>
+      <w:r>
+        <w:t xml:space="preserve"> </w:t>
+      </w:r>
+      <w:r>
+        <w:t xml:space="preserve">request, the rereads show the push delivered by the first request’s words, carried by the history to the second and, in</w:t>
+      </w:r>
+      <w:r>
+        <w:t xml:space="preserve"> </w:t>
+      </w:r>
+      <w:r>
+        <w:t xml:space="preserve">the model’s probabilities, to April, then gone; a reread that swaps the agent’s own earlier replies will show how much</w:t>
+      </w:r>
+      <w:r>
+        <w:t xml:space="preserve"> </w:t>
+      </w:r>
+      <w:r>
+        <w:t xml:space="preserve">of that carry is the agent’s own January record.</w:t>
       </w:r>
     </w:p>
     <w:p>

</xml_diff>